<commit_message>
Improve exam templates and attendance verification
</commit_message>
<xml_diff>
--- a/ExamAR.docx
+++ b/ExamAR.docx
@@ -4,11 +4,708 @@
   <w:body>
     <w:p>
       <w:pPr>
-        <w:bidi/>
+        <w:jc w:val="center"/>
         <w:rPr>
-          <w:rFonts w:ascii="Traditional Arabic" w:hAnsi="Traditional Arabic" w:cs="Traditional Arabic"/>
-          <w:sz w:val="36"/>
-          <w:szCs w:val="36"/>
+          <w:rFonts w:asciiTheme="majorBidi" w:hAnsiTheme="majorBidi" w:cstheme="majorBidi"/>
+          <w:sz w:val="24"/>
+          <w:szCs w:val="24"/>
+        </w:rPr>
+      </w:pPr>
+      <w:r>
+        <w:rPr>
+          <w:rFonts w:asciiTheme="majorBidi" w:hAnsiTheme="majorBidi" w:cstheme="majorBidi"/>
+          <w:noProof/>
+          <w:sz w:val="24"/>
+          <w:szCs w:val="24"/>
+        </w:rPr>
+        <mc:AlternateContent>
+          <mc:Choice Requires="wps">
+            <w:drawing>
+              <wp:anchor distT="0" distB="0" distL="114300" distR="114300" simplePos="0" relativeHeight="251661312" behindDoc="0" locked="0" layoutInCell="1" allowOverlap="1" wp14:anchorId="47445049" wp14:editId="64C31F58">
+                <wp:simplePos x="0" y="0"/>
+                <wp:positionH relativeFrom="column">
+                  <wp:posOffset>5426710</wp:posOffset>
+                </wp:positionH>
+                <wp:positionV relativeFrom="paragraph">
+                  <wp:posOffset>-260350</wp:posOffset>
+                </wp:positionV>
+                <wp:extent cx="790575" cy="314325"/>
+                <wp:effectExtent l="0" t="0" r="0" b="0"/>
+                <wp:wrapNone/>
+                <wp:docPr id="1119255231" name="Rectangle: Rounded Corners 1"/>
+                <wp:cNvGraphicFramePr/>
+                <a:graphic xmlns:a="http://schemas.openxmlformats.org/drawingml/2006/main">
+                  <a:graphicData uri="http://schemas.microsoft.com/office/word/2010/wordprocessingShape">
+                    <wps:wsp>
+                      <wps:cNvSpPr/>
+                      <wps:spPr>
+                        <a:xfrm>
+                          <a:off x="0" y="0"/>
+                          <a:ext cx="790575" cy="314325"/>
+                        </a:xfrm>
+                        <a:prstGeom prst="roundRect">
+                          <a:avLst/>
+                        </a:prstGeom>
+                        <a:noFill/>
+                        <a:ln>
+                          <a:noFill/>
+                        </a:ln>
+                      </wps:spPr>
+                      <wps:style>
+                        <a:lnRef idx="2">
+                          <a:schemeClr val="dk1"/>
+                        </a:lnRef>
+                        <a:fillRef idx="1">
+                          <a:schemeClr val="lt1"/>
+                        </a:fillRef>
+                        <a:effectRef idx="0">
+                          <a:schemeClr val="dk1"/>
+                        </a:effectRef>
+                        <a:fontRef idx="minor">
+                          <a:schemeClr val="dk1"/>
+                        </a:fontRef>
+                      </wps:style>
+                      <wps:txbx>
+                        <w:txbxContent>
+                          <w:p>
+                            <w:pPr>
+                              <w:jc w:val="center"/>
+                              <w:rPr>
+                                <w:rFonts w:asciiTheme="majorBidi" w:hAnsiTheme="majorBidi" w:cstheme="majorBidi"/>
+                                <w:sz w:val="20"/>
+                                <w:szCs w:val="20"/>
+                              </w:rPr>
+                            </w:pPr>
+                            <w:r>
+                              <w:rPr>
+                                <w:rFonts w:asciiTheme="majorBidi" w:hAnsiTheme="majorBidi" w:cstheme="majorBidi"/>
+                                <w:sz w:val="20"/>
+                                <w:szCs w:val="20"/>
+                              </w:rPr>
+                              <w:t>NILAI</w:t>
+                            </w:r>
+                          </w:p>
+                        </w:txbxContent>
+                      </wps:txbx>
+                      <wps:bodyPr rot="0" spcFirstLastPara="0" vertOverflow="overflow" horzOverflow="overflow" vert="horz" wrap="square" lIns="91440" tIns="45720" rIns="91440" bIns="45720" numCol="1" spcCol="0" rtlCol="0" fromWordArt="0" anchor="ctr" anchorCtr="0" forceAA="0" compatLnSpc="1">
+                        <a:prstTxWarp prst="textNoShape">
+                          <a:avLst/>
+                        </a:prstTxWarp>
+                        <a:noAutofit/>
+                      </wps:bodyPr>
+                    </wps:wsp>
+                  </a:graphicData>
+                </a:graphic>
+                <wp14:sizeRelV relativeFrom="margin">
+                  <wp14:pctHeight>0</wp14:pctHeight>
+                </wp14:sizeRelV>
+              </wp:anchor>
+            </w:drawing>
+          </mc:Choice>
+          <mc:Fallback>
+            <w:pict>
+              <v:roundrect w14:anchorId="47445049" id="Rectangle: Rounded Corners 1" o:spid="_x0000_s1026" style="position:absolute;left:0;text-align:left;margin-left:427.3pt;margin-top:-20.5pt;width:62.25pt;height:24.75pt;z-index:251661312;visibility:visible;mso-wrap-style:square;mso-height-percent:0;mso-wrap-distance-left:9pt;mso-wrap-distance-top:0;mso-wrap-distance-right:9pt;mso-wrap-distance-bottom:0;mso-position-horizontal:absolute;mso-position-horizontal-relative:text;mso-position-vertical:absolute;mso-position-vertical-relative:text;mso-height-percent:0;mso-height-relative:margin;v-text-anchor:middle" arcsize="10923f" o:gfxdata="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" filled="f" stroked="f" strokeweight="1pt">
+                <v:stroke joinstyle="miter"/>
+                <v:textbox>
+                  <w:txbxContent>
+                    <w:p>
+                      <w:pPr>
+                        <w:jc w:val="center"/>
+                        <w:rPr>
+                          <w:rFonts w:asciiTheme="majorBidi" w:hAnsiTheme="majorBidi" w:cstheme="majorBidi"/>
+                          <w:sz w:val="20"/>
+                          <w:szCs w:val="20"/>
+                        </w:rPr>
+                      </w:pPr>
+                      <w:r>
+                        <w:rPr>
+                          <w:rFonts w:asciiTheme="majorBidi" w:hAnsiTheme="majorBidi" w:cstheme="majorBidi"/>
+                          <w:sz w:val="20"/>
+                          <w:szCs w:val="20"/>
+                        </w:rPr>
+                        <w:t>NILAI</w:t>
+                      </w:r>
+                    </w:p>
+                  </w:txbxContent>
+                </v:textbox>
+              </v:roundrect>
+            </w:pict>
+          </mc:Fallback>
+        </mc:AlternateContent>
+      </w:r>
+      <w:r>
+        <w:rPr>
+          <w:rFonts w:asciiTheme="majorBidi" w:hAnsiTheme="majorBidi" w:cstheme="majorBidi"/>
+          <w:noProof/>
+          <w:sz w:val="24"/>
+          <w:szCs w:val="24"/>
+        </w:rPr>
+        <mc:AlternateContent>
+          <mc:Choice Requires="wps">
+            <w:drawing>
+              <wp:anchor distT="0" distB="0" distL="114300" distR="114300" simplePos="0" relativeHeight="251659264" behindDoc="0" locked="0" layoutInCell="1" allowOverlap="1" wp14:anchorId="170FB796" wp14:editId="03E846D3">
+                <wp:simplePos x="0" y="0"/>
+                <wp:positionH relativeFrom="column">
+                  <wp:posOffset>5423535</wp:posOffset>
+                </wp:positionH>
+                <wp:positionV relativeFrom="paragraph">
+                  <wp:posOffset>-6350</wp:posOffset>
+                </wp:positionV>
+                <wp:extent cx="790575" cy="695325"/>
+                <wp:effectExtent l="0" t="0" r="28575" b="28575"/>
+                <wp:wrapNone/>
+                <wp:docPr id="2038641138" name="Rectangle: Rounded Corners 1"/>
+                <wp:cNvGraphicFramePr/>
+                <a:graphic xmlns:a="http://schemas.openxmlformats.org/drawingml/2006/main">
+                  <a:graphicData uri="http://schemas.microsoft.com/office/word/2010/wordprocessingShape">
+                    <wps:wsp>
+                      <wps:cNvSpPr/>
+                      <wps:spPr>
+                        <a:xfrm>
+                          <a:off x="0" y="0"/>
+                          <a:ext cx="790575" cy="695325"/>
+                        </a:xfrm>
+                        <a:prstGeom prst="roundRect">
+                          <a:avLst/>
+                        </a:prstGeom>
+                        <a:noFill/>
+                        <a:ln>
+                          <a:solidFill>
+                            <a:schemeClr val="tx1"/>
+                          </a:solidFill>
+                        </a:ln>
+                      </wps:spPr>
+                      <wps:style>
+                        <a:lnRef idx="2">
+                          <a:schemeClr val="accent1">
+                            <a:shade val="15000"/>
+                          </a:schemeClr>
+                        </a:lnRef>
+                        <a:fillRef idx="1">
+                          <a:schemeClr val="accent1"/>
+                        </a:fillRef>
+                        <a:effectRef idx="0">
+                          <a:schemeClr val="accent1"/>
+                        </a:effectRef>
+                        <a:fontRef idx="minor">
+                          <a:schemeClr val="lt1"/>
+                        </a:fontRef>
+                      </wps:style>
+                      <wps:bodyPr rot="0" spcFirstLastPara="0" vertOverflow="overflow" horzOverflow="overflow" vert="horz" wrap="square" lIns="91440" tIns="45720" rIns="91440" bIns="45720" numCol="1" spcCol="0" rtlCol="0" fromWordArt="0" anchor="ctr" anchorCtr="0" forceAA="0" compatLnSpc="1">
+                        <a:prstTxWarp prst="textNoShape">
+                          <a:avLst/>
+                        </a:prstTxWarp>
+                        <a:noAutofit/>
+                      </wps:bodyPr>
+                    </wps:wsp>
+                  </a:graphicData>
+                </a:graphic>
+              </wp:anchor>
+            </w:drawing>
+          </mc:Choice>
+          <mc:Fallback>
+            <w:pict>
+              <v:roundrect w14:anchorId="1ACF7F75" id="Rectangle: Rounded Corners 1" o:spid="_x0000_s1026" style="position:absolute;margin-left:427.05pt;margin-top:-.5pt;width:62.25pt;height:54.75pt;z-index:251659264;visibility:visible;mso-wrap-style:square;mso-wrap-distance-left:9pt;mso-wrap-distance-top:0;mso-wrap-distance-right:9pt;mso-wrap-distance-bottom:0;mso-position-horizontal:absolute;mso-position-horizontal-relative:text;mso-position-vertical:absolute;mso-position-vertical-relative:text;v-text-anchor:middle" arcsize="10923f" o:gfxdata="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" filled="f" strokecolor="black [3213]" strokeweight="1pt">
+                <v:stroke joinstyle="miter"/>
+              </v:roundrect>
+            </w:pict>
+          </mc:Fallback>
+        </mc:AlternateContent>
+      </w:r>
+      <w:r>
+        <w:rPr>
+          <w:rFonts w:asciiTheme="majorBidi" w:hAnsiTheme="majorBidi" w:cstheme="majorBidi"/>
+          <w:sz w:val="24"/>
+          <w:szCs w:val="24"/>
+        </w:rPr>
+        <w:t>SOAL UJIAN TENGAH SEMESTER GENAP</w:t>
+      </w:r>
+    </w:p>
+    <w:p>
+      <w:pPr>
+        <w:jc w:val="center"/>
+        <w:rPr>
+          <w:rFonts w:asciiTheme="majorBidi" w:hAnsiTheme="majorBidi" w:cstheme="majorBidi"/>
+          <w:sz w:val="24"/>
+          <w:szCs w:val="24"/>
+        </w:rPr>
+      </w:pPr>
+      <w:r>
+        <w:rPr>
+          <w:rFonts w:asciiTheme="majorBidi" w:hAnsiTheme="majorBidi" w:cstheme="majorBidi"/>
+          <w:sz w:val="24"/>
+          <w:szCs w:val="24"/>
+        </w:rPr>
+        <w:t>PESANTREN QUR’AN PUTRA MARKAZ IMAM MALIK</w:t>
+      </w:r>
+    </w:p>
+    <w:p>
+      <w:pPr>
+        <w:jc w:val="center"/>
+        <w:rPr>
+          <w:rFonts w:asciiTheme="majorBidi" w:hAnsiTheme="majorBidi" w:cstheme="majorBidi"/>
+          <w:sz w:val="24"/>
+          <w:szCs w:val="24"/>
+        </w:rPr>
+      </w:pPr>
+      <w:r>
+        <w:rPr>
+          <w:rFonts w:asciiTheme="majorBidi" w:hAnsiTheme="majorBidi" w:cstheme="majorBidi"/>
+          <w:sz w:val="24"/>
+          <w:szCs w:val="24"/>
+        </w:rPr>
+        <w:t>TAHUN AJARAN 2025/2026</w:t>
+      </w:r>
+    </w:p>
+    <w:tbl>
+      <w:tblPr>
+        <w:tblStyle w:val="TableGrid"/>
+        <w:tblW w:w="9781" w:type="dxa"/>
+        <w:tblLook w:val="04A0" w:firstRow="1" w:lastRow="0" w:firstColumn="1" w:lastColumn="0" w:noHBand="0" w:noVBand="1"/>
+      </w:tblPr>
+      <w:tblGrid>
+        <w:gridCol w:w="142"/>
+        <w:gridCol w:w="942"/>
+        <w:gridCol w:w="281"/>
+        <w:gridCol w:w="53"/>
+        <w:gridCol w:w="278"/>
+        <w:gridCol w:w="3591"/>
+        <w:gridCol w:w="242"/>
+        <w:gridCol w:w="1389"/>
+        <w:gridCol w:w="283"/>
+        <w:gridCol w:w="2013"/>
+        <w:gridCol w:w="567"/>
+      </w:tblGrid>
+      <w:tr>
+        <w:trPr>
+          <w:trHeight w:val="449"/>
+        </w:trPr>
+        <w:tc>
+          <w:tcPr>
+            <w:tcW w:w="1418" w:type="dxa"/>
+            <w:gridSpan w:val="4"/>
+            <w:tcBorders>
+              <w:left w:val="nil"/>
+              <w:bottom w:val="nil"/>
+              <w:right w:val="nil"/>
+            </w:tcBorders>
+            <w:vAlign w:val="center"/>
+          </w:tcPr>
+          <w:p>
+            <w:pPr>
+              <w:rPr>
+                <w:rFonts w:asciiTheme="majorBidi" w:hAnsiTheme="majorBidi" w:cstheme="majorBidi"/>
+              </w:rPr>
+            </w:pPr>
+            <w:r>
+              <w:rPr>
+                <w:rFonts w:asciiTheme="majorBidi" w:hAnsiTheme="majorBidi" w:cstheme="majorBidi"/>
+              </w:rPr>
+              <w:t>Pelajaran</w:t>
+            </w:r>
+          </w:p>
+        </w:tc>
+        <w:tc>
+          <w:tcPr>
+            <w:tcW w:w="278" w:type="dxa"/>
+            <w:tcBorders>
+              <w:left w:val="nil"/>
+              <w:bottom w:val="nil"/>
+              <w:right w:val="nil"/>
+            </w:tcBorders>
+            <w:vAlign w:val="center"/>
+          </w:tcPr>
+          <w:p>
+            <w:pPr>
+              <w:rPr>
+                <w:rFonts w:asciiTheme="majorBidi" w:hAnsiTheme="majorBidi" w:cstheme="majorBidi"/>
+              </w:rPr>
+            </w:pPr>
+            <w:r>
+              <w:rPr>
+                <w:rFonts w:asciiTheme="majorBidi" w:hAnsiTheme="majorBidi" w:cstheme="majorBidi"/>
+              </w:rPr>
+              <w:t>:</w:t>
+            </w:r>
+          </w:p>
+        </w:tc>
+        <w:tc>
+          <w:tcPr>
+            <w:tcW w:w="3833" w:type="dxa"/>
+            <w:gridSpan w:val="2"/>
+            <w:tcBorders>
+              <w:left w:val="nil"/>
+              <w:bottom w:val="nil"/>
+              <w:right w:val="nil"/>
+            </w:tcBorders>
+            <w:vAlign w:val="center"/>
+          </w:tcPr>
+          <w:p>
+            <w:pPr>
+              <w:rPr>
+                <w:rFonts w:asciiTheme="majorBidi" w:hAnsiTheme="majorBidi" w:cstheme="majorBidi"/>
+              </w:rPr>
+            </w:pPr>
+            <w:proofErr w:type="spellStart"/>
+            <w:r>
+              <w:rPr>
+                <w:rFonts w:asciiTheme="majorBidi" w:hAnsiTheme="majorBidi" w:cstheme="majorBidi"/>
+              </w:rPr>
+              <w:t>Matematika</w:t>
+            </w:r>
+            <w:proofErr w:type="spellEnd"/>
+          </w:p>
+        </w:tc>
+        <w:tc>
+          <w:tcPr>
+            <w:tcW w:w="1389" w:type="dxa"/>
+            <w:tcBorders>
+              <w:left w:val="nil"/>
+              <w:bottom w:val="nil"/>
+              <w:right w:val="nil"/>
+            </w:tcBorders>
+            <w:vAlign w:val="center"/>
+          </w:tcPr>
+          <w:p>
+            <w:pPr>
+              <w:rPr>
+                <w:rFonts w:asciiTheme="majorBidi" w:hAnsiTheme="majorBidi" w:cstheme="majorBidi"/>
+              </w:rPr>
+            </w:pPr>
+            <w:r>
+              <w:rPr>
+                <w:rFonts w:asciiTheme="majorBidi" w:hAnsiTheme="majorBidi" w:cstheme="majorBidi"/>
+              </w:rPr>
+              <w:t>Hari/</w:t>
+            </w:r>
+            <w:proofErr w:type="spellStart"/>
+            <w:r>
+              <w:rPr>
+                <w:rFonts w:asciiTheme="majorBidi" w:hAnsiTheme="majorBidi" w:cstheme="majorBidi"/>
+              </w:rPr>
+              <w:t>Tanggal</w:t>
+            </w:r>
+            <w:proofErr w:type="spellEnd"/>
+          </w:p>
+        </w:tc>
+        <w:tc>
+          <w:tcPr>
+            <w:tcW w:w="283" w:type="dxa"/>
+            <w:tcBorders>
+              <w:left w:val="nil"/>
+              <w:bottom w:val="nil"/>
+              <w:right w:val="nil"/>
+            </w:tcBorders>
+            <w:vAlign w:val="center"/>
+          </w:tcPr>
+          <w:p>
+            <w:pPr>
+              <w:rPr>
+                <w:rFonts w:asciiTheme="majorBidi" w:hAnsiTheme="majorBidi" w:cstheme="majorBidi"/>
+              </w:rPr>
+            </w:pPr>
+            <w:r>
+              <w:rPr>
+                <w:rFonts w:asciiTheme="majorBidi" w:hAnsiTheme="majorBidi" w:cstheme="majorBidi"/>
+              </w:rPr>
+              <w:t>:</w:t>
+            </w:r>
+          </w:p>
+        </w:tc>
+        <w:tc>
+          <w:tcPr>
+            <w:tcW w:w="2580" w:type="dxa"/>
+            <w:gridSpan w:val="2"/>
+            <w:tcBorders>
+              <w:left w:val="nil"/>
+              <w:bottom w:val="nil"/>
+              <w:right w:val="nil"/>
+            </w:tcBorders>
+            <w:vAlign w:val="center"/>
+          </w:tcPr>
+          <w:p>
+            <w:pPr>
+              <w:rPr>
+                <w:rFonts w:asciiTheme="majorBidi" w:hAnsiTheme="majorBidi" w:cstheme="majorBidi"/>
+              </w:rPr>
+            </w:pPr>
+            <w:r>
+              <w:rPr>
+                <w:rFonts w:asciiTheme="majorBidi" w:hAnsiTheme="majorBidi" w:cstheme="majorBidi"/>
+              </w:rPr>
+              <w:t>Senin, 28 Januari 2025</w:t>
+            </w:r>
+          </w:p>
+        </w:tc>
+      </w:tr>
+      <w:tr>
+        <w:trPr>
+          <w:trHeight w:val="427"/>
+        </w:trPr>
+        <w:tc>
+          <w:tcPr>
+            <w:tcW w:w="1418" w:type="dxa"/>
+            <w:gridSpan w:val="4"/>
+            <w:tcBorders>
+              <w:top w:val="nil"/>
+              <w:left w:val="nil"/>
+              <w:bottom w:val="single" w:sz="24" w:space="0" w:color="auto"/>
+              <w:right w:val="nil"/>
+            </w:tcBorders>
+            <w:vAlign w:val="center"/>
+          </w:tcPr>
+          <w:p>
+            <w:pPr>
+              <w:rPr>
+                <w:rFonts w:asciiTheme="majorBidi" w:hAnsiTheme="majorBidi" w:cstheme="majorBidi"/>
+              </w:rPr>
+            </w:pPr>
+            <w:proofErr w:type="spellStart"/>
+            <w:r>
+              <w:rPr>
+                <w:rFonts w:asciiTheme="majorBidi" w:hAnsiTheme="majorBidi" w:cstheme="majorBidi"/>
+              </w:rPr>
+              <w:t>Kelas</w:t>
+            </w:r>
+            <w:proofErr w:type="spellEnd"/>
+          </w:p>
+        </w:tc>
+        <w:tc>
+          <w:tcPr>
+            <w:tcW w:w="278" w:type="dxa"/>
+            <w:tcBorders>
+              <w:top w:val="nil"/>
+              <w:left w:val="nil"/>
+              <w:bottom w:val="single" w:sz="24" w:space="0" w:color="auto"/>
+              <w:right w:val="nil"/>
+            </w:tcBorders>
+            <w:vAlign w:val="center"/>
+          </w:tcPr>
+          <w:p>
+            <w:pPr>
+              <w:rPr>
+                <w:rFonts w:asciiTheme="majorBidi" w:hAnsiTheme="majorBidi" w:cstheme="majorBidi"/>
+              </w:rPr>
+            </w:pPr>
+            <w:r>
+              <w:rPr>
+                <w:rFonts w:asciiTheme="majorBidi" w:hAnsiTheme="majorBidi" w:cstheme="majorBidi"/>
+              </w:rPr>
+              <w:t>:</w:t>
+            </w:r>
+          </w:p>
+        </w:tc>
+        <w:tc>
+          <w:tcPr>
+            <w:tcW w:w="3833" w:type="dxa"/>
+            <w:gridSpan w:val="2"/>
+            <w:tcBorders>
+              <w:top w:val="nil"/>
+              <w:left w:val="nil"/>
+              <w:bottom w:val="single" w:sz="24" w:space="0" w:color="auto"/>
+              <w:right w:val="nil"/>
+            </w:tcBorders>
+            <w:vAlign w:val="center"/>
+          </w:tcPr>
+          <w:p>
+            <w:pPr>
+              <w:rPr>
+                <w:rFonts w:asciiTheme="majorBidi" w:hAnsiTheme="majorBidi" w:cstheme="majorBidi"/>
+              </w:rPr>
+            </w:pPr>
+            <w:r>
+              <w:rPr>
+                <w:rFonts w:asciiTheme="majorBidi" w:hAnsiTheme="majorBidi" w:cstheme="majorBidi"/>
+              </w:rPr>
+              <w:t>X</w:t>
+            </w:r>
+          </w:p>
+        </w:tc>
+        <w:tc>
+          <w:tcPr>
+            <w:tcW w:w="1389" w:type="dxa"/>
+            <w:tcBorders>
+              <w:top w:val="nil"/>
+              <w:left w:val="nil"/>
+              <w:bottom w:val="single" w:sz="24" w:space="0" w:color="auto"/>
+              <w:right w:val="nil"/>
+            </w:tcBorders>
+            <w:vAlign w:val="center"/>
+          </w:tcPr>
+          <w:p>
+            <w:pPr>
+              <w:rPr>
+                <w:rFonts w:asciiTheme="majorBidi" w:hAnsiTheme="majorBidi" w:cstheme="majorBidi"/>
+              </w:rPr>
+            </w:pPr>
+            <w:r>
+              <w:rPr>
+                <w:rFonts w:asciiTheme="majorBidi" w:hAnsiTheme="majorBidi" w:cstheme="majorBidi"/>
+              </w:rPr>
+              <w:t>Waktu</w:t>
+            </w:r>
+          </w:p>
+        </w:tc>
+        <w:tc>
+          <w:tcPr>
+            <w:tcW w:w="283" w:type="dxa"/>
+            <w:tcBorders>
+              <w:top w:val="nil"/>
+              <w:left w:val="nil"/>
+              <w:bottom w:val="single" w:sz="24" w:space="0" w:color="auto"/>
+              <w:right w:val="nil"/>
+            </w:tcBorders>
+            <w:vAlign w:val="center"/>
+          </w:tcPr>
+          <w:p>
+            <w:pPr>
+              <w:rPr>
+                <w:rFonts w:asciiTheme="majorBidi" w:hAnsiTheme="majorBidi" w:cstheme="majorBidi"/>
+              </w:rPr>
+            </w:pPr>
+            <w:r>
+              <w:rPr>
+                <w:rFonts w:asciiTheme="majorBidi" w:hAnsiTheme="majorBidi" w:cstheme="majorBidi"/>
+              </w:rPr>
+              <w:t>:</w:t>
+            </w:r>
+          </w:p>
+        </w:tc>
+        <w:tc>
+          <w:tcPr>
+            <w:tcW w:w="2580" w:type="dxa"/>
+            <w:gridSpan w:val="2"/>
+            <w:tcBorders>
+              <w:top w:val="nil"/>
+              <w:left w:val="nil"/>
+              <w:bottom w:val="single" w:sz="24" w:space="0" w:color="auto"/>
+              <w:right w:val="nil"/>
+            </w:tcBorders>
+            <w:vAlign w:val="center"/>
+          </w:tcPr>
+          <w:p>
+            <w:pPr>
+              <w:rPr>
+                <w:rFonts w:asciiTheme="majorBidi" w:hAnsiTheme="majorBidi" w:cstheme="majorBidi"/>
+              </w:rPr>
+            </w:pPr>
+            <w:r>
+              <w:rPr>
+                <w:rFonts w:asciiTheme="majorBidi" w:hAnsiTheme="majorBidi" w:cstheme="majorBidi"/>
+              </w:rPr>
+              <w:t xml:space="preserve">60 </w:t>
+            </w:r>
+            <w:proofErr w:type="spellStart"/>
+            <w:r>
+              <w:rPr>
+                <w:rFonts w:asciiTheme="majorBidi" w:hAnsiTheme="majorBidi" w:cstheme="majorBidi"/>
+              </w:rPr>
+              <w:t>menit</w:t>
+            </w:r>
+            <w:proofErr w:type="spellEnd"/>
+          </w:p>
+        </w:tc>
+      </w:tr>
+      <w:tr>
+        <w:trPr>
+          <w:gridBefore w:val="1"/>
+          <w:gridAfter w:val="1"/>
+          <w:wBefore w:w="142" w:type="dxa"/>
+          <w:wAfter w:w="567" w:type="dxa"/>
+        </w:trPr>
+        <w:tc>
+          <w:tcPr>
+            <w:tcW w:w="942" w:type="dxa"/>
+            <w:tcBorders>
+              <w:top w:val="nil"/>
+              <w:left w:val="nil"/>
+              <w:bottom w:val="nil"/>
+              <w:right w:val="nil"/>
+            </w:tcBorders>
+          </w:tcPr>
+          <w:p>
+            <w:pPr>
+              <w:rPr>
+                <w:rFonts w:asciiTheme="majorBidi" w:hAnsiTheme="majorBidi" w:cstheme="majorBidi"/>
+              </w:rPr>
+            </w:pPr>
+            <w:r>
+              <w:rPr>
+                <w:rFonts w:asciiTheme="majorBidi" w:hAnsiTheme="majorBidi" w:cstheme="majorBidi"/>
+              </w:rPr>
+              <w:t>NAMA</w:t>
+            </w:r>
+          </w:p>
+        </w:tc>
+        <w:tc>
+          <w:tcPr>
+            <w:tcW w:w="281" w:type="dxa"/>
+            <w:tcBorders>
+              <w:top w:val="nil"/>
+              <w:left w:val="nil"/>
+              <w:bottom w:val="nil"/>
+              <w:right w:val="nil"/>
+            </w:tcBorders>
+          </w:tcPr>
+          <w:p>
+            <w:pPr>
+              <w:rPr>
+                <w:rFonts w:asciiTheme="majorBidi" w:hAnsiTheme="majorBidi" w:cstheme="majorBidi"/>
+              </w:rPr>
+            </w:pPr>
+            <w:r>
+              <w:rPr>
+                <w:rFonts w:asciiTheme="majorBidi" w:hAnsiTheme="majorBidi" w:cstheme="majorBidi"/>
+              </w:rPr>
+              <w:t>:</w:t>
+            </w:r>
+          </w:p>
+        </w:tc>
+        <w:tc>
+          <w:tcPr>
+            <w:tcW w:w="3922" w:type="dxa"/>
+            <w:gridSpan w:val="3"/>
+            <w:tcBorders>
+              <w:top w:val="nil"/>
+              <w:left w:val="nil"/>
+              <w:bottom w:val="nil"/>
+              <w:right w:val="nil"/>
+            </w:tcBorders>
+          </w:tcPr>
+          <w:p>
+            <w:pPr>
+              <w:rPr>
+                <w:rFonts w:asciiTheme="majorBidi" w:hAnsiTheme="majorBidi" w:cstheme="majorBidi"/>
+              </w:rPr>
+            </w:pPr>
+          </w:p>
+        </w:tc>
+        <w:tc>
+          <w:tcPr>
+            <w:tcW w:w="3927" w:type="dxa"/>
+            <w:gridSpan w:val="4"/>
+            <w:tcBorders>
+              <w:top w:val="nil"/>
+              <w:left w:val="nil"/>
+              <w:bottom w:val="nil"/>
+              <w:right w:val="nil"/>
+            </w:tcBorders>
+          </w:tcPr>
+          <w:p>
+            <w:pPr>
+              <w:rPr>
+                <w:rFonts w:asciiTheme="majorBidi" w:hAnsiTheme="majorBidi" w:cstheme="majorBidi"/>
+              </w:rPr>
+            </w:pPr>
+          </w:p>
+        </w:tc>
+      </w:tr>
+    </w:tbl>
+    <w:p>
+      <w:pPr>
+        <w:rPr>
+          <w:rFonts w:asciiTheme="majorBidi" w:hAnsiTheme="majorBidi" w:cstheme="majorBidi"/>
+          <w:rtl/>
         </w:rPr>
       </w:pPr>
     </w:p>
@@ -16,7 +713,62 @@
       <w:tblPr>
         <w:tblStyle w:val="TableGrid"/>
         <w:bidiVisual/>
-        <w:tblW w:w="9266" w:type="dxa"/>
+        <w:tblW w:w="0" w:type="auto"/>
+        <w:tblBorders>
+          <w:top w:val="none" w:sz="0" w:space="0" w:color="auto"/>
+          <w:left w:val="none" w:sz="0" w:space="0" w:color="auto"/>
+          <w:bottom w:val="none" w:sz="0" w:space="0" w:color="auto"/>
+          <w:right w:val="none" w:sz="0" w:space="0" w:color="auto"/>
+          <w:insideH w:val="none" w:sz="0" w:space="0" w:color="auto"/>
+          <w:insideV w:val="none" w:sz="0" w:space="0" w:color="auto"/>
+        </w:tblBorders>
+        <w:tblLook w:val="04A0" w:firstRow="1" w:lastRow="0" w:firstColumn="1" w:lastColumn="0" w:noHBand="0" w:noVBand="1"/>
+      </w:tblPr>
+      <w:tblGrid>
+        <w:gridCol w:w="9771"/>
+      </w:tblGrid>
+      <w:tr>
+        <w:tc>
+          <w:tcPr>
+            <w:tcW w:w="9771" w:type="dxa"/>
+            <w:vAlign w:val="center"/>
+          </w:tcPr>
+          <w:p>
+            <w:pPr>
+              <w:bidi/>
+              <w:rPr>
+                <w:rFonts w:asciiTheme="majorBidi" w:hAnsiTheme="majorBidi" w:cstheme="majorBidi"/>
+                <w:sz w:val="24"/>
+                <w:szCs w:val="24"/>
+                <w:rtl/>
+              </w:rPr>
+            </w:pPr>
+            <w:r>
+              <w:rPr>
+                <w:rFonts w:ascii="Traditional Arabic" w:hAnsi="Traditional Arabic" w:cs="Traditional Arabic"/>
+                <w:sz w:val="32"/>
+                <w:szCs w:val="32"/>
+                <w:rtl/>
+              </w:rPr>
+              <w:t>معلومات عامة</w:t>
+            </w:r>
+          </w:p>
+        </w:tc>
+      </w:tr>
+    </w:tbl>
+    <w:p>
+      <w:pPr>
+        <w:bidi/>
+        <w:rPr>
+          <w:rFonts w:ascii="Traditional Arabic" w:hAnsi="Traditional Arabic" w:cs="Traditional Arabic"/>
+        </w:rPr>
+      </w:pPr>
+    </w:p>
+    <w:tbl>
+      <w:tblPr>
+        <w:tblStyle w:val="TableGrid"/>
+        <w:bidiVisual/>
+        <w:tblW w:w="9830" w:type="dxa"/>
         <w:tblCellMar>
           <w:left w:w="0" w:type="dxa"/>
           <w:right w:w="0" w:type="dxa"/>
@@ -39,18 +791,33 @@
         <w:gridCol w:w="1461"/>
         <w:gridCol w:w="259"/>
         <w:gridCol w:w="242"/>
-        <w:gridCol w:w="1379"/>
+        <w:gridCol w:w="1943"/>
       </w:tblGrid>
       <w:tr>
         <w:tc>
           <w:tcPr>
             <w:tcW w:w="236" w:type="dxa"/>
-            <w:vAlign w:val="center"/>
+            <w:tcBorders>
+              <w:top w:val="nil"/>
+              <w:left w:val="nil"/>
+              <w:bottom w:val="nil"/>
+              <w:right w:val="nil"/>
+            </w:tcBorders>
           </w:tcPr>
           <w:p>
             <w:pPr>
               <w:bidi/>
               <w:jc w:val="right"/>
+              <w:rPr>
+                <w:rFonts w:ascii="Traditional Arabic" w:hAnsi="Traditional Arabic" w:cs="Traditional Arabic"/>
+                <w:b/>
+                <w:bCs/>
+                <w:sz w:val="32"/>
+                <w:szCs w:val="32"/>
+                <w:rtl/>
+              </w:rPr>
+            </w:pPr>
+            <w:r>
               <w:rPr>
                 <w:rFonts w:ascii="Traditional Arabic" w:hAnsi="Traditional Arabic" w:cs="Traditional Arabic" w:hint="cs"/>
                 <w:b/>
@@ -59,6 +826,31 @@
                 <w:szCs w:val="32"/>
                 <w:rtl/>
               </w:rPr>
+              <w:t>أ</w:t>
+            </w:r>
+          </w:p>
+        </w:tc>
+        <w:tc>
+          <w:tcPr>
+            <w:tcW w:w="231" w:type="dxa"/>
+            <w:tcBorders>
+              <w:top w:val="nil"/>
+              <w:left w:val="nil"/>
+              <w:bottom w:val="nil"/>
+              <w:right w:val="nil"/>
+            </w:tcBorders>
+          </w:tcPr>
+          <w:p>
+            <w:pPr>
+              <w:bidi/>
+              <w:rPr>
+                <w:rFonts w:ascii="Traditional Arabic" w:hAnsi="Traditional Arabic" w:cs="Traditional Arabic"/>
+                <w:b/>
+                <w:bCs/>
+                <w:sz w:val="32"/>
+                <w:szCs w:val="32"/>
+                <w:rtl/>
+              </w:rPr>
             </w:pPr>
             <w:r>
               <w:rPr>
@@ -69,17 +861,35 @@
                 <w:szCs w:val="32"/>
                 <w:rtl/>
               </w:rPr>
-              <w:t>أ</w:t>
-            </w:r>
-          </w:p>
-        </w:tc>
-        <w:tc>
-          <w:tcPr>
-            <w:tcW w:w="231" w:type="dxa"/>
-          </w:tcPr>
-          <w:p>
-            <w:pPr>
-              <w:bidi/>
+              <w:t>.</w:t>
+            </w:r>
+          </w:p>
+        </w:tc>
+        <w:tc>
+          <w:tcPr>
+            <w:tcW w:w="9363" w:type="dxa"/>
+            <w:gridSpan w:val="14"/>
+            <w:tcBorders>
+              <w:top w:val="nil"/>
+              <w:left w:val="nil"/>
+              <w:bottom w:val="nil"/>
+              <w:right w:val="nil"/>
+            </w:tcBorders>
+          </w:tcPr>
+          <w:p>
+            <w:pPr>
+              <w:bidi/>
+              <w:ind w:left="8"/>
+              <w:rPr>
+                <w:rFonts w:ascii="Traditional Arabic" w:hAnsi="Traditional Arabic" w:cs="Traditional Arabic"/>
+                <w:b/>
+                <w:bCs/>
+                <w:sz w:val="32"/>
+                <w:szCs w:val="32"/>
+                <w:rtl/>
+              </w:rPr>
+            </w:pPr>
+            <w:r>
               <w:rPr>
                 <w:rFonts w:ascii="Traditional Arabic" w:hAnsi="Traditional Arabic" w:cs="Traditional Arabic" w:hint="cs"/>
                 <w:b/>
@@ -88,26 +898,47 @@
                 <w:szCs w:val="32"/>
                 <w:rtl/>
               </w:rPr>
-            </w:pPr>
-            <w:r>
-              <w:rPr>
-                <w:rFonts w:ascii="Traditional Arabic" w:hAnsi="Traditional Arabic" w:cs="Traditional Arabic" w:hint="cs"/>
+              <w:t>اختيار من متعدد</w:t>
+            </w:r>
+          </w:p>
+        </w:tc>
+      </w:tr>
+      <w:tr>
+        <w:tc>
+          <w:tcPr>
+            <w:tcW w:w="467" w:type="dxa"/>
+            <w:gridSpan w:val="2"/>
+            <w:tcBorders>
+              <w:top w:val="nil"/>
+              <w:left w:val="nil"/>
+              <w:bottom w:val="nil"/>
+              <w:right w:val="nil"/>
+            </w:tcBorders>
+            <w:vAlign w:val="center"/>
+          </w:tcPr>
+          <w:p>
+            <w:pPr>
+              <w:bidi/>
+              <w:rPr>
+                <w:rFonts w:ascii="Traditional Arabic" w:hAnsi="Traditional Arabic" w:cs="Traditional Arabic"/>
                 <w:b/>
                 <w:bCs/>
                 <w:sz w:val="32"/>
                 <w:szCs w:val="32"/>
                 <w:rtl/>
               </w:rPr>
-              <w:t>.</w:t>
-            </w:r>
-          </w:p>
-        </w:tc>
-        <w:tc>
-          <w:tcPr>
-            <w:tcW w:w="8799" w:type="dxa"/>
+            </w:pPr>
+          </w:p>
+        </w:tc>
+        <w:tc>
+          <w:tcPr>
+            <w:tcW w:w="9363" w:type="dxa"/>
             <w:gridSpan w:val="14"/>
             <w:tcBorders>
-              <w:bottom w:val="single" w:sz="4" w:space="0" w:color="000000"/>
+              <w:top w:val="nil"/>
+              <w:left w:val="nil"/>
+              <w:bottom w:val="nil"/>
+              <w:right w:val="nil"/>
             </w:tcBorders>
           </w:tcPr>
           <w:p>
@@ -115,24 +946,20 @@
               <w:bidi/>
               <w:ind w:left="8"/>
               <w:rPr>
+                <w:rFonts w:ascii="Traditional Arabic" w:hAnsi="Traditional Arabic" w:cs="Traditional Arabic"/>
+                <w:sz w:val="32"/>
+                <w:szCs w:val="32"/>
+                <w:rtl/>
+              </w:rPr>
+            </w:pPr>
+            <w:r>
+              <w:rPr>
                 <w:rFonts w:ascii="Traditional Arabic" w:hAnsi="Traditional Arabic" w:cs="Traditional Arabic" w:hint="cs"/>
-                <w:b/>
-                <w:bCs/>
-                <w:sz w:val="32"/>
-                <w:szCs w:val="32"/>
-                <w:rtl/>
-              </w:rPr>
-            </w:pPr>
-            <w:r>
-              <w:rPr>
-                <w:rFonts w:ascii="Traditional Arabic" w:hAnsi="Traditional Arabic" w:cs="Traditional Arabic" w:hint="cs"/>
-                <w:b/>
-                <w:bCs/>
-                <w:sz w:val="32"/>
-                <w:szCs w:val="32"/>
-                <w:rtl/>
-              </w:rPr>
-              <w:t>اختيار من متعدد</w:t>
+                <w:sz w:val="32"/>
+                <w:szCs w:val="32"/>
+                <w:rtl/>
+              </w:rPr>
+              <w:t>معلومات</w:t>
             </w:r>
           </w:p>
         </w:tc>
@@ -142,12 +969,18 @@
           <w:tcPr>
             <w:tcW w:w="467" w:type="dxa"/>
             <w:gridSpan w:val="2"/>
-          </w:tcPr>
-          <w:p>
-            <w:pPr>
-              <w:bidi/>
-              <w:rPr>
-                <w:rFonts w:ascii="Traditional Arabic" w:hAnsi="Traditional Arabic" w:cs="Traditional Arabic" w:hint="cs"/>
+            <w:tcBorders>
+              <w:top w:val="nil"/>
+              <w:left w:val="nil"/>
+              <w:bottom w:val="nil"/>
+              <w:right w:val="nil"/>
+            </w:tcBorders>
+          </w:tcPr>
+          <w:p>
+            <w:pPr>
+              <w:bidi/>
+              <w:rPr>
+                <w:rFonts w:ascii="Traditional Arabic" w:hAnsi="Traditional Arabic" w:cs="Traditional Arabic"/>
                 <w:sz w:val="32"/>
                 <w:szCs w:val="32"/>
                 <w:rtl/>
@@ -159,16 +992,18 @@
           <w:tcPr>
             <w:tcW w:w="360" w:type="dxa"/>
             <w:tcBorders>
-              <w:top w:val="single" w:sz="4" w:space="0" w:color="000000"/>
+              <w:top w:val="nil"/>
+              <w:left w:val="nil"/>
+              <w:bottom w:val="nil"/>
+              <w:right w:val="nil"/>
             </w:tcBorders>
-            <w:vAlign w:val="center"/>
           </w:tcPr>
           <w:p>
             <w:pPr>
               <w:bidi/>
               <w:jc w:val="right"/>
               <w:rPr>
-                <w:rFonts w:ascii="Traditional Arabic" w:hAnsi="Traditional Arabic" w:cs="Traditional Arabic" w:hint="cs"/>
+                <w:rFonts w:ascii="Traditional Arabic" w:hAnsi="Traditional Arabic" w:cs="Traditional Arabic"/>
                 <w:sz w:val="32"/>
                 <w:szCs w:val="32"/>
                 <w:rtl/>
@@ -189,43 +1024,49 @@
           <w:tcPr>
             <w:tcW w:w="231" w:type="dxa"/>
             <w:tcBorders>
-              <w:top w:val="single" w:sz="4" w:space="0" w:color="000000"/>
+              <w:top w:val="nil"/>
+              <w:left w:val="nil"/>
+              <w:bottom w:val="nil"/>
+              <w:right w:val="nil"/>
             </w:tcBorders>
           </w:tcPr>
           <w:p>
             <w:pPr>
               <w:bidi/>
               <w:rPr>
+                <w:rFonts w:ascii="Traditional Arabic" w:hAnsi="Traditional Arabic" w:cs="Traditional Arabic"/>
+                <w:sz w:val="32"/>
+                <w:szCs w:val="32"/>
+                <w:rtl/>
+              </w:rPr>
+            </w:pPr>
+            <w:r>
+              <w:rPr>
                 <w:rFonts w:ascii="Traditional Arabic" w:hAnsi="Traditional Arabic" w:cs="Traditional Arabic" w:hint="cs"/>
                 <w:sz w:val="32"/>
                 <w:szCs w:val="32"/>
                 <w:rtl/>
               </w:rPr>
-            </w:pPr>
-            <w:r>
-              <w:rPr>
-                <w:rFonts w:ascii="Traditional Arabic" w:hAnsi="Traditional Arabic" w:cs="Traditional Arabic" w:hint="cs"/>
-                <w:sz w:val="32"/>
-                <w:szCs w:val="32"/>
-                <w:rtl/>
-              </w:rPr>
               <w:t>.</w:t>
             </w:r>
           </w:p>
         </w:tc>
         <w:tc>
           <w:tcPr>
-            <w:tcW w:w="8208" w:type="dxa"/>
+            <w:tcW w:w="8772" w:type="dxa"/>
             <w:gridSpan w:val="12"/>
             <w:tcBorders>
-              <w:top w:val="single" w:sz="4" w:space="0" w:color="000000"/>
+              <w:top w:val="nil"/>
+              <w:left w:val="nil"/>
+              <w:bottom w:val="nil"/>
+              <w:right w:val="nil"/>
             </w:tcBorders>
           </w:tcPr>
           <w:p>
             <w:pPr>
               <w:bidi/>
               <w:rPr>
-                <w:rFonts w:ascii="Traditional Arabic" w:hAnsi="Traditional Arabic" w:cs="Traditional Arabic" w:hint="cs"/>
+                <w:rFonts w:ascii="Traditional Arabic" w:hAnsi="Traditional Arabic" w:cs="Traditional Arabic"/>
                 <w:sz w:val="32"/>
                 <w:szCs w:val="32"/>
                 <w:rtl/>
@@ -248,34 +1089,358 @@
           <w:tcPr>
             <w:tcW w:w="1058" w:type="dxa"/>
             <w:gridSpan w:val="4"/>
-          </w:tcPr>
-          <w:p>
-            <w:pPr>
-              <w:bidi/>
+            <w:tcBorders>
+              <w:top w:val="nil"/>
+              <w:left w:val="nil"/>
+              <w:bottom w:val="nil"/>
+              <w:right w:val="nil"/>
+            </w:tcBorders>
+          </w:tcPr>
+          <w:p>
+            <w:pPr>
+              <w:bidi/>
+              <w:rPr>
+                <w:rFonts w:ascii="Traditional Arabic" w:hAnsi="Traditional Arabic" w:cs="Traditional Arabic"/>
+                <w:sz w:val="32"/>
+                <w:szCs w:val="32"/>
+                <w:rtl/>
+              </w:rPr>
+            </w:pPr>
+          </w:p>
+        </w:tc>
+        <w:tc>
+          <w:tcPr>
+            <w:tcW w:w="253" w:type="dxa"/>
+            <w:tcBorders>
+              <w:top w:val="nil"/>
+              <w:left w:val="nil"/>
+              <w:bottom w:val="nil"/>
+              <w:right w:val="nil"/>
+            </w:tcBorders>
+          </w:tcPr>
+          <w:p>
+            <w:pPr>
+              <w:bidi/>
+              <w:jc w:val="right"/>
+              <w:rPr>
+                <w:rFonts w:ascii="Traditional Arabic" w:hAnsi="Traditional Arabic" w:cs="Traditional Arabic"/>
+                <w:sz w:val="32"/>
+                <w:szCs w:val="32"/>
+                <w:rtl/>
+              </w:rPr>
+            </w:pPr>
+            <w:r>
               <w:rPr>
                 <w:rFonts w:ascii="Traditional Arabic" w:hAnsi="Traditional Arabic" w:cs="Traditional Arabic" w:hint="cs"/>
                 <w:sz w:val="32"/>
                 <w:szCs w:val="32"/>
                 <w:rtl/>
               </w:rPr>
-            </w:pPr>
+              <w:t>أ</w:t>
+            </w:r>
+          </w:p>
+        </w:tc>
+        <w:tc>
+          <w:tcPr>
+            <w:tcW w:w="237" w:type="dxa"/>
+            <w:tcBorders>
+              <w:top w:val="nil"/>
+              <w:left w:val="nil"/>
+              <w:bottom w:val="nil"/>
+              <w:right w:val="nil"/>
+            </w:tcBorders>
+          </w:tcPr>
+          <w:p>
+            <w:pPr>
+              <w:bidi/>
+              <w:rPr>
+                <w:rFonts w:ascii="Traditional Arabic" w:hAnsi="Traditional Arabic" w:cs="Traditional Arabic"/>
+                <w:sz w:val="32"/>
+                <w:szCs w:val="32"/>
+                <w:rtl/>
+              </w:rPr>
+            </w:pPr>
+            <w:r>
+              <w:rPr>
+                <w:rFonts w:ascii="Traditional Arabic" w:hAnsi="Traditional Arabic" w:cs="Traditional Arabic" w:hint="cs"/>
+                <w:sz w:val="32"/>
+                <w:szCs w:val="32"/>
+                <w:rtl/>
+              </w:rPr>
+              <w:t>.</w:t>
+            </w:r>
+          </w:p>
+        </w:tc>
+        <w:tc>
+          <w:tcPr>
+            <w:tcW w:w="1717" w:type="dxa"/>
+            <w:tcBorders>
+              <w:top w:val="nil"/>
+              <w:left w:val="nil"/>
+              <w:bottom w:val="nil"/>
+              <w:right w:val="nil"/>
+            </w:tcBorders>
+          </w:tcPr>
+          <w:p>
+            <w:pPr>
+              <w:bidi/>
+              <w:rPr>
+                <w:rFonts w:ascii="Traditional Arabic" w:hAnsi="Traditional Arabic" w:cs="Traditional Arabic"/>
+                <w:sz w:val="32"/>
+                <w:szCs w:val="32"/>
+                <w:rtl/>
+              </w:rPr>
+            </w:pPr>
+            <w:r>
+              <w:rPr>
+                <w:rFonts w:ascii="Traditional Arabic" w:hAnsi="Traditional Arabic" w:cs="Traditional Arabic" w:hint="cs"/>
+                <w:sz w:val="32"/>
+                <w:szCs w:val="32"/>
+                <w:rtl/>
+              </w:rPr>
+              <w:t>اختيار الأول</w:t>
+            </w:r>
+          </w:p>
+        </w:tc>
+        <w:tc>
+          <w:tcPr>
+            <w:tcW w:w="284" w:type="dxa"/>
+            <w:tcBorders>
+              <w:top w:val="nil"/>
+              <w:left w:val="nil"/>
+              <w:bottom w:val="nil"/>
+              <w:right w:val="nil"/>
+            </w:tcBorders>
+          </w:tcPr>
+          <w:p>
+            <w:pPr>
+              <w:bidi/>
+              <w:jc w:val="right"/>
+              <w:rPr>
+                <w:rFonts w:ascii="Traditional Arabic" w:hAnsi="Traditional Arabic" w:cs="Traditional Arabic"/>
+                <w:sz w:val="32"/>
+                <w:szCs w:val="32"/>
+                <w:rtl/>
+              </w:rPr>
+            </w:pPr>
+            <w:r>
+              <w:rPr>
+                <w:rFonts w:ascii="Traditional Arabic" w:hAnsi="Traditional Arabic" w:cs="Traditional Arabic" w:hint="cs"/>
+                <w:sz w:val="32"/>
+                <w:szCs w:val="32"/>
+                <w:rtl/>
+              </w:rPr>
+              <w:t>ب</w:t>
+            </w:r>
+          </w:p>
+        </w:tc>
+        <w:tc>
+          <w:tcPr>
+            <w:tcW w:w="266" w:type="dxa"/>
+            <w:tcBorders>
+              <w:top w:val="nil"/>
+              <w:left w:val="nil"/>
+              <w:bottom w:val="nil"/>
+              <w:right w:val="nil"/>
+            </w:tcBorders>
+          </w:tcPr>
+          <w:p>
+            <w:pPr>
+              <w:bidi/>
+              <w:rPr>
+                <w:rFonts w:ascii="Traditional Arabic" w:hAnsi="Traditional Arabic" w:cs="Traditional Arabic"/>
+                <w:sz w:val="32"/>
+                <w:szCs w:val="32"/>
+                <w:rtl/>
+              </w:rPr>
+            </w:pPr>
+            <w:r>
+              <w:rPr>
+                <w:rFonts w:ascii="Traditional Arabic" w:hAnsi="Traditional Arabic" w:cs="Traditional Arabic" w:hint="cs"/>
+                <w:sz w:val="32"/>
+                <w:szCs w:val="32"/>
+                <w:rtl/>
+              </w:rPr>
+              <w:t>.</w:t>
+            </w:r>
+          </w:p>
+        </w:tc>
+        <w:tc>
+          <w:tcPr>
+            <w:tcW w:w="1623" w:type="dxa"/>
+            <w:tcBorders>
+              <w:top w:val="nil"/>
+              <w:left w:val="nil"/>
+              <w:bottom w:val="nil"/>
+              <w:right w:val="nil"/>
+            </w:tcBorders>
+          </w:tcPr>
+          <w:p>
+            <w:pPr>
+              <w:bidi/>
+              <w:rPr>
+                <w:rFonts w:ascii="Traditional Arabic" w:hAnsi="Traditional Arabic" w:cs="Traditional Arabic"/>
+                <w:sz w:val="32"/>
+                <w:szCs w:val="32"/>
+                <w:rtl/>
+              </w:rPr>
+            </w:pPr>
+            <w:r>
+              <w:rPr>
+                <w:rFonts w:ascii="Traditional Arabic" w:hAnsi="Traditional Arabic" w:cs="Traditional Arabic" w:hint="cs"/>
+                <w:sz w:val="32"/>
+                <w:szCs w:val="32"/>
+                <w:rtl/>
+              </w:rPr>
+              <w:t>اختيار الثاني</w:t>
+            </w:r>
+          </w:p>
+        </w:tc>
+        <w:tc>
+          <w:tcPr>
+            <w:tcW w:w="234" w:type="dxa"/>
+            <w:tcBorders>
+              <w:top w:val="nil"/>
+              <w:left w:val="nil"/>
+              <w:bottom w:val="nil"/>
+              <w:right w:val="nil"/>
+            </w:tcBorders>
+          </w:tcPr>
+          <w:p>
+            <w:pPr>
+              <w:bidi/>
+              <w:jc w:val="right"/>
+              <w:rPr>
+                <w:rFonts w:ascii="Traditional Arabic" w:hAnsi="Traditional Arabic" w:cs="Traditional Arabic"/>
+                <w:sz w:val="32"/>
+                <w:szCs w:val="32"/>
+                <w:rtl/>
+              </w:rPr>
+            </w:pPr>
+            <w:r>
+              <w:rPr>
+                <w:rFonts w:ascii="Traditional Arabic" w:hAnsi="Traditional Arabic" w:cs="Traditional Arabic" w:hint="cs"/>
+                <w:sz w:val="32"/>
+                <w:szCs w:val="32"/>
+                <w:rtl/>
+              </w:rPr>
+              <w:t>ج</w:t>
+            </w:r>
           </w:p>
         </w:tc>
         <w:tc>
           <w:tcPr>
             <w:tcW w:w="253" w:type="dxa"/>
-            <w:vAlign w:val="center"/>
+            <w:tcBorders>
+              <w:top w:val="nil"/>
+              <w:left w:val="nil"/>
+              <w:bottom w:val="nil"/>
+              <w:right w:val="nil"/>
+            </w:tcBorders>
+          </w:tcPr>
+          <w:p>
+            <w:pPr>
+              <w:bidi/>
+              <w:rPr>
+                <w:rFonts w:ascii="Traditional Arabic" w:hAnsi="Traditional Arabic" w:cs="Traditional Arabic"/>
+                <w:sz w:val="32"/>
+                <w:szCs w:val="32"/>
+                <w:rtl/>
+              </w:rPr>
+            </w:pPr>
+            <w:r>
+              <w:rPr>
+                <w:rFonts w:ascii="Traditional Arabic" w:hAnsi="Traditional Arabic" w:cs="Traditional Arabic" w:hint="cs"/>
+                <w:sz w:val="32"/>
+                <w:szCs w:val="32"/>
+                <w:rtl/>
+              </w:rPr>
+              <w:t>.</w:t>
+            </w:r>
+          </w:p>
+        </w:tc>
+        <w:tc>
+          <w:tcPr>
+            <w:tcW w:w="1461" w:type="dxa"/>
+            <w:tcBorders>
+              <w:top w:val="nil"/>
+              <w:left w:val="nil"/>
+              <w:bottom w:val="nil"/>
+              <w:right w:val="nil"/>
+            </w:tcBorders>
+          </w:tcPr>
+          <w:p>
+            <w:pPr>
+              <w:bidi/>
+              <w:rPr>
+                <w:rFonts w:ascii="Traditional Arabic" w:hAnsi="Traditional Arabic" w:cs="Traditional Arabic"/>
+                <w:sz w:val="32"/>
+                <w:szCs w:val="32"/>
+                <w:rtl/>
+              </w:rPr>
+            </w:pPr>
+            <w:r>
+              <w:rPr>
+                <w:rFonts w:ascii="Traditional Arabic" w:hAnsi="Traditional Arabic" w:cs="Traditional Arabic" w:hint="cs"/>
+                <w:sz w:val="32"/>
+                <w:szCs w:val="32"/>
+                <w:rtl/>
+              </w:rPr>
+              <w:t>اختيار الثالث</w:t>
+            </w:r>
+          </w:p>
+        </w:tc>
+        <w:tc>
+          <w:tcPr>
+            <w:tcW w:w="259" w:type="dxa"/>
+            <w:tcBorders>
+              <w:top w:val="nil"/>
+              <w:left w:val="nil"/>
+              <w:bottom w:val="nil"/>
+              <w:right w:val="nil"/>
+            </w:tcBorders>
           </w:tcPr>
           <w:p>
             <w:pPr>
               <w:bidi/>
               <w:jc w:val="right"/>
               <w:rPr>
+                <w:rFonts w:ascii="Traditional Arabic" w:hAnsi="Traditional Arabic" w:cs="Traditional Arabic"/>
+                <w:sz w:val="32"/>
+                <w:szCs w:val="32"/>
+                <w:rtl/>
+              </w:rPr>
+            </w:pPr>
+            <w:r>
+              <w:rPr>
                 <w:rFonts w:ascii="Traditional Arabic" w:hAnsi="Traditional Arabic" w:cs="Traditional Arabic" w:hint="cs"/>
                 <w:sz w:val="32"/>
                 <w:szCs w:val="32"/>
                 <w:rtl/>
               </w:rPr>
+              <w:t>د</w:t>
+            </w:r>
+          </w:p>
+        </w:tc>
+        <w:tc>
+          <w:tcPr>
+            <w:tcW w:w="242" w:type="dxa"/>
+            <w:tcBorders>
+              <w:top w:val="nil"/>
+              <w:left w:val="nil"/>
+              <w:bottom w:val="nil"/>
+              <w:right w:val="nil"/>
+            </w:tcBorders>
+          </w:tcPr>
+          <w:p>
+            <w:pPr>
+              <w:bidi/>
+              <w:rPr>
+                <w:rFonts w:ascii="Traditional Arabic" w:hAnsi="Traditional Arabic" w:cs="Traditional Arabic"/>
+                <w:sz w:val="32"/>
+                <w:szCs w:val="32"/>
+                <w:rtl/>
+              </w:rPr>
             </w:pPr>
             <w:r>
               <w:rPr>
@@ -284,6 +1449,93 @@
                 <w:szCs w:val="32"/>
                 <w:rtl/>
               </w:rPr>
+              <w:t>.</w:t>
+            </w:r>
+          </w:p>
+        </w:tc>
+        <w:tc>
+          <w:tcPr>
+            <w:tcW w:w="1943" w:type="dxa"/>
+            <w:tcBorders>
+              <w:top w:val="nil"/>
+              <w:left w:val="nil"/>
+              <w:bottom w:val="nil"/>
+              <w:right w:val="nil"/>
+            </w:tcBorders>
+          </w:tcPr>
+          <w:p>
+            <w:pPr>
+              <w:bidi/>
+              <w:rPr>
+                <w:rFonts w:ascii="Traditional Arabic" w:hAnsi="Traditional Arabic" w:cs="Traditional Arabic"/>
+                <w:sz w:val="32"/>
+                <w:szCs w:val="32"/>
+                <w:rtl/>
+              </w:rPr>
+            </w:pPr>
+            <w:r>
+              <w:rPr>
+                <w:rFonts w:ascii="Traditional Arabic" w:hAnsi="Traditional Arabic" w:cs="Traditional Arabic" w:hint="cs"/>
+                <w:sz w:val="32"/>
+                <w:szCs w:val="32"/>
+                <w:rtl/>
+              </w:rPr>
+              <w:t>اختيار الرابع</w:t>
+            </w:r>
+          </w:p>
+        </w:tc>
+      </w:tr>
+      <w:tr>
+        <w:tc>
+          <w:tcPr>
+            <w:tcW w:w="1058" w:type="dxa"/>
+            <w:gridSpan w:val="4"/>
+            <w:tcBorders>
+              <w:top w:val="nil"/>
+              <w:left w:val="nil"/>
+              <w:bottom w:val="nil"/>
+              <w:right w:val="nil"/>
+            </w:tcBorders>
+          </w:tcPr>
+          <w:p>
+            <w:pPr>
+              <w:bidi/>
+              <w:rPr>
+                <w:rFonts w:ascii="Traditional Arabic" w:hAnsi="Traditional Arabic" w:cs="Traditional Arabic"/>
+                <w:sz w:val="32"/>
+                <w:szCs w:val="32"/>
+                <w:rtl/>
+              </w:rPr>
+            </w:pPr>
+          </w:p>
+        </w:tc>
+        <w:tc>
+          <w:tcPr>
+            <w:tcW w:w="253" w:type="dxa"/>
+            <w:tcBorders>
+              <w:top w:val="nil"/>
+              <w:left w:val="nil"/>
+              <w:bottom w:val="nil"/>
+              <w:right w:val="nil"/>
+            </w:tcBorders>
+          </w:tcPr>
+          <w:p>
+            <w:pPr>
+              <w:bidi/>
+              <w:jc w:val="right"/>
+              <w:rPr>
+                <w:rFonts w:ascii="Traditional Arabic" w:hAnsi="Traditional Arabic" w:cs="Traditional Arabic"/>
+                <w:sz w:val="32"/>
+                <w:szCs w:val="32"/>
+              </w:rPr>
+            </w:pPr>
+            <w:r>
+              <w:rPr>
+                <w:rFonts w:ascii="Traditional Arabic" w:hAnsi="Traditional Arabic" w:cs="Traditional Arabic" w:hint="cs"/>
+                <w:sz w:val="32"/>
+                <w:szCs w:val="32"/>
+                <w:rtl/>
+              </w:rPr>
               <w:t>أ</w:t>
             </w:r>
           </w:p>
@@ -291,16 +1543,77 @@
         <w:tc>
           <w:tcPr>
             <w:tcW w:w="237" w:type="dxa"/>
-          </w:tcPr>
-          <w:p>
-            <w:pPr>
-              <w:bidi/>
+            <w:tcBorders>
+              <w:top w:val="nil"/>
+              <w:left w:val="nil"/>
+              <w:bottom w:val="nil"/>
+              <w:right w:val="nil"/>
+            </w:tcBorders>
+          </w:tcPr>
+          <w:p>
+            <w:pPr>
+              <w:bidi/>
+              <w:rPr>
+                <w:rFonts w:ascii="Traditional Arabic" w:hAnsi="Traditional Arabic" w:cs="Traditional Arabic"/>
+                <w:sz w:val="32"/>
+                <w:szCs w:val="32"/>
+                <w:rtl/>
+              </w:rPr>
+            </w:pPr>
+            <w:r>
               <w:rPr>
                 <w:rFonts w:ascii="Traditional Arabic" w:hAnsi="Traditional Arabic" w:cs="Traditional Arabic" w:hint="cs"/>
                 <w:sz w:val="32"/>
                 <w:szCs w:val="32"/>
                 <w:rtl/>
               </w:rPr>
+              <w:t>.</w:t>
+            </w:r>
+          </w:p>
+        </w:tc>
+        <w:tc>
+          <w:tcPr>
+            <w:tcW w:w="3890" w:type="dxa"/>
+            <w:gridSpan w:val="4"/>
+            <w:tcBorders>
+              <w:top w:val="nil"/>
+              <w:left w:val="nil"/>
+              <w:bottom w:val="nil"/>
+              <w:right w:val="nil"/>
+            </w:tcBorders>
+          </w:tcPr>
+          <w:p>
+            <w:pPr>
+              <w:bidi/>
+              <w:rPr>
+                <w:rFonts w:ascii="Traditional Arabic" w:hAnsi="Traditional Arabic" w:cs="Traditional Arabic"/>
+                <w:sz w:val="32"/>
+                <w:szCs w:val="32"/>
+                <w:rtl/>
+              </w:rPr>
+            </w:pPr>
+          </w:p>
+        </w:tc>
+        <w:tc>
+          <w:tcPr>
+            <w:tcW w:w="234" w:type="dxa"/>
+            <w:tcBorders>
+              <w:top w:val="nil"/>
+              <w:left w:val="nil"/>
+              <w:bottom w:val="nil"/>
+              <w:right w:val="nil"/>
+            </w:tcBorders>
+          </w:tcPr>
+          <w:p>
+            <w:pPr>
+              <w:bidi/>
+              <w:jc w:val="right"/>
+              <w:rPr>
+                <w:rFonts w:ascii="Traditional Arabic" w:hAnsi="Traditional Arabic" w:cs="Traditional Arabic"/>
+                <w:sz w:val="32"/>
+                <w:szCs w:val="32"/>
+                <w:rtl/>
+              </w:rPr>
             </w:pPr>
             <w:r>
               <w:rPr>
@@ -309,23 +1622,140 @@
                 <w:szCs w:val="32"/>
                 <w:rtl/>
               </w:rPr>
+              <w:t>ج</w:t>
+            </w:r>
+          </w:p>
+        </w:tc>
+        <w:tc>
+          <w:tcPr>
+            <w:tcW w:w="253" w:type="dxa"/>
+            <w:tcBorders>
+              <w:top w:val="nil"/>
+              <w:left w:val="nil"/>
+              <w:bottom w:val="nil"/>
+              <w:right w:val="nil"/>
+            </w:tcBorders>
+          </w:tcPr>
+          <w:p>
+            <w:pPr>
+              <w:bidi/>
+              <w:rPr>
+                <w:rFonts w:ascii="Traditional Arabic" w:hAnsi="Traditional Arabic" w:cs="Traditional Arabic"/>
+                <w:sz w:val="32"/>
+                <w:szCs w:val="32"/>
+                <w:rtl/>
+              </w:rPr>
+            </w:pPr>
+            <w:r>
+              <w:rPr>
+                <w:rFonts w:ascii="Traditional Arabic" w:hAnsi="Traditional Arabic" w:cs="Traditional Arabic" w:hint="cs"/>
+                <w:sz w:val="32"/>
+                <w:szCs w:val="32"/>
+                <w:rtl/>
+              </w:rPr>
               <w:t>.</w:t>
             </w:r>
           </w:p>
         </w:tc>
         <w:tc>
           <w:tcPr>
-            <w:tcW w:w="1717" w:type="dxa"/>
-          </w:tcPr>
-          <w:p>
-            <w:pPr>
-              <w:bidi/>
+            <w:tcW w:w="3905" w:type="dxa"/>
+            <w:gridSpan w:val="4"/>
+            <w:tcBorders>
+              <w:top w:val="nil"/>
+              <w:left w:val="nil"/>
+              <w:bottom w:val="nil"/>
+              <w:right w:val="nil"/>
+            </w:tcBorders>
+          </w:tcPr>
+          <w:p>
+            <w:pPr>
+              <w:bidi/>
+              <w:rPr>
+                <w:rFonts w:ascii="Traditional Arabic" w:hAnsi="Traditional Arabic" w:cs="Traditional Arabic"/>
+                <w:sz w:val="32"/>
+                <w:szCs w:val="32"/>
+                <w:rtl/>
+              </w:rPr>
+            </w:pPr>
+          </w:p>
+        </w:tc>
+      </w:tr>
+      <w:tr>
+        <w:tc>
+          <w:tcPr>
+            <w:tcW w:w="1058" w:type="dxa"/>
+            <w:gridSpan w:val="4"/>
+            <w:tcBorders>
+              <w:top w:val="nil"/>
+              <w:left w:val="nil"/>
+              <w:bottom w:val="nil"/>
+              <w:right w:val="nil"/>
+            </w:tcBorders>
+          </w:tcPr>
+          <w:p>
+            <w:pPr>
+              <w:bidi/>
+              <w:rPr>
+                <w:rFonts w:ascii="Traditional Arabic" w:hAnsi="Traditional Arabic" w:cs="Traditional Arabic"/>
+                <w:sz w:val="32"/>
+                <w:szCs w:val="32"/>
+                <w:rtl/>
+              </w:rPr>
+            </w:pPr>
+          </w:p>
+        </w:tc>
+        <w:tc>
+          <w:tcPr>
+            <w:tcW w:w="253" w:type="dxa"/>
+            <w:tcBorders>
+              <w:top w:val="nil"/>
+              <w:left w:val="nil"/>
+              <w:bottom w:val="nil"/>
+              <w:right w:val="nil"/>
+            </w:tcBorders>
+          </w:tcPr>
+          <w:p>
+            <w:pPr>
+              <w:bidi/>
+              <w:jc w:val="right"/>
+              <w:rPr>
+                <w:rFonts w:ascii="Traditional Arabic" w:hAnsi="Traditional Arabic" w:cs="Traditional Arabic"/>
+                <w:sz w:val="32"/>
+                <w:szCs w:val="32"/>
+                <w:rtl/>
+              </w:rPr>
+            </w:pPr>
+            <w:r>
               <w:rPr>
                 <w:rFonts w:ascii="Traditional Arabic" w:hAnsi="Traditional Arabic" w:cs="Traditional Arabic" w:hint="cs"/>
                 <w:sz w:val="32"/>
                 <w:szCs w:val="32"/>
                 <w:rtl/>
               </w:rPr>
+              <w:t>أ</w:t>
+            </w:r>
+          </w:p>
+        </w:tc>
+        <w:tc>
+          <w:tcPr>
+            <w:tcW w:w="237" w:type="dxa"/>
+            <w:tcBorders>
+              <w:top w:val="nil"/>
+              <w:left w:val="nil"/>
+              <w:bottom w:val="nil"/>
+              <w:right w:val="nil"/>
+            </w:tcBorders>
+          </w:tcPr>
+          <w:p>
+            <w:pPr>
+              <w:bidi/>
+              <w:rPr>
+                <w:rFonts w:ascii="Traditional Arabic" w:hAnsi="Traditional Arabic" w:cs="Traditional Arabic"/>
+                <w:sz w:val="32"/>
+                <w:szCs w:val="32"/>
+                <w:rtl/>
+              </w:rPr>
             </w:pPr>
             <w:r>
               <w:rPr>
@@ -334,239 +1764,31 @@
                 <w:szCs w:val="32"/>
                 <w:rtl/>
               </w:rPr>
-              <w:t>اختيار الأول</w:t>
-            </w:r>
-          </w:p>
-        </w:tc>
-        <w:tc>
-          <w:tcPr>
-            <w:tcW w:w="284" w:type="dxa"/>
-            <w:vAlign w:val="center"/>
-          </w:tcPr>
-          <w:p>
-            <w:pPr>
-              <w:bidi/>
-              <w:jc w:val="right"/>
-              <w:rPr>
-                <w:rFonts w:ascii="Traditional Arabic" w:hAnsi="Traditional Arabic" w:cs="Traditional Arabic" w:hint="cs"/>
-                <w:sz w:val="32"/>
-                <w:szCs w:val="32"/>
-                <w:rtl/>
-              </w:rPr>
-            </w:pPr>
-            <w:r>
-              <w:rPr>
-                <w:rFonts w:ascii="Traditional Arabic" w:hAnsi="Traditional Arabic" w:cs="Traditional Arabic" w:hint="cs"/>
-                <w:sz w:val="32"/>
-                <w:szCs w:val="32"/>
-                <w:rtl/>
-              </w:rPr>
-              <w:t>ب</w:t>
-            </w:r>
-          </w:p>
-        </w:tc>
-        <w:tc>
-          <w:tcPr>
-            <w:tcW w:w="266" w:type="dxa"/>
-          </w:tcPr>
-          <w:p>
-            <w:pPr>
-              <w:bidi/>
-              <w:rPr>
-                <w:rFonts w:ascii="Traditional Arabic" w:hAnsi="Traditional Arabic" w:cs="Traditional Arabic" w:hint="cs"/>
-                <w:sz w:val="32"/>
-                <w:szCs w:val="32"/>
-                <w:rtl/>
-              </w:rPr>
-            </w:pPr>
-            <w:r>
-              <w:rPr>
-                <w:rFonts w:ascii="Traditional Arabic" w:hAnsi="Traditional Arabic" w:cs="Traditional Arabic" w:hint="cs"/>
-                <w:sz w:val="32"/>
-                <w:szCs w:val="32"/>
-                <w:rtl/>
-              </w:rPr>
               <w:t>.</w:t>
             </w:r>
           </w:p>
         </w:tc>
         <w:tc>
           <w:tcPr>
-            <w:tcW w:w="1623" w:type="dxa"/>
-          </w:tcPr>
-          <w:p>
-            <w:pPr>
-              <w:bidi/>
-              <w:rPr>
-                <w:rFonts w:ascii="Traditional Arabic" w:hAnsi="Traditional Arabic" w:cs="Traditional Arabic" w:hint="cs"/>
-                <w:sz w:val="32"/>
-                <w:szCs w:val="32"/>
-                <w:rtl/>
-              </w:rPr>
-            </w:pPr>
-            <w:r>
-              <w:rPr>
-                <w:rFonts w:ascii="Traditional Arabic" w:hAnsi="Traditional Arabic" w:cs="Traditional Arabic" w:hint="cs"/>
-                <w:sz w:val="32"/>
-                <w:szCs w:val="32"/>
-                <w:rtl/>
-              </w:rPr>
-              <w:t>اختيار الثاني</w:t>
-            </w:r>
-          </w:p>
-        </w:tc>
-        <w:tc>
-          <w:tcPr>
-            <w:tcW w:w="234" w:type="dxa"/>
-            <w:vAlign w:val="center"/>
-          </w:tcPr>
-          <w:p>
-            <w:pPr>
-              <w:bidi/>
-              <w:jc w:val="right"/>
-              <w:rPr>
-                <w:rFonts w:ascii="Traditional Arabic" w:hAnsi="Traditional Arabic" w:cs="Traditional Arabic" w:hint="cs"/>
-                <w:sz w:val="32"/>
-                <w:szCs w:val="32"/>
-                <w:rtl/>
-              </w:rPr>
-            </w:pPr>
-            <w:r>
-              <w:rPr>
-                <w:rFonts w:ascii="Traditional Arabic" w:hAnsi="Traditional Arabic" w:cs="Traditional Arabic" w:hint="cs"/>
-                <w:sz w:val="32"/>
-                <w:szCs w:val="32"/>
-                <w:rtl/>
-              </w:rPr>
-              <w:t>ج</w:t>
-            </w:r>
-          </w:p>
-        </w:tc>
-        <w:tc>
-          <w:tcPr>
-            <w:tcW w:w="253" w:type="dxa"/>
-          </w:tcPr>
-          <w:p>
-            <w:pPr>
-              <w:bidi/>
-              <w:rPr>
-                <w:rFonts w:ascii="Traditional Arabic" w:hAnsi="Traditional Arabic" w:cs="Traditional Arabic" w:hint="cs"/>
-                <w:sz w:val="32"/>
-                <w:szCs w:val="32"/>
-                <w:rtl/>
-              </w:rPr>
-            </w:pPr>
-            <w:r>
-              <w:rPr>
-                <w:rFonts w:ascii="Traditional Arabic" w:hAnsi="Traditional Arabic" w:cs="Traditional Arabic" w:hint="cs"/>
-                <w:sz w:val="32"/>
-                <w:szCs w:val="32"/>
-                <w:rtl/>
-              </w:rPr>
-              <w:t>.</w:t>
-            </w:r>
-          </w:p>
-        </w:tc>
-        <w:tc>
-          <w:tcPr>
-            <w:tcW w:w="1461" w:type="dxa"/>
-          </w:tcPr>
-          <w:p>
-            <w:pPr>
-              <w:bidi/>
-              <w:rPr>
-                <w:rFonts w:ascii="Traditional Arabic" w:hAnsi="Traditional Arabic" w:cs="Traditional Arabic" w:hint="cs"/>
-                <w:sz w:val="32"/>
-                <w:szCs w:val="32"/>
-                <w:rtl/>
-              </w:rPr>
-            </w:pPr>
-            <w:r>
-              <w:rPr>
-                <w:rFonts w:ascii="Traditional Arabic" w:hAnsi="Traditional Arabic" w:cs="Traditional Arabic" w:hint="cs"/>
-                <w:sz w:val="32"/>
-                <w:szCs w:val="32"/>
-                <w:rtl/>
-              </w:rPr>
-              <w:t>اختيار الثالث</w:t>
-            </w:r>
-          </w:p>
-        </w:tc>
-        <w:tc>
-          <w:tcPr>
-            <w:tcW w:w="259" w:type="dxa"/>
-            <w:vAlign w:val="center"/>
-          </w:tcPr>
-          <w:p>
-            <w:pPr>
-              <w:bidi/>
-              <w:jc w:val="right"/>
-              <w:rPr>
-                <w:rFonts w:ascii="Traditional Arabic" w:hAnsi="Traditional Arabic" w:cs="Traditional Arabic" w:hint="cs"/>
-                <w:sz w:val="32"/>
-                <w:szCs w:val="32"/>
-                <w:rtl/>
-              </w:rPr>
-            </w:pPr>
-            <w:r>
-              <w:rPr>
-                <w:rFonts w:ascii="Traditional Arabic" w:hAnsi="Traditional Arabic" w:cs="Traditional Arabic" w:hint="cs"/>
-                <w:sz w:val="32"/>
-                <w:szCs w:val="32"/>
-                <w:rtl/>
-              </w:rPr>
-              <w:t>د</w:t>
-            </w:r>
-          </w:p>
-        </w:tc>
-        <w:tc>
-          <w:tcPr>
-            <w:tcW w:w="242" w:type="dxa"/>
-          </w:tcPr>
-          <w:p>
-            <w:pPr>
-              <w:bidi/>
-              <w:rPr>
-                <w:rFonts w:ascii="Traditional Arabic" w:hAnsi="Traditional Arabic" w:cs="Traditional Arabic" w:hint="cs"/>
-                <w:sz w:val="32"/>
-                <w:szCs w:val="32"/>
-                <w:rtl/>
-              </w:rPr>
-            </w:pPr>
-            <w:r>
-              <w:rPr>
-                <w:rFonts w:ascii="Traditional Arabic" w:hAnsi="Traditional Arabic" w:cs="Traditional Arabic" w:hint="cs"/>
-                <w:sz w:val="32"/>
-                <w:szCs w:val="32"/>
-                <w:rtl/>
-              </w:rPr>
-              <w:t>.</w:t>
-            </w:r>
-          </w:p>
-        </w:tc>
-        <w:tc>
-          <w:tcPr>
-            <w:tcW w:w="1379" w:type="dxa"/>
-          </w:tcPr>
-          <w:p>
-            <w:pPr>
-              <w:bidi/>
-              <w:rPr>
-                <w:rFonts w:ascii="Traditional Arabic" w:hAnsi="Traditional Arabic" w:cs="Traditional Arabic" w:hint="cs"/>
-                <w:sz w:val="32"/>
-                <w:szCs w:val="32"/>
-                <w:rtl/>
-              </w:rPr>
-            </w:pPr>
-            <w:r>
-              <w:rPr>
-                <w:rFonts w:ascii="Traditional Arabic" w:hAnsi="Traditional Arabic" w:cs="Traditional Arabic" w:hint="cs"/>
-                <w:sz w:val="32"/>
-                <w:szCs w:val="32"/>
-                <w:rtl/>
-              </w:rPr>
-              <w:t>اختيار الرابع</w:t>
-            </w:r>
+            <w:tcW w:w="8282" w:type="dxa"/>
+            <w:gridSpan w:val="10"/>
+            <w:tcBorders>
+              <w:top w:val="nil"/>
+              <w:left w:val="nil"/>
+              <w:bottom w:val="nil"/>
+              <w:right w:val="nil"/>
+            </w:tcBorders>
+          </w:tcPr>
+          <w:p>
+            <w:pPr>
+              <w:bidi/>
+              <w:rPr>
+                <w:rFonts w:ascii="Traditional Arabic" w:hAnsi="Traditional Arabic" w:cs="Traditional Arabic"/>
+                <w:sz w:val="32"/>
+                <w:szCs w:val="32"/>
+                <w:rtl/>
+              </w:rPr>
+            </w:pPr>
           </w:p>
         </w:tc>
       </w:tr>
@@ -576,8 +1798,8 @@
         <w:bidi/>
         <w:rPr>
           <w:rFonts w:ascii="Traditional Arabic" w:hAnsi="Traditional Arabic" w:cs="Traditional Arabic"/>
-          <w:sz w:val="36"/>
-          <w:szCs w:val="36"/>
+          <w:sz w:val="24"/>
+          <w:szCs w:val="24"/>
           <w:rtl/>
         </w:rPr>
       </w:pPr>
@@ -586,7 +1808,15 @@
       <w:tblPr>
         <w:tblStyle w:val="TableGrid"/>
         <w:bidiVisual/>
-        <w:tblW w:w="9266" w:type="dxa"/>
+        <w:tblW w:w="9830" w:type="dxa"/>
+        <w:tblBorders>
+          <w:top w:val="none" w:sz="0" w:space="0" w:color="auto"/>
+          <w:left w:val="none" w:sz="0" w:space="0" w:color="auto"/>
+          <w:bottom w:val="none" w:sz="0" w:space="0" w:color="auto"/>
+          <w:right w:val="none" w:sz="0" w:space="0" w:color="auto"/>
+          <w:insideH w:val="none" w:sz="0" w:space="0" w:color="auto"/>
+          <w:insideV w:val="none" w:sz="0" w:space="0" w:color="auto"/>
+        </w:tblBorders>
         <w:tblCellMar>
           <w:left w:w="0" w:type="dxa"/>
           <w:right w:w="0" w:type="dxa"/>
@@ -598,18 +1828,27 @@
         <w:gridCol w:w="231"/>
         <w:gridCol w:w="360"/>
         <w:gridCol w:w="231"/>
-        <w:gridCol w:w="8208"/>
+        <w:gridCol w:w="8772"/>
       </w:tblGrid>
       <w:tr>
         <w:tc>
           <w:tcPr>
             <w:tcW w:w="236" w:type="dxa"/>
-            <w:vAlign w:val="center"/>
           </w:tcPr>
           <w:p>
             <w:pPr>
               <w:bidi/>
               <w:jc w:val="right"/>
+              <w:rPr>
+                <w:rFonts w:ascii="Traditional Arabic" w:hAnsi="Traditional Arabic" w:cs="Traditional Arabic"/>
+                <w:b/>
+                <w:bCs/>
+                <w:sz w:val="32"/>
+                <w:szCs w:val="32"/>
+                <w:rtl/>
+              </w:rPr>
+            </w:pPr>
+            <w:r>
               <w:rPr>
                 <w:rFonts w:ascii="Traditional Arabic" w:hAnsi="Traditional Arabic" w:cs="Traditional Arabic" w:hint="cs"/>
                 <w:b/>
@@ -618,6 +1857,25 @@
                 <w:szCs w:val="32"/>
                 <w:rtl/>
               </w:rPr>
+              <w:t>ب</w:t>
+            </w:r>
+          </w:p>
+        </w:tc>
+        <w:tc>
+          <w:tcPr>
+            <w:tcW w:w="231" w:type="dxa"/>
+          </w:tcPr>
+          <w:p>
+            <w:pPr>
+              <w:bidi/>
+              <w:rPr>
+                <w:rFonts w:ascii="Traditional Arabic" w:hAnsi="Traditional Arabic" w:cs="Traditional Arabic"/>
+                <w:b/>
+                <w:bCs/>
+                <w:sz w:val="32"/>
+                <w:szCs w:val="32"/>
+                <w:rtl/>
+              </w:rPr>
             </w:pPr>
             <w:r>
               <w:rPr>
@@ -628,17 +1886,29 @@
                 <w:szCs w:val="32"/>
                 <w:rtl/>
               </w:rPr>
-              <w:t>ب</w:t>
-            </w:r>
-          </w:p>
-        </w:tc>
-        <w:tc>
-          <w:tcPr>
-            <w:tcW w:w="231" w:type="dxa"/>
-          </w:tcPr>
-          <w:p>
-            <w:pPr>
-              <w:bidi/>
+              <w:t>.</w:t>
+            </w:r>
+          </w:p>
+        </w:tc>
+        <w:tc>
+          <w:tcPr>
+            <w:tcW w:w="9363" w:type="dxa"/>
+            <w:gridSpan w:val="3"/>
+          </w:tcPr>
+          <w:p>
+            <w:pPr>
+              <w:bidi/>
+              <w:ind w:left="8"/>
+              <w:rPr>
+                <w:rFonts w:ascii="Traditional Arabic" w:hAnsi="Traditional Arabic" w:cs="Traditional Arabic"/>
+                <w:b/>
+                <w:bCs/>
+                <w:sz w:val="32"/>
+                <w:szCs w:val="32"/>
+                <w:rtl/>
+              </w:rPr>
+            </w:pPr>
+            <w:r>
               <w:rPr>
                 <w:rFonts w:ascii="Traditional Arabic" w:hAnsi="Traditional Arabic" w:cs="Traditional Arabic" w:hint="cs"/>
                 <w:b/>
@@ -647,51 +1917,56 @@
                 <w:szCs w:val="32"/>
                 <w:rtl/>
               </w:rPr>
-            </w:pPr>
-            <w:r>
-              <w:rPr>
-                <w:rFonts w:ascii="Traditional Arabic" w:hAnsi="Traditional Arabic" w:cs="Traditional Arabic" w:hint="cs"/>
+              <w:t>مقال</w:t>
+            </w:r>
+          </w:p>
+        </w:tc>
+      </w:tr>
+      <w:tr>
+        <w:tc>
+          <w:tcPr>
+            <w:tcW w:w="467" w:type="dxa"/>
+            <w:gridSpan w:val="2"/>
+            <w:vAlign w:val="center"/>
+          </w:tcPr>
+          <w:p>
+            <w:pPr>
+              <w:bidi/>
+              <w:rPr>
+                <w:rFonts w:ascii="Traditional Arabic" w:hAnsi="Traditional Arabic" w:cs="Traditional Arabic"/>
                 <w:b/>
                 <w:bCs/>
                 <w:sz w:val="32"/>
                 <w:szCs w:val="32"/>
                 <w:rtl/>
               </w:rPr>
-              <w:t>.</w:t>
-            </w:r>
-          </w:p>
-        </w:tc>
-        <w:tc>
-          <w:tcPr>
-            <w:tcW w:w="8799" w:type="dxa"/>
+            </w:pPr>
+          </w:p>
+        </w:tc>
+        <w:tc>
+          <w:tcPr>
+            <w:tcW w:w="9363" w:type="dxa"/>
             <w:gridSpan w:val="3"/>
-            <w:tcBorders>
-              <w:bottom w:val="single" w:sz="4" w:space="0" w:color="000000"/>
-            </w:tcBorders>
           </w:tcPr>
           <w:p>
             <w:pPr>
               <w:bidi/>
               <w:ind w:left="8"/>
               <w:rPr>
+                <w:rFonts w:ascii="Traditional Arabic" w:hAnsi="Traditional Arabic" w:cs="Traditional Arabic"/>
+                <w:sz w:val="32"/>
+                <w:szCs w:val="32"/>
+                <w:rtl/>
+              </w:rPr>
+            </w:pPr>
+            <w:r>
+              <w:rPr>
                 <w:rFonts w:ascii="Traditional Arabic" w:hAnsi="Traditional Arabic" w:cs="Traditional Arabic" w:hint="cs"/>
-                <w:b/>
-                <w:bCs/>
-                <w:sz w:val="32"/>
-                <w:szCs w:val="32"/>
-                <w:rtl/>
-              </w:rPr>
-            </w:pPr>
-            <w:r>
-              <w:rPr>
-                <w:rFonts w:ascii="Traditional Arabic" w:hAnsi="Traditional Arabic" w:cs="Traditional Arabic" w:hint="cs"/>
-                <w:b/>
-                <w:bCs/>
-                <w:sz w:val="32"/>
-                <w:szCs w:val="32"/>
-                <w:rtl/>
-              </w:rPr>
-              <w:t>مقال</w:t>
+                <w:sz w:val="32"/>
+                <w:szCs w:val="32"/>
+                <w:rtl/>
+              </w:rPr>
+              <w:t>معلومات</w:t>
             </w:r>
           </w:p>
         </w:tc>
@@ -706,33 +1981,78 @@
             <w:pPr>
               <w:bidi/>
               <w:rPr>
+                <w:rFonts w:ascii="Traditional Arabic" w:hAnsi="Traditional Arabic" w:cs="Traditional Arabic"/>
+                <w:sz w:val="32"/>
+                <w:szCs w:val="32"/>
+                <w:rtl/>
+              </w:rPr>
+            </w:pPr>
+          </w:p>
+        </w:tc>
+        <w:tc>
+          <w:tcPr>
+            <w:tcW w:w="360" w:type="dxa"/>
+          </w:tcPr>
+          <w:p>
+            <w:pPr>
+              <w:bidi/>
+              <w:jc w:val="right"/>
+              <w:rPr>
+                <w:rFonts w:ascii="Traditional Arabic" w:hAnsi="Traditional Arabic" w:cs="Traditional Arabic"/>
+                <w:sz w:val="32"/>
+                <w:szCs w:val="32"/>
+                <w:rtl/>
+              </w:rPr>
+            </w:pPr>
+            <w:r>
+              <w:rPr>
                 <w:rFonts w:ascii="Traditional Arabic" w:hAnsi="Traditional Arabic" w:cs="Traditional Arabic" w:hint="cs"/>
                 <w:sz w:val="32"/>
                 <w:szCs w:val="32"/>
                 <w:rtl/>
               </w:rPr>
-            </w:pPr>
-          </w:p>
-        </w:tc>
-        <w:tc>
-          <w:tcPr>
-            <w:tcW w:w="360" w:type="dxa"/>
-            <w:tcBorders>
-              <w:top w:val="single" w:sz="4" w:space="0" w:color="000000"/>
-              <w:bottom w:val="single" w:sz="4" w:space="0" w:color="000000"/>
-            </w:tcBorders>
-            <w:vAlign w:val="center"/>
-          </w:tcPr>
-          <w:p>
-            <w:pPr>
-              <w:bidi/>
-              <w:jc w:val="right"/>
+              <w:t>1</w:t>
+            </w:r>
+          </w:p>
+        </w:tc>
+        <w:tc>
+          <w:tcPr>
+            <w:tcW w:w="231" w:type="dxa"/>
+          </w:tcPr>
+          <w:p>
+            <w:pPr>
+              <w:bidi/>
+              <w:rPr>
+                <w:rFonts w:ascii="Traditional Arabic" w:hAnsi="Traditional Arabic" w:cs="Traditional Arabic"/>
+                <w:sz w:val="32"/>
+                <w:szCs w:val="32"/>
+                <w:rtl/>
+              </w:rPr>
+            </w:pPr>
+            <w:r>
               <w:rPr>
                 <w:rFonts w:ascii="Traditional Arabic" w:hAnsi="Traditional Arabic" w:cs="Traditional Arabic" w:hint="cs"/>
                 <w:sz w:val="32"/>
                 <w:szCs w:val="32"/>
                 <w:rtl/>
               </w:rPr>
+              <w:t>.</w:t>
+            </w:r>
+          </w:p>
+        </w:tc>
+        <w:tc>
+          <w:tcPr>
+            <w:tcW w:w="8772" w:type="dxa"/>
+          </w:tcPr>
+          <w:p>
+            <w:pPr>
+              <w:bidi/>
+              <w:rPr>
+                <w:rFonts w:ascii="Traditional Arabic" w:hAnsi="Traditional Arabic" w:cs="Traditional Arabic"/>
+                <w:sz w:val="32"/>
+                <w:szCs w:val="32"/>
+                <w:rtl/>
+              </w:rPr>
             </w:pPr>
             <w:r>
               <w:rPr>
@@ -741,169 +2061,7 @@
                 <w:szCs w:val="32"/>
                 <w:rtl/>
               </w:rPr>
-              <w:t>1</w:t>
-            </w:r>
-          </w:p>
-        </w:tc>
-        <w:tc>
-          <w:tcPr>
-            <w:tcW w:w="231" w:type="dxa"/>
-            <w:tcBorders>
-              <w:top w:val="single" w:sz="4" w:space="0" w:color="000000"/>
-              <w:bottom w:val="single" w:sz="4" w:space="0" w:color="000000"/>
-            </w:tcBorders>
-          </w:tcPr>
-          <w:p>
-            <w:pPr>
-              <w:bidi/>
-              <w:rPr>
-                <w:rFonts w:ascii="Traditional Arabic" w:hAnsi="Traditional Arabic" w:cs="Traditional Arabic" w:hint="cs"/>
-                <w:sz w:val="32"/>
-                <w:szCs w:val="32"/>
-                <w:rtl/>
-              </w:rPr>
-            </w:pPr>
-            <w:r>
-              <w:rPr>
-                <w:rFonts w:ascii="Traditional Arabic" w:hAnsi="Traditional Arabic" w:cs="Traditional Arabic" w:hint="cs"/>
-                <w:sz w:val="32"/>
-                <w:szCs w:val="32"/>
-                <w:rtl/>
-              </w:rPr>
-              <w:t>.</w:t>
-            </w:r>
-          </w:p>
-        </w:tc>
-        <w:tc>
-          <w:tcPr>
-            <w:tcW w:w="8208" w:type="dxa"/>
-            <w:tcBorders>
-              <w:top w:val="single" w:sz="4" w:space="0" w:color="000000"/>
-              <w:bottom w:val="single" w:sz="4" w:space="0" w:color="000000"/>
-            </w:tcBorders>
-          </w:tcPr>
-          <w:p>
-            <w:pPr>
-              <w:bidi/>
-              <w:rPr>
-                <w:rFonts w:ascii="Traditional Arabic" w:hAnsi="Traditional Arabic" w:cs="Traditional Arabic" w:hint="cs"/>
-                <w:sz w:val="32"/>
-                <w:szCs w:val="32"/>
-                <w:rtl/>
-              </w:rPr>
-            </w:pPr>
-            <w:r>
-              <w:rPr>
-                <w:rFonts w:ascii="Traditional Arabic" w:hAnsi="Traditional Arabic" w:cs="Traditional Arabic" w:hint="cs"/>
-                <w:sz w:val="32"/>
-                <w:szCs w:val="32"/>
-                <w:rtl/>
-              </w:rPr>
               <w:t>السؤال الأول</w:t>
-            </w:r>
-          </w:p>
-        </w:tc>
-      </w:tr>
-      <w:tr>
-        <w:tc>
-          <w:tcPr>
-            <w:tcW w:w="467" w:type="dxa"/>
-            <w:gridSpan w:val="2"/>
-          </w:tcPr>
-          <w:p>
-            <w:pPr>
-              <w:bidi/>
-              <w:rPr>
-                <w:rFonts w:ascii="Traditional Arabic" w:hAnsi="Traditional Arabic" w:cs="Traditional Arabic" w:hint="cs"/>
-                <w:sz w:val="32"/>
-                <w:szCs w:val="32"/>
-                <w:rtl/>
-              </w:rPr>
-            </w:pPr>
-          </w:p>
-        </w:tc>
-        <w:tc>
-          <w:tcPr>
-            <w:tcW w:w="360" w:type="dxa"/>
-            <w:tcBorders>
-              <w:top w:val="single" w:sz="4" w:space="0" w:color="000000"/>
-            </w:tcBorders>
-            <w:vAlign w:val="center"/>
-          </w:tcPr>
-          <w:p>
-            <w:pPr>
-              <w:bidi/>
-              <w:jc w:val="right"/>
-              <w:rPr>
-                <w:rFonts w:ascii="Traditional Arabic" w:hAnsi="Traditional Arabic" w:cs="Traditional Arabic" w:hint="cs"/>
-                <w:sz w:val="32"/>
-                <w:szCs w:val="32"/>
-                <w:rtl/>
-              </w:rPr>
-            </w:pPr>
-            <w:r>
-              <w:rPr>
-                <w:rFonts w:ascii="Traditional Arabic" w:hAnsi="Traditional Arabic" w:cs="Traditional Arabic" w:hint="cs"/>
-                <w:sz w:val="32"/>
-                <w:szCs w:val="32"/>
-                <w:rtl/>
-              </w:rPr>
-              <w:t>2</w:t>
-            </w:r>
-          </w:p>
-        </w:tc>
-        <w:tc>
-          <w:tcPr>
-            <w:tcW w:w="231" w:type="dxa"/>
-            <w:tcBorders>
-              <w:top w:val="single" w:sz="4" w:space="0" w:color="000000"/>
-            </w:tcBorders>
-          </w:tcPr>
-          <w:p>
-            <w:pPr>
-              <w:bidi/>
-              <w:rPr>
-                <w:rFonts w:ascii="Traditional Arabic" w:hAnsi="Traditional Arabic" w:cs="Traditional Arabic" w:hint="cs"/>
-                <w:sz w:val="32"/>
-                <w:szCs w:val="32"/>
-                <w:rtl/>
-              </w:rPr>
-            </w:pPr>
-            <w:r>
-              <w:rPr>
-                <w:rFonts w:ascii="Traditional Arabic" w:hAnsi="Traditional Arabic" w:cs="Traditional Arabic" w:hint="cs"/>
-                <w:sz w:val="32"/>
-                <w:szCs w:val="32"/>
-                <w:rtl/>
-              </w:rPr>
-              <w:t>.</w:t>
-            </w:r>
-          </w:p>
-        </w:tc>
-        <w:tc>
-          <w:tcPr>
-            <w:tcW w:w="8208" w:type="dxa"/>
-            <w:tcBorders>
-              <w:top w:val="single" w:sz="4" w:space="0" w:color="000000"/>
-            </w:tcBorders>
-          </w:tcPr>
-          <w:p>
-            <w:pPr>
-              <w:bidi/>
-              <w:rPr>
-                <w:rFonts w:ascii="Traditional Arabic" w:hAnsi="Traditional Arabic" w:cs="Traditional Arabic" w:hint="cs"/>
-                <w:sz w:val="32"/>
-                <w:szCs w:val="32"/>
-              </w:rPr>
-            </w:pPr>
-            <w:r>
-              <w:rPr>
-                <w:rFonts w:ascii="Traditional Arabic" w:hAnsi="Traditional Arabic" w:cs="Traditional Arabic" w:hint="cs"/>
-                <w:sz w:val="32"/>
-                <w:szCs w:val="32"/>
-                <w:rtl/>
-              </w:rPr>
-              <w:t>السؤال الثاني</w:t>
             </w:r>
           </w:p>
         </w:tc>
@@ -914,8 +2072,8 @@
         <w:bidi/>
         <w:rPr>
           <w:rFonts w:ascii="Traditional Arabic" w:hAnsi="Traditional Arabic" w:cs="Traditional Arabic"/>
-          <w:sz w:val="36"/>
-          <w:szCs w:val="36"/>
+          <w:sz w:val="24"/>
+          <w:szCs w:val="24"/>
         </w:rPr>
       </w:pPr>
     </w:p>
@@ -923,7 +2081,15 @@
       <w:tblPr>
         <w:tblStyle w:val="TableGrid"/>
         <w:bidiVisual/>
-        <w:tblW w:w="9202" w:type="dxa"/>
+        <w:tblW w:w="9819" w:type="dxa"/>
+        <w:tblBorders>
+          <w:top w:val="none" w:sz="0" w:space="0" w:color="auto"/>
+          <w:left w:val="none" w:sz="0" w:space="0" w:color="auto"/>
+          <w:bottom w:val="none" w:sz="0" w:space="0" w:color="auto"/>
+          <w:right w:val="none" w:sz="0" w:space="0" w:color="auto"/>
+          <w:insideH w:val="none" w:sz="0" w:space="0" w:color="auto"/>
+          <w:insideV w:val="none" w:sz="0" w:space="0" w:color="auto"/>
+        </w:tblBorders>
         <w:tblCellMar>
           <w:left w:w="0" w:type="dxa"/>
           <w:right w:w="0" w:type="dxa"/>
@@ -935,18 +2101,27 @@
         <w:gridCol w:w="231"/>
         <w:gridCol w:w="522"/>
         <w:gridCol w:w="4106"/>
-        <w:gridCol w:w="4107"/>
+        <w:gridCol w:w="4724"/>
       </w:tblGrid>
       <w:tr>
         <w:tc>
           <w:tcPr>
             <w:tcW w:w="236" w:type="dxa"/>
-            <w:vAlign w:val="center"/>
           </w:tcPr>
           <w:p>
             <w:pPr>
               <w:bidi/>
               <w:jc w:val="right"/>
+              <w:rPr>
+                <w:rFonts w:ascii="Traditional Arabic" w:hAnsi="Traditional Arabic" w:cs="Traditional Arabic"/>
+                <w:b/>
+                <w:bCs/>
+                <w:sz w:val="32"/>
+                <w:szCs w:val="32"/>
+                <w:rtl/>
+              </w:rPr>
+            </w:pPr>
+            <w:r>
               <w:rPr>
                 <w:rFonts w:ascii="Traditional Arabic" w:hAnsi="Traditional Arabic" w:cs="Traditional Arabic" w:hint="cs"/>
                 <w:b/>
@@ -955,6 +2130,25 @@
                 <w:szCs w:val="32"/>
                 <w:rtl/>
               </w:rPr>
+              <w:t>ج</w:t>
+            </w:r>
+          </w:p>
+        </w:tc>
+        <w:tc>
+          <w:tcPr>
+            <w:tcW w:w="231" w:type="dxa"/>
+          </w:tcPr>
+          <w:p>
+            <w:pPr>
+              <w:bidi/>
+              <w:rPr>
+                <w:rFonts w:ascii="Traditional Arabic" w:hAnsi="Traditional Arabic" w:cs="Traditional Arabic"/>
+                <w:b/>
+                <w:bCs/>
+                <w:sz w:val="32"/>
+                <w:szCs w:val="32"/>
+                <w:rtl/>
+              </w:rPr>
             </w:pPr>
             <w:r>
               <w:rPr>
@@ -965,17 +2159,29 @@
                 <w:szCs w:val="32"/>
                 <w:rtl/>
               </w:rPr>
-              <w:t>ج</w:t>
-            </w:r>
-          </w:p>
-        </w:tc>
-        <w:tc>
-          <w:tcPr>
-            <w:tcW w:w="231" w:type="dxa"/>
-          </w:tcPr>
-          <w:p>
-            <w:pPr>
-              <w:bidi/>
+              <w:t>.</w:t>
+            </w:r>
+          </w:p>
+        </w:tc>
+        <w:tc>
+          <w:tcPr>
+            <w:tcW w:w="9352" w:type="dxa"/>
+            <w:gridSpan w:val="3"/>
+          </w:tcPr>
+          <w:p>
+            <w:pPr>
+              <w:bidi/>
+              <w:ind w:left="8"/>
+              <w:rPr>
+                <w:rFonts w:ascii="Traditional Arabic" w:hAnsi="Traditional Arabic" w:cs="Traditional Arabic"/>
+                <w:b/>
+                <w:bCs/>
+                <w:sz w:val="32"/>
+                <w:szCs w:val="32"/>
+                <w:rtl/>
+              </w:rPr>
+            </w:pPr>
+            <w:r>
               <w:rPr>
                 <w:rFonts w:ascii="Traditional Arabic" w:hAnsi="Traditional Arabic" w:cs="Traditional Arabic" w:hint="cs"/>
                 <w:b/>
@@ -984,50 +2190,6 @@
                 <w:szCs w:val="32"/>
                 <w:rtl/>
               </w:rPr>
-            </w:pPr>
-            <w:r>
-              <w:rPr>
-                <w:rFonts w:ascii="Traditional Arabic" w:hAnsi="Traditional Arabic" w:cs="Traditional Arabic" w:hint="cs"/>
-                <w:b/>
-                <w:bCs/>
-                <w:sz w:val="32"/>
-                <w:szCs w:val="32"/>
-                <w:rtl/>
-              </w:rPr>
-              <w:t>.</w:t>
-            </w:r>
-          </w:p>
-        </w:tc>
-        <w:tc>
-          <w:tcPr>
-            <w:tcW w:w="8735" w:type="dxa"/>
-            <w:gridSpan w:val="3"/>
-            <w:tcBorders>
-              <w:bottom w:val="single" w:sz="4" w:space="0" w:color="000000"/>
-            </w:tcBorders>
-          </w:tcPr>
-          <w:p>
-            <w:pPr>
-              <w:bidi/>
-              <w:ind w:left="8"/>
-              <w:rPr>
-                <w:rFonts w:ascii="Traditional Arabic" w:hAnsi="Traditional Arabic" w:cs="Traditional Arabic" w:hint="cs"/>
-                <w:b/>
-                <w:bCs/>
-                <w:sz w:val="32"/>
-                <w:szCs w:val="32"/>
-                <w:rtl/>
-              </w:rPr>
-            </w:pPr>
-            <w:r>
-              <w:rPr>
-                <w:rFonts w:ascii="Traditional Arabic" w:hAnsi="Traditional Arabic" w:cs="Traditional Arabic" w:hint="cs"/>
-                <w:b/>
-                <w:bCs/>
-                <w:sz w:val="32"/>
-                <w:szCs w:val="32"/>
-                <w:rtl/>
-              </w:rPr>
               <w:t>وصل الكلمات</w:t>
             </w:r>
           </w:p>
@@ -1036,6 +2198,53 @@
       <w:tr>
         <w:tc>
           <w:tcPr>
+            <w:tcW w:w="467" w:type="dxa"/>
+            <w:gridSpan w:val="2"/>
+            <w:vAlign w:val="center"/>
+          </w:tcPr>
+          <w:p>
+            <w:pPr>
+              <w:bidi/>
+              <w:rPr>
+                <w:rFonts w:ascii="Traditional Arabic" w:hAnsi="Traditional Arabic" w:cs="Traditional Arabic"/>
+                <w:sz w:val="32"/>
+                <w:szCs w:val="32"/>
+                <w:rtl/>
+              </w:rPr>
+            </w:pPr>
+          </w:p>
+        </w:tc>
+        <w:tc>
+          <w:tcPr>
+            <w:tcW w:w="9352" w:type="dxa"/>
+            <w:gridSpan w:val="3"/>
+          </w:tcPr>
+          <w:p>
+            <w:pPr>
+              <w:bidi/>
+              <w:ind w:left="8"/>
+              <w:rPr>
+                <w:rFonts w:ascii="Traditional Arabic" w:hAnsi="Traditional Arabic" w:cs="Traditional Arabic"/>
+                <w:sz w:val="32"/>
+                <w:szCs w:val="32"/>
+                <w:rtl/>
+              </w:rPr>
+            </w:pPr>
+            <w:r>
+              <w:rPr>
+                <w:rFonts w:ascii="Traditional Arabic" w:hAnsi="Traditional Arabic" w:cs="Traditional Arabic" w:hint="cs"/>
+                <w:sz w:val="32"/>
+                <w:szCs w:val="32"/>
+                <w:rtl/>
+              </w:rPr>
+              <w:t>معلومات</w:t>
+            </w:r>
+          </w:p>
+        </w:tc>
+      </w:tr>
+      <w:tr>
+        <w:tc>
+          <w:tcPr>
             <w:tcW w:w="989" w:type="dxa"/>
             <w:gridSpan w:val="3"/>
           </w:tcPr>
@@ -1043,56 +2252,50 @@
             <w:pPr>
               <w:bidi/>
               <w:rPr>
+                <w:rFonts w:ascii="Traditional Arabic" w:hAnsi="Traditional Arabic" w:cs="Traditional Arabic"/>
+                <w:sz w:val="32"/>
+                <w:szCs w:val="32"/>
+                <w:rtl/>
+              </w:rPr>
+            </w:pPr>
+          </w:p>
+        </w:tc>
+        <w:tc>
+          <w:tcPr>
+            <w:tcW w:w="4106" w:type="dxa"/>
+          </w:tcPr>
+          <w:p>
+            <w:pPr>
+              <w:bidi/>
+              <w:rPr>
+                <w:rFonts w:ascii="Traditional Arabic" w:hAnsi="Traditional Arabic" w:cs="Traditional Arabic"/>
+                <w:sz w:val="32"/>
+                <w:szCs w:val="32"/>
+                <w:u w:val="single"/>
+                <w:rtl/>
+              </w:rPr>
+            </w:pPr>
+            <w:r>
+              <w:rPr>
                 <w:rFonts w:ascii="Traditional Arabic" w:hAnsi="Traditional Arabic" w:cs="Traditional Arabic" w:hint="cs"/>
                 <w:sz w:val="32"/>
                 <w:szCs w:val="32"/>
-                <w:rtl/>
-              </w:rPr>
-            </w:pPr>
-          </w:p>
-        </w:tc>
-        <w:tc>
-          <w:tcPr>
-            <w:tcW w:w="4106" w:type="dxa"/>
-            <w:tcBorders>
-              <w:top w:val="single" w:sz="4" w:space="0" w:color="000000"/>
-            </w:tcBorders>
-          </w:tcPr>
-          <w:p>
-            <w:pPr>
-              <w:bidi/>
-              <w:rPr>
-                <w:rFonts w:ascii="Traditional Arabic" w:hAnsi="Traditional Arabic" w:cs="Traditional Arabic"/>
-                <w:sz w:val="32"/>
-                <w:szCs w:val="32"/>
                 <w:u w:val="single"/>
                 <w:rtl/>
               </w:rPr>
-            </w:pPr>
-            <w:r>
-              <w:rPr>
-                <w:rFonts w:ascii="Traditional Arabic" w:hAnsi="Traditional Arabic" w:cs="Traditional Arabic" w:hint="cs"/>
-                <w:sz w:val="32"/>
-                <w:szCs w:val="32"/>
-                <w:u w:val="single"/>
-                <w:rtl/>
-              </w:rPr>
               <w:t>القائمة أ</w:t>
             </w:r>
           </w:p>
         </w:tc>
         <w:tc>
           <w:tcPr>
-            <w:tcW w:w="4107" w:type="dxa"/>
-            <w:tcBorders>
-              <w:top w:val="single" w:sz="4" w:space="0" w:color="000000"/>
-            </w:tcBorders>
-          </w:tcPr>
-          <w:p>
-            <w:pPr>
-              <w:bidi/>
-              <w:rPr>
-                <w:rFonts w:ascii="Traditional Arabic" w:hAnsi="Traditional Arabic" w:cs="Traditional Arabic" w:hint="cs"/>
+            <w:tcW w:w="4724" w:type="dxa"/>
+          </w:tcPr>
+          <w:p>
+            <w:pPr>
+              <w:bidi/>
+              <w:rPr>
+                <w:rFonts w:ascii="Traditional Arabic" w:hAnsi="Traditional Arabic" w:cs="Traditional Arabic"/>
                 <w:sz w:val="32"/>
                 <w:szCs w:val="32"/>
                 <w:u w:val="single"/>
@@ -1122,47 +2325,47 @@
             <w:pPr>
               <w:bidi/>
               <w:rPr>
+                <w:rFonts w:ascii="Traditional Arabic" w:hAnsi="Traditional Arabic" w:cs="Traditional Arabic"/>
+                <w:sz w:val="32"/>
+                <w:szCs w:val="32"/>
+                <w:rtl/>
+              </w:rPr>
+            </w:pPr>
+          </w:p>
+        </w:tc>
+        <w:tc>
+          <w:tcPr>
+            <w:tcW w:w="4106" w:type="dxa"/>
+          </w:tcPr>
+          <w:p>
+            <w:pPr>
+              <w:bidi/>
+              <w:rPr>
+                <w:rFonts w:ascii="Traditional Arabic" w:hAnsi="Traditional Arabic" w:cs="Traditional Arabic"/>
+                <w:sz w:val="32"/>
+                <w:szCs w:val="32"/>
+              </w:rPr>
+            </w:pPr>
+            <w:r>
+              <w:rPr>
                 <w:rFonts w:ascii="Traditional Arabic" w:hAnsi="Traditional Arabic" w:cs="Traditional Arabic" w:hint="cs"/>
                 <w:sz w:val="32"/>
                 <w:szCs w:val="32"/>
                 <w:rtl/>
               </w:rPr>
-            </w:pPr>
-          </w:p>
-        </w:tc>
-        <w:tc>
-          <w:tcPr>
-            <w:tcW w:w="4106" w:type="dxa"/>
-          </w:tcPr>
-          <w:p>
-            <w:pPr>
-              <w:bidi/>
-              <w:rPr>
-                <w:rFonts w:ascii="Traditional Arabic" w:hAnsi="Traditional Arabic" w:cs="Traditional Arabic" w:hint="cs"/>
-                <w:sz w:val="32"/>
-                <w:szCs w:val="32"/>
-              </w:rPr>
-            </w:pPr>
-            <w:r>
-              <w:rPr>
-                <w:rFonts w:ascii="Traditional Arabic" w:hAnsi="Traditional Arabic" w:cs="Traditional Arabic" w:hint="cs"/>
-                <w:sz w:val="32"/>
-                <w:szCs w:val="32"/>
-                <w:rtl/>
-              </w:rPr>
               <w:t>القائمة</w:t>
             </w:r>
           </w:p>
         </w:tc>
         <w:tc>
           <w:tcPr>
-            <w:tcW w:w="4107" w:type="dxa"/>
-          </w:tcPr>
-          <w:p>
-            <w:pPr>
-              <w:bidi/>
-              <w:rPr>
-                <w:rFonts w:ascii="Traditional Arabic" w:hAnsi="Traditional Arabic" w:cs="Traditional Arabic" w:hint="cs"/>
+            <w:tcW w:w="4724" w:type="dxa"/>
+          </w:tcPr>
+          <w:p>
+            <w:pPr>
+              <w:bidi/>
+              <w:rPr>
+                <w:rFonts w:ascii="Traditional Arabic" w:hAnsi="Traditional Arabic" w:cs="Traditional Arabic"/>
                 <w:sz w:val="32"/>
                 <w:szCs w:val="32"/>
               </w:rPr>
@@ -1185,8 +2388,8 @@
         <w:bidi/>
         <w:rPr>
           <w:rFonts w:ascii="Traditional Arabic" w:hAnsi="Traditional Arabic" w:cs="Traditional Arabic"/>
-          <w:sz w:val="36"/>
-          <w:szCs w:val="36"/>
+          <w:sz w:val="24"/>
+          <w:szCs w:val="24"/>
         </w:rPr>
       </w:pPr>
     </w:p>
@@ -1194,7 +2397,15 @@
       <w:tblPr>
         <w:tblStyle w:val="TableGrid"/>
         <w:bidiVisual/>
-        <w:tblW w:w="9254" w:type="dxa"/>
+        <w:tblW w:w="9807" w:type="dxa"/>
+        <w:tblBorders>
+          <w:top w:val="none" w:sz="0" w:space="0" w:color="auto"/>
+          <w:left w:val="none" w:sz="0" w:space="0" w:color="auto"/>
+          <w:bottom w:val="none" w:sz="0" w:space="0" w:color="auto"/>
+          <w:right w:val="none" w:sz="0" w:space="0" w:color="auto"/>
+          <w:insideH w:val="none" w:sz="0" w:space="0" w:color="auto"/>
+          <w:insideV w:val="none" w:sz="0" w:space="0" w:color="auto"/>
+        </w:tblBorders>
         <w:tblCellMar>
           <w:left w:w="0" w:type="dxa"/>
           <w:right w:w="0" w:type="dxa"/>
@@ -1207,19 +2418,27 @@
         <w:gridCol w:w="348"/>
         <w:gridCol w:w="223"/>
         <w:gridCol w:w="4103"/>
-        <w:gridCol w:w="4109"/>
-        <w:gridCol w:w="6"/>
+        <w:gridCol w:w="4668"/>
       </w:tblGrid>
       <w:tr>
         <w:tc>
           <w:tcPr>
             <w:tcW w:w="234" w:type="dxa"/>
-            <w:vAlign w:val="center"/>
           </w:tcPr>
           <w:p>
             <w:pPr>
               <w:bidi/>
               <w:jc w:val="right"/>
+              <w:rPr>
+                <w:rFonts w:ascii="Traditional Arabic" w:hAnsi="Traditional Arabic" w:cs="Traditional Arabic"/>
+                <w:b/>
+                <w:bCs/>
+                <w:sz w:val="32"/>
+                <w:szCs w:val="32"/>
+                <w:rtl/>
+              </w:rPr>
+            </w:pPr>
+            <w:r>
               <w:rPr>
                 <w:rFonts w:ascii="Traditional Arabic" w:hAnsi="Traditional Arabic" w:cs="Traditional Arabic" w:hint="cs"/>
                 <w:b/>
@@ -1228,6 +2447,25 @@
                 <w:szCs w:val="32"/>
                 <w:rtl/>
               </w:rPr>
+              <w:t>د</w:t>
+            </w:r>
+          </w:p>
+        </w:tc>
+        <w:tc>
+          <w:tcPr>
+            <w:tcW w:w="231" w:type="dxa"/>
+          </w:tcPr>
+          <w:p>
+            <w:pPr>
+              <w:bidi/>
+              <w:rPr>
+                <w:rFonts w:ascii="Traditional Arabic" w:hAnsi="Traditional Arabic" w:cs="Traditional Arabic"/>
+                <w:b/>
+                <w:bCs/>
+                <w:sz w:val="32"/>
+                <w:szCs w:val="32"/>
+                <w:rtl/>
+              </w:rPr>
             </w:pPr>
             <w:r>
               <w:rPr>
@@ -1238,17 +2476,29 @@
                 <w:szCs w:val="32"/>
                 <w:rtl/>
               </w:rPr>
-              <w:t>د</w:t>
-            </w:r>
-          </w:p>
-        </w:tc>
-        <w:tc>
-          <w:tcPr>
-            <w:tcW w:w="231" w:type="dxa"/>
-          </w:tcPr>
-          <w:p>
-            <w:pPr>
-              <w:bidi/>
+              <w:t>.</w:t>
+            </w:r>
+          </w:p>
+        </w:tc>
+        <w:tc>
+          <w:tcPr>
+            <w:tcW w:w="9342" w:type="dxa"/>
+            <w:gridSpan w:val="4"/>
+          </w:tcPr>
+          <w:p>
+            <w:pPr>
+              <w:bidi/>
+              <w:ind w:left="8"/>
+              <w:rPr>
+                <w:rFonts w:ascii="Traditional Arabic" w:hAnsi="Traditional Arabic" w:cs="Traditional Arabic"/>
+                <w:b/>
+                <w:bCs/>
+                <w:sz w:val="32"/>
+                <w:szCs w:val="32"/>
+                <w:rtl/>
+              </w:rPr>
+            </w:pPr>
+            <w:r>
               <w:rPr>
                 <w:rFonts w:ascii="Traditional Arabic" w:hAnsi="Traditional Arabic" w:cs="Traditional Arabic" w:hint="cs"/>
                 <w:b/>
@@ -1257,51 +2507,55 @@
                 <w:szCs w:val="32"/>
                 <w:rtl/>
               </w:rPr>
-            </w:pPr>
-            <w:r>
-              <w:rPr>
-                <w:rFonts w:ascii="Traditional Arabic" w:hAnsi="Traditional Arabic" w:cs="Traditional Arabic" w:hint="cs"/>
+              <w:t>املأ الفراغ</w:t>
+            </w:r>
+          </w:p>
+        </w:tc>
+      </w:tr>
+      <w:tr>
+        <w:tc>
+          <w:tcPr>
+            <w:tcW w:w="465" w:type="dxa"/>
+            <w:gridSpan w:val="2"/>
+            <w:vAlign w:val="center"/>
+          </w:tcPr>
+          <w:p>
+            <w:pPr>
+              <w:bidi/>
+              <w:rPr>
+                <w:rFonts w:ascii="Traditional Arabic" w:hAnsi="Traditional Arabic" w:cs="Traditional Arabic"/>
                 <w:b/>
                 <w:bCs/>
                 <w:sz w:val="32"/>
                 <w:szCs w:val="32"/>
                 <w:rtl/>
               </w:rPr>
-              <w:t>.</w:t>
-            </w:r>
-          </w:p>
-        </w:tc>
-        <w:tc>
-          <w:tcPr>
-            <w:tcW w:w="8789" w:type="dxa"/>
-            <w:gridSpan w:val="5"/>
-            <w:tcBorders>
-              <w:bottom w:val="single" w:sz="4" w:space="0" w:color="000000"/>
-            </w:tcBorders>
+            </w:pPr>
+          </w:p>
+        </w:tc>
+        <w:tc>
+          <w:tcPr>
+            <w:tcW w:w="9342" w:type="dxa"/>
+            <w:gridSpan w:val="4"/>
           </w:tcPr>
           <w:p>
             <w:pPr>
               <w:bidi/>
               <w:ind w:left="8"/>
               <w:rPr>
+                <w:rFonts w:ascii="Traditional Arabic" w:hAnsi="Traditional Arabic" w:cs="Traditional Arabic"/>
+                <w:sz w:val="32"/>
+                <w:szCs w:val="32"/>
+              </w:rPr>
+            </w:pPr>
+            <w:r>
+              <w:rPr>
                 <w:rFonts w:ascii="Traditional Arabic" w:hAnsi="Traditional Arabic" w:cs="Traditional Arabic" w:hint="cs"/>
-                <w:b/>
-                <w:bCs/>
-                <w:sz w:val="32"/>
-                <w:szCs w:val="32"/>
-                <w:rtl/>
-              </w:rPr>
-            </w:pPr>
-            <w:r>
-              <w:rPr>
-                <w:rFonts w:ascii="Traditional Arabic" w:hAnsi="Traditional Arabic" w:cs="Traditional Arabic" w:hint="cs"/>
-                <w:b/>
-                <w:bCs/>
-                <w:sz w:val="32"/>
-                <w:szCs w:val="32"/>
-                <w:rtl/>
-              </w:rPr>
-              <w:t>املأ الفراغ</w:t>
+                <w:sz w:val="32"/>
+                <w:szCs w:val="32"/>
+                <w:rtl/>
+              </w:rPr>
+              <w:t>معلومات</w:t>
             </w:r>
           </w:p>
         </w:tc>
@@ -1316,55 +2570,48 @@
             <w:pPr>
               <w:bidi/>
               <w:rPr>
+                <w:rFonts w:ascii="Traditional Arabic" w:hAnsi="Traditional Arabic" w:cs="Traditional Arabic"/>
+                <w:sz w:val="32"/>
+                <w:szCs w:val="32"/>
+                <w:rtl/>
+              </w:rPr>
+            </w:pPr>
+          </w:p>
+        </w:tc>
+        <w:tc>
+          <w:tcPr>
+            <w:tcW w:w="4103" w:type="dxa"/>
+          </w:tcPr>
+          <w:p>
+            <w:pPr>
+              <w:bidi/>
+              <w:rPr>
+                <w:rFonts w:ascii="Traditional Arabic" w:hAnsi="Traditional Arabic" w:cs="Traditional Arabic"/>
+                <w:sz w:val="32"/>
+                <w:szCs w:val="32"/>
+                <w:rtl/>
+              </w:rPr>
+            </w:pPr>
+            <w:r>
+              <w:rPr>
                 <w:rFonts w:ascii="Traditional Arabic" w:hAnsi="Traditional Arabic" w:cs="Traditional Arabic" w:hint="cs"/>
                 <w:sz w:val="32"/>
                 <w:szCs w:val="32"/>
                 <w:rtl/>
               </w:rPr>
-            </w:pPr>
-          </w:p>
-        </w:tc>
-        <w:tc>
-          <w:tcPr>
-            <w:tcW w:w="4103" w:type="dxa"/>
-            <w:tcBorders>
-              <w:top w:val="single" w:sz="4" w:space="0" w:color="000000"/>
-            </w:tcBorders>
-          </w:tcPr>
-          <w:p>
-            <w:pPr>
-              <w:bidi/>
-              <w:rPr>
-                <w:rFonts w:ascii="Traditional Arabic" w:hAnsi="Traditional Arabic" w:cs="Traditional Arabic" w:hint="cs"/>
-                <w:sz w:val="32"/>
-                <w:szCs w:val="32"/>
-                <w:rtl/>
-              </w:rPr>
-            </w:pPr>
-            <w:r>
-              <w:rPr>
-                <w:rFonts w:ascii="Traditional Arabic" w:hAnsi="Traditional Arabic" w:cs="Traditional Arabic" w:hint="cs"/>
-                <w:sz w:val="32"/>
-                <w:szCs w:val="32"/>
-                <w:rtl/>
-              </w:rPr>
               <w:t>(اختيار 1، اختيار 2)</w:t>
             </w:r>
           </w:p>
         </w:tc>
         <w:tc>
           <w:tcPr>
-            <w:tcW w:w="4115" w:type="dxa"/>
-            <w:gridSpan w:val="2"/>
-            <w:tcBorders>
-              <w:top w:val="single" w:sz="4" w:space="0" w:color="000000"/>
-            </w:tcBorders>
-          </w:tcPr>
-          <w:p>
-            <w:pPr>
-              <w:bidi/>
-              <w:rPr>
-                <w:rFonts w:ascii="Traditional Arabic" w:hAnsi="Traditional Arabic" w:cs="Traditional Arabic" w:hint="cs"/>
+            <w:tcW w:w="4668" w:type="dxa"/>
+          </w:tcPr>
+          <w:p>
+            <w:pPr>
+              <w:bidi/>
+              <w:rPr>
+                <w:rFonts w:ascii="Traditional Arabic" w:hAnsi="Traditional Arabic" w:cs="Traditional Arabic"/>
                 <w:sz w:val="32"/>
                 <w:szCs w:val="32"/>
                 <w:u w:val="single"/>
@@ -1375,10 +2622,6 @@
         </w:tc>
       </w:tr>
       <w:tr>
-        <w:trPr>
-          <w:gridAfter w:val="1"/>
-          <w:wAfter w:w="6" w:type="dxa"/>
-        </w:trPr>
         <w:tc>
           <w:tcPr>
             <w:tcW w:w="465" w:type="dxa"/>
@@ -1388,29 +2631,79 @@
             <w:pPr>
               <w:bidi/>
               <w:rPr>
+                <w:rFonts w:ascii="Traditional Arabic" w:hAnsi="Traditional Arabic" w:cs="Traditional Arabic"/>
+                <w:sz w:val="32"/>
+                <w:szCs w:val="32"/>
+                <w:rtl/>
+              </w:rPr>
+            </w:pPr>
+          </w:p>
+        </w:tc>
+        <w:tc>
+          <w:tcPr>
+            <w:tcW w:w="348" w:type="dxa"/>
+          </w:tcPr>
+          <w:p>
+            <w:pPr>
+              <w:bidi/>
+              <w:jc w:val="right"/>
+              <w:rPr>
+                <w:rFonts w:ascii="Traditional Arabic" w:hAnsi="Traditional Arabic" w:cs="Traditional Arabic"/>
+                <w:sz w:val="32"/>
+                <w:szCs w:val="32"/>
+                <w:rtl/>
+              </w:rPr>
+            </w:pPr>
+            <w:r>
+              <w:rPr>
                 <w:rFonts w:ascii="Traditional Arabic" w:hAnsi="Traditional Arabic" w:cs="Traditional Arabic" w:hint="cs"/>
                 <w:sz w:val="32"/>
                 <w:szCs w:val="32"/>
                 <w:rtl/>
               </w:rPr>
-            </w:pPr>
-          </w:p>
-        </w:tc>
-        <w:tc>
-          <w:tcPr>
-            <w:tcW w:w="348" w:type="dxa"/>
-            <w:vAlign w:val="center"/>
-          </w:tcPr>
-          <w:p>
-            <w:pPr>
-              <w:bidi/>
-              <w:jc w:val="right"/>
+              <w:t>1</w:t>
+            </w:r>
+          </w:p>
+        </w:tc>
+        <w:tc>
+          <w:tcPr>
+            <w:tcW w:w="223" w:type="dxa"/>
+          </w:tcPr>
+          <w:p>
+            <w:pPr>
+              <w:bidi/>
+              <w:rPr>
+                <w:rFonts w:ascii="Traditional Arabic" w:hAnsi="Traditional Arabic" w:cs="Traditional Arabic"/>
+                <w:sz w:val="32"/>
+                <w:szCs w:val="32"/>
+                <w:rtl/>
+              </w:rPr>
+            </w:pPr>
+            <w:r>
               <w:rPr>
                 <w:rFonts w:ascii="Traditional Arabic" w:hAnsi="Traditional Arabic" w:cs="Traditional Arabic" w:hint="cs"/>
                 <w:sz w:val="32"/>
                 <w:szCs w:val="32"/>
                 <w:rtl/>
               </w:rPr>
+              <w:t>.</w:t>
+            </w:r>
+          </w:p>
+        </w:tc>
+        <w:tc>
+          <w:tcPr>
+            <w:tcW w:w="8771" w:type="dxa"/>
+            <w:gridSpan w:val="2"/>
+          </w:tcPr>
+          <w:p>
+            <w:pPr>
+              <w:bidi/>
+              <w:rPr>
+                <w:rFonts w:ascii="Traditional Arabic" w:hAnsi="Traditional Arabic" w:cs="Traditional Arabic"/>
+                <w:sz w:val="32"/>
+                <w:szCs w:val="32"/>
+                <w:rtl/>
+              </w:rPr>
             </w:pPr>
             <w:r>
               <w:rPr>
@@ -1419,161 +2712,7 @@
                 <w:szCs w:val="32"/>
                 <w:rtl/>
               </w:rPr>
-              <w:t>1</w:t>
-            </w:r>
-          </w:p>
-        </w:tc>
-        <w:tc>
-          <w:tcPr>
-            <w:tcW w:w="223" w:type="dxa"/>
-          </w:tcPr>
-          <w:p>
-            <w:pPr>
-              <w:bidi/>
-              <w:rPr>
-                <w:rFonts w:ascii="Traditional Arabic" w:hAnsi="Traditional Arabic" w:cs="Traditional Arabic" w:hint="cs"/>
-                <w:sz w:val="32"/>
-                <w:szCs w:val="32"/>
-                <w:rtl/>
-              </w:rPr>
-            </w:pPr>
-            <w:r>
-              <w:rPr>
-                <w:rFonts w:ascii="Traditional Arabic" w:hAnsi="Traditional Arabic" w:cs="Traditional Arabic" w:hint="cs"/>
-                <w:sz w:val="32"/>
-                <w:szCs w:val="32"/>
-                <w:rtl/>
-              </w:rPr>
-              <w:t>.</w:t>
-            </w:r>
-          </w:p>
-        </w:tc>
-        <w:tc>
-          <w:tcPr>
-            <w:tcW w:w="8212" w:type="dxa"/>
-            <w:gridSpan w:val="2"/>
-            <w:tcBorders>
-              <w:top w:val="single" w:sz="4" w:space="0" w:color="000000"/>
-            </w:tcBorders>
-          </w:tcPr>
-          <w:p>
-            <w:pPr>
-              <w:bidi/>
-              <w:rPr>
-                <w:rFonts w:ascii="Traditional Arabic" w:hAnsi="Traditional Arabic" w:cs="Traditional Arabic" w:hint="cs"/>
-                <w:sz w:val="32"/>
-                <w:szCs w:val="32"/>
-                <w:rtl/>
-              </w:rPr>
-            </w:pPr>
-            <w:r>
-              <w:rPr>
-                <w:rFonts w:ascii="Traditional Arabic" w:hAnsi="Traditional Arabic" w:cs="Traditional Arabic" w:hint="cs"/>
-                <w:sz w:val="32"/>
-                <w:szCs w:val="32"/>
-                <w:rtl/>
-              </w:rPr>
               <w:t>السؤال الأول</w:t>
-            </w:r>
-          </w:p>
-        </w:tc>
-      </w:tr>
-      <w:tr>
-        <w:trPr>
-          <w:gridAfter w:val="1"/>
-          <w:wAfter w:w="6" w:type="dxa"/>
-        </w:trPr>
-        <w:tc>
-          <w:tcPr>
-            <w:tcW w:w="465" w:type="dxa"/>
-            <w:gridSpan w:val="2"/>
-          </w:tcPr>
-          <w:p>
-            <w:pPr>
-              <w:bidi/>
-              <w:rPr>
-                <w:rFonts w:ascii="Traditional Arabic" w:hAnsi="Traditional Arabic" w:cs="Traditional Arabic" w:hint="cs"/>
-                <w:sz w:val="32"/>
-                <w:szCs w:val="32"/>
-                <w:rtl/>
-              </w:rPr>
-            </w:pPr>
-          </w:p>
-        </w:tc>
-        <w:tc>
-          <w:tcPr>
-            <w:tcW w:w="348" w:type="dxa"/>
-            <w:vAlign w:val="center"/>
-          </w:tcPr>
-          <w:p>
-            <w:pPr>
-              <w:bidi/>
-              <w:jc w:val="right"/>
-              <w:rPr>
-                <w:rFonts w:ascii="Traditional Arabic" w:hAnsi="Traditional Arabic" w:cs="Traditional Arabic" w:hint="cs"/>
-                <w:sz w:val="32"/>
-                <w:szCs w:val="32"/>
-                <w:rtl/>
-              </w:rPr>
-            </w:pPr>
-            <w:r>
-              <w:rPr>
-                <w:rFonts w:ascii="Traditional Arabic" w:hAnsi="Traditional Arabic" w:cs="Traditional Arabic" w:hint="cs"/>
-                <w:sz w:val="32"/>
-                <w:szCs w:val="32"/>
-                <w:rtl/>
-              </w:rPr>
-              <w:t>2</w:t>
-            </w:r>
-          </w:p>
-        </w:tc>
-        <w:tc>
-          <w:tcPr>
-            <w:tcW w:w="223" w:type="dxa"/>
-          </w:tcPr>
-          <w:p>
-            <w:pPr>
-              <w:bidi/>
-              <w:rPr>
-                <w:rFonts w:ascii="Traditional Arabic" w:hAnsi="Traditional Arabic" w:cs="Traditional Arabic" w:hint="cs"/>
-                <w:sz w:val="32"/>
-                <w:szCs w:val="32"/>
-                <w:rtl/>
-              </w:rPr>
-            </w:pPr>
-            <w:r>
-              <w:rPr>
-                <w:rFonts w:ascii="Traditional Arabic" w:hAnsi="Traditional Arabic" w:cs="Traditional Arabic" w:hint="cs"/>
-                <w:sz w:val="32"/>
-                <w:szCs w:val="32"/>
-                <w:rtl/>
-              </w:rPr>
-              <w:t>.</w:t>
-            </w:r>
-          </w:p>
-        </w:tc>
-        <w:tc>
-          <w:tcPr>
-            <w:tcW w:w="8212" w:type="dxa"/>
-            <w:gridSpan w:val="2"/>
-          </w:tcPr>
-          <w:p>
-            <w:pPr>
-              <w:bidi/>
-              <w:rPr>
-                <w:rFonts w:ascii="Traditional Arabic" w:hAnsi="Traditional Arabic" w:cs="Traditional Arabic" w:hint="cs"/>
-                <w:sz w:val="32"/>
-                <w:szCs w:val="32"/>
-              </w:rPr>
-            </w:pPr>
-            <w:r>
-              <w:rPr>
-                <w:rFonts w:ascii="Traditional Arabic" w:hAnsi="Traditional Arabic" w:cs="Traditional Arabic" w:hint="cs"/>
-                <w:sz w:val="32"/>
-                <w:szCs w:val="32"/>
-                <w:rtl/>
-              </w:rPr>
-              <w:t>السؤال الثاني</w:t>
             </w:r>
           </w:p>
         </w:tc>
@@ -1583,7 +2722,7 @@
       <w:pPr>
         <w:bidi/>
         <w:rPr>
-          <w:rFonts w:ascii="Traditional Arabic" w:hAnsi="Traditional Arabic" w:cs="Traditional Arabic" w:hint="cs"/>
+          <w:rFonts w:ascii="Traditional Arabic" w:hAnsi="Traditional Arabic" w:cs="Traditional Arabic"/>
           <w:sz w:val="36"/>
           <w:szCs w:val="36"/>
           <w:rtl/>
@@ -1593,7 +2732,7 @@
     <w:sectPr>
       <w:headerReference w:type="default" r:id="rId7"/>
       <w:pgSz w:w="11906" w:h="18709" w:code="10000"/>
-      <w:pgMar w:top="2410" w:right="1440" w:bottom="1276" w:left="1440" w:header="720" w:footer="720" w:gutter="0"/>
+      <w:pgMar w:top="2410" w:right="991" w:bottom="1276" w:left="1134" w:header="720" w:footer="720" w:gutter="0"/>
       <w:cols w:space="720"/>
       <w:docGrid w:linePitch="360"/>
     </w:sectPr>
@@ -1674,7 +2813,7 @@
           <wp:extent cx="7619267" cy="6607628"/>
           <wp:effectExtent l="0" t="0" r="1270" b="3175"/>
           <wp:wrapNone/>
-          <wp:docPr id="1004427430" name="Picture 1"/>
+          <wp:docPr id="491377679" name="Picture 1"/>
           <wp:cNvGraphicFramePr>
             <a:graphicFrameLocks xmlns:a="http://schemas.openxmlformats.org/drawingml/2006/main" noChangeAspect="1"/>
           </wp:cNvGraphicFramePr>

</xml_diff>

<commit_message>
Update exam templates and delegated attendance flow
</commit_message>
<xml_diff>
--- a/ExamAR.docx
+++ b/ExamAR.docx
@@ -2714,6 +2714,1993 @@
               </w:rPr>
               <w:t>السؤال الأول</w:t>
             </w:r>
+          </w:p>
+        </w:tc>
+      </w:tr>
+    </w:tbl>
+    <w:p>
+      <w:pPr>
+        <w:bidi/>
+        <w:rPr>
+          <w:rFonts w:ascii="Traditional Arabic" w:hAnsi="Traditional Arabic" w:cs="Traditional Arabic"/>
+          <w:sz w:val="36"/>
+          <w:szCs w:val="36"/>
+        </w:rPr>
+      </w:pPr>
+    </w:p>
+    <w:tbl>
+      <w:tblPr>
+        <w:tblStyle w:val="TableGrid"/>
+        <w:bidiVisual/>
+        <w:tblW w:w="9830" w:type="dxa"/>
+        <w:tblBorders>
+          <w:top w:val="none" w:sz="0" w:space="0" w:color="auto"/>
+          <w:left w:val="none" w:sz="0" w:space="0" w:color="auto"/>
+          <w:bottom w:val="none" w:sz="0" w:space="0" w:color="auto"/>
+          <w:right w:val="none" w:sz="0" w:space="0" w:color="auto"/>
+          <w:insideH w:val="none" w:sz="0" w:space="0" w:color="auto"/>
+          <w:insideV w:val="none" w:sz="0" w:space="0" w:color="auto"/>
+        </w:tblBorders>
+        <w:tblCellMar>
+          <w:left w:w="0" w:type="dxa"/>
+          <w:right w:w="0" w:type="dxa"/>
+        </w:tblCellMar>
+        <w:tblLook w:val="04A0" w:firstRow="1" w:lastRow="0" w:firstColumn="1" w:lastColumn="0" w:noHBand="0" w:noVBand="1"/>
+      </w:tblPr>
+      <w:tblGrid>
+        <w:gridCol w:w="236"/>
+        <w:gridCol w:w="231"/>
+        <w:gridCol w:w="360"/>
+        <w:gridCol w:w="231"/>
+        <w:gridCol w:w="253"/>
+        <w:gridCol w:w="237"/>
+        <w:gridCol w:w="1717"/>
+        <w:gridCol w:w="284"/>
+        <w:gridCol w:w="266"/>
+        <w:gridCol w:w="6015"/>
+      </w:tblGrid>
+      <w:tr>
+        <w:tc>
+          <w:tcPr>
+            <w:tcW w:w="236" w:type="dxa"/>
+          </w:tcPr>
+          <w:p>
+            <w:pPr>
+              <w:bidi/>
+              <w:jc w:val="right"/>
+              <w:rPr>
+                <w:rFonts w:ascii="Traditional Arabic" w:hAnsi="Traditional Arabic" w:cs="Traditional Arabic"/>
+                <w:b/>
+                <w:bCs/>
+                <w:sz w:val="32"/>
+                <w:szCs w:val="32"/>
+                <w:rtl/>
+              </w:rPr>
+            </w:pPr>
+            <w:r>
+              <w:rPr>
+                <w:rFonts w:ascii="Traditional Arabic" w:hAnsi="Traditional Arabic" w:cs="Traditional Arabic" w:hint="cs"/>
+                <w:b/>
+                <w:bCs/>
+                <w:sz w:val="32"/>
+                <w:szCs w:val="32"/>
+                <w:rtl/>
+              </w:rPr>
+              <w:lastRenderedPageBreak/>
+              <w:t>ح</w:t>
+            </w:r>
+          </w:p>
+        </w:tc>
+        <w:tc>
+          <w:tcPr>
+            <w:tcW w:w="231" w:type="dxa"/>
+          </w:tcPr>
+          <w:p>
+            <w:pPr>
+              <w:bidi/>
+              <w:rPr>
+                <w:rFonts w:ascii="Traditional Arabic" w:hAnsi="Traditional Arabic" w:cs="Traditional Arabic"/>
+                <w:b/>
+                <w:bCs/>
+                <w:sz w:val="32"/>
+                <w:szCs w:val="32"/>
+                <w:rtl/>
+              </w:rPr>
+            </w:pPr>
+            <w:r>
+              <w:rPr>
+                <w:rFonts w:ascii="Traditional Arabic" w:hAnsi="Traditional Arabic" w:cs="Traditional Arabic" w:hint="cs"/>
+                <w:b/>
+                <w:bCs/>
+                <w:sz w:val="32"/>
+                <w:szCs w:val="32"/>
+                <w:rtl/>
+              </w:rPr>
+              <w:t>.</w:t>
+            </w:r>
+          </w:p>
+        </w:tc>
+        <w:tc>
+          <w:tcPr>
+            <w:tcW w:w="9363" w:type="dxa"/>
+            <w:gridSpan w:val="8"/>
+          </w:tcPr>
+          <w:p>
+            <w:pPr>
+              <w:bidi/>
+              <w:ind w:left="8"/>
+              <w:rPr>
+                <w:rFonts w:ascii="Traditional Arabic" w:hAnsi="Traditional Arabic" w:cs="Traditional Arabic"/>
+                <w:b/>
+                <w:bCs/>
+                <w:sz w:val="32"/>
+                <w:szCs w:val="32"/>
+                <w:rtl/>
+              </w:rPr>
+            </w:pPr>
+            <w:r>
+              <w:rPr>
+                <w:rFonts w:ascii="Traditional Arabic" w:hAnsi="Traditional Arabic" w:cs="Traditional Arabic" w:hint="cs"/>
+                <w:b/>
+                <w:bCs/>
+                <w:sz w:val="32"/>
+                <w:szCs w:val="32"/>
+                <w:rtl/>
+              </w:rPr>
+              <w:t>الصحيح أو الخطأ</w:t>
+            </w:r>
+          </w:p>
+        </w:tc>
+      </w:tr>
+      <w:tr>
+        <w:tc>
+          <w:tcPr>
+            <w:tcW w:w="467" w:type="dxa"/>
+            <w:gridSpan w:val="2"/>
+            <w:vAlign w:val="center"/>
+          </w:tcPr>
+          <w:p>
+            <w:pPr>
+              <w:bidi/>
+              <w:rPr>
+                <w:rFonts w:ascii="Traditional Arabic" w:hAnsi="Traditional Arabic" w:cs="Traditional Arabic"/>
+                <w:b/>
+                <w:bCs/>
+                <w:sz w:val="32"/>
+                <w:szCs w:val="32"/>
+                <w:rtl/>
+              </w:rPr>
+            </w:pPr>
+          </w:p>
+        </w:tc>
+        <w:tc>
+          <w:tcPr>
+            <w:tcW w:w="9363" w:type="dxa"/>
+            <w:gridSpan w:val="8"/>
+          </w:tcPr>
+          <w:p>
+            <w:pPr>
+              <w:bidi/>
+              <w:ind w:left="8"/>
+              <w:rPr>
+                <w:rFonts w:ascii="Traditional Arabic" w:hAnsi="Traditional Arabic" w:cs="Traditional Arabic"/>
+                <w:sz w:val="32"/>
+                <w:szCs w:val="32"/>
+                <w:rtl/>
+              </w:rPr>
+            </w:pPr>
+            <w:r>
+              <w:rPr>
+                <w:rFonts w:ascii="Traditional Arabic" w:hAnsi="Traditional Arabic" w:cs="Traditional Arabic" w:hint="cs"/>
+                <w:sz w:val="32"/>
+                <w:szCs w:val="32"/>
+                <w:rtl/>
+              </w:rPr>
+              <w:t>معلومات</w:t>
+            </w:r>
+          </w:p>
+        </w:tc>
+      </w:tr>
+      <w:tr>
+        <w:tc>
+          <w:tcPr>
+            <w:tcW w:w="467" w:type="dxa"/>
+            <w:gridSpan w:val="2"/>
+          </w:tcPr>
+          <w:p>
+            <w:pPr>
+              <w:bidi/>
+              <w:rPr>
+                <w:rFonts w:ascii="Traditional Arabic" w:hAnsi="Traditional Arabic" w:cs="Traditional Arabic"/>
+                <w:sz w:val="32"/>
+                <w:szCs w:val="32"/>
+                <w:rtl/>
+              </w:rPr>
+            </w:pPr>
+          </w:p>
+        </w:tc>
+        <w:tc>
+          <w:tcPr>
+            <w:tcW w:w="360" w:type="dxa"/>
+          </w:tcPr>
+          <w:p>
+            <w:pPr>
+              <w:bidi/>
+              <w:jc w:val="right"/>
+              <w:rPr>
+                <w:rFonts w:ascii="Traditional Arabic" w:hAnsi="Traditional Arabic" w:cs="Traditional Arabic"/>
+                <w:sz w:val="32"/>
+                <w:szCs w:val="32"/>
+                <w:rtl/>
+              </w:rPr>
+            </w:pPr>
+            <w:r>
+              <w:rPr>
+                <w:rFonts w:ascii="Traditional Arabic" w:hAnsi="Traditional Arabic" w:cs="Traditional Arabic" w:hint="cs"/>
+                <w:sz w:val="32"/>
+                <w:szCs w:val="32"/>
+                <w:rtl/>
+              </w:rPr>
+              <w:t>1</w:t>
+            </w:r>
+          </w:p>
+        </w:tc>
+        <w:tc>
+          <w:tcPr>
+            <w:tcW w:w="231" w:type="dxa"/>
+          </w:tcPr>
+          <w:p>
+            <w:pPr>
+              <w:bidi/>
+              <w:rPr>
+                <w:rFonts w:ascii="Traditional Arabic" w:hAnsi="Traditional Arabic" w:cs="Traditional Arabic"/>
+                <w:sz w:val="32"/>
+                <w:szCs w:val="32"/>
+                <w:rtl/>
+              </w:rPr>
+            </w:pPr>
+            <w:r>
+              <w:rPr>
+                <w:rFonts w:ascii="Traditional Arabic" w:hAnsi="Traditional Arabic" w:cs="Traditional Arabic" w:hint="cs"/>
+                <w:sz w:val="32"/>
+                <w:szCs w:val="32"/>
+                <w:rtl/>
+              </w:rPr>
+              <w:t>.</w:t>
+            </w:r>
+          </w:p>
+        </w:tc>
+        <w:tc>
+          <w:tcPr>
+            <w:tcW w:w="8772" w:type="dxa"/>
+            <w:gridSpan w:val="6"/>
+          </w:tcPr>
+          <w:p>
+            <w:pPr>
+              <w:bidi/>
+              <w:rPr>
+                <w:rFonts w:ascii="Traditional Arabic" w:hAnsi="Traditional Arabic" w:cs="Traditional Arabic"/>
+                <w:sz w:val="32"/>
+                <w:szCs w:val="32"/>
+                <w:rtl/>
+              </w:rPr>
+            </w:pPr>
+            <w:r>
+              <w:rPr>
+                <w:rFonts w:ascii="Traditional Arabic" w:hAnsi="Traditional Arabic" w:cs="Traditional Arabic" w:hint="cs"/>
+                <w:sz w:val="32"/>
+                <w:szCs w:val="32"/>
+                <w:rtl/>
+              </w:rPr>
+              <w:t>السؤال الأول</w:t>
+            </w:r>
+          </w:p>
+        </w:tc>
+      </w:tr>
+      <w:tr>
+        <w:tc>
+          <w:tcPr>
+            <w:tcW w:w="1058" w:type="dxa"/>
+            <w:gridSpan w:val="4"/>
+          </w:tcPr>
+          <w:p>
+            <w:pPr>
+              <w:bidi/>
+              <w:rPr>
+                <w:rFonts w:ascii="Traditional Arabic" w:hAnsi="Traditional Arabic" w:cs="Traditional Arabic"/>
+                <w:sz w:val="32"/>
+                <w:szCs w:val="32"/>
+                <w:rtl/>
+              </w:rPr>
+            </w:pPr>
+          </w:p>
+        </w:tc>
+        <w:tc>
+          <w:tcPr>
+            <w:tcW w:w="253" w:type="dxa"/>
+          </w:tcPr>
+          <w:p>
+            <w:pPr>
+              <w:bidi/>
+              <w:jc w:val="right"/>
+              <w:rPr>
+                <w:rFonts w:ascii="Traditional Arabic" w:hAnsi="Traditional Arabic" w:cs="Traditional Arabic"/>
+                <w:sz w:val="32"/>
+                <w:szCs w:val="32"/>
+                <w:rtl/>
+              </w:rPr>
+            </w:pPr>
+            <w:r>
+              <w:rPr>
+                <w:rFonts w:ascii="Traditional Arabic" w:hAnsi="Traditional Arabic" w:cs="Traditional Arabic" w:hint="cs"/>
+                <w:sz w:val="32"/>
+                <w:szCs w:val="32"/>
+                <w:rtl/>
+              </w:rPr>
+              <w:t>أ</w:t>
+            </w:r>
+          </w:p>
+        </w:tc>
+        <w:tc>
+          <w:tcPr>
+            <w:tcW w:w="237" w:type="dxa"/>
+          </w:tcPr>
+          <w:p>
+            <w:pPr>
+              <w:bidi/>
+              <w:rPr>
+                <w:rFonts w:ascii="Traditional Arabic" w:hAnsi="Traditional Arabic" w:cs="Traditional Arabic"/>
+                <w:sz w:val="32"/>
+                <w:szCs w:val="32"/>
+                <w:rtl/>
+              </w:rPr>
+            </w:pPr>
+            <w:r>
+              <w:rPr>
+                <w:rFonts w:ascii="Traditional Arabic" w:hAnsi="Traditional Arabic" w:cs="Traditional Arabic" w:hint="cs"/>
+                <w:sz w:val="32"/>
+                <w:szCs w:val="32"/>
+                <w:rtl/>
+              </w:rPr>
+              <w:t>.</w:t>
+            </w:r>
+          </w:p>
+        </w:tc>
+        <w:tc>
+          <w:tcPr>
+            <w:tcW w:w="1717" w:type="dxa"/>
+          </w:tcPr>
+          <w:p>
+            <w:pPr>
+              <w:bidi/>
+              <w:rPr>
+                <w:rFonts w:ascii="Traditional Arabic" w:hAnsi="Traditional Arabic" w:cs="Traditional Arabic"/>
+                <w:sz w:val="32"/>
+                <w:szCs w:val="32"/>
+                <w:rtl/>
+              </w:rPr>
+            </w:pPr>
+            <w:r>
+              <w:rPr>
+                <w:rFonts w:ascii="Traditional Arabic" w:hAnsi="Traditional Arabic" w:cs="Traditional Arabic" w:hint="cs"/>
+                <w:sz w:val="32"/>
+                <w:szCs w:val="32"/>
+                <w:rtl/>
+              </w:rPr>
+              <w:t>الصحيح</w:t>
+            </w:r>
+          </w:p>
+        </w:tc>
+        <w:tc>
+          <w:tcPr>
+            <w:tcW w:w="284" w:type="dxa"/>
+          </w:tcPr>
+          <w:p>
+            <w:pPr>
+              <w:bidi/>
+              <w:jc w:val="right"/>
+              <w:rPr>
+                <w:rFonts w:ascii="Traditional Arabic" w:hAnsi="Traditional Arabic" w:cs="Traditional Arabic"/>
+                <w:sz w:val="32"/>
+                <w:szCs w:val="32"/>
+                <w:rtl/>
+              </w:rPr>
+            </w:pPr>
+            <w:r>
+              <w:rPr>
+                <w:rFonts w:ascii="Traditional Arabic" w:hAnsi="Traditional Arabic" w:cs="Traditional Arabic" w:hint="cs"/>
+                <w:sz w:val="32"/>
+                <w:szCs w:val="32"/>
+                <w:rtl/>
+              </w:rPr>
+              <w:t>ب</w:t>
+            </w:r>
+          </w:p>
+        </w:tc>
+        <w:tc>
+          <w:tcPr>
+            <w:tcW w:w="266" w:type="dxa"/>
+          </w:tcPr>
+          <w:p>
+            <w:pPr>
+              <w:bidi/>
+              <w:rPr>
+                <w:rFonts w:ascii="Traditional Arabic" w:hAnsi="Traditional Arabic" w:cs="Traditional Arabic"/>
+                <w:sz w:val="32"/>
+                <w:szCs w:val="32"/>
+                <w:rtl/>
+              </w:rPr>
+            </w:pPr>
+            <w:r>
+              <w:rPr>
+                <w:rFonts w:ascii="Traditional Arabic" w:hAnsi="Traditional Arabic" w:cs="Traditional Arabic" w:hint="cs"/>
+                <w:sz w:val="32"/>
+                <w:szCs w:val="32"/>
+                <w:rtl/>
+              </w:rPr>
+              <w:t>.</w:t>
+            </w:r>
+          </w:p>
+        </w:tc>
+        <w:tc>
+          <w:tcPr>
+            <w:tcW w:w="6015" w:type="dxa"/>
+          </w:tcPr>
+          <w:p>
+            <w:pPr>
+              <w:bidi/>
+              <w:rPr>
+                <w:rFonts w:ascii="Traditional Arabic" w:hAnsi="Traditional Arabic" w:cs="Traditional Arabic"/>
+                <w:sz w:val="32"/>
+                <w:szCs w:val="32"/>
+                <w:rtl/>
+              </w:rPr>
+            </w:pPr>
+            <w:r>
+              <w:rPr>
+                <w:rFonts w:ascii="Traditional Arabic" w:hAnsi="Traditional Arabic" w:cs="Traditional Arabic" w:hint="cs"/>
+                <w:sz w:val="32"/>
+                <w:szCs w:val="32"/>
+                <w:rtl/>
+              </w:rPr>
+              <w:t>الخطأ</w:t>
+            </w:r>
+          </w:p>
+        </w:tc>
+      </w:tr>
+    </w:tbl>
+    <w:p>
+      <w:pPr>
+        <w:bidi/>
+        <w:rPr>
+          <w:rFonts w:ascii="Traditional Arabic" w:hAnsi="Traditional Arabic" w:cs="Traditional Arabic"/>
+          <w:sz w:val="36"/>
+          <w:szCs w:val="36"/>
+        </w:rPr>
+      </w:pPr>
+    </w:p>
+    <w:tbl>
+      <w:tblPr>
+        <w:tblStyle w:val="TableGrid"/>
+        <w:bidiVisual/>
+        <w:tblW w:w="9830" w:type="dxa"/>
+        <w:tblBorders>
+          <w:top w:val="none" w:sz="0" w:space="0" w:color="auto"/>
+          <w:left w:val="none" w:sz="0" w:space="0" w:color="auto"/>
+          <w:bottom w:val="none" w:sz="0" w:space="0" w:color="auto"/>
+          <w:right w:val="none" w:sz="0" w:space="0" w:color="auto"/>
+          <w:insideH w:val="none" w:sz="0" w:space="0" w:color="auto"/>
+          <w:insideV w:val="none" w:sz="0" w:space="0" w:color="auto"/>
+        </w:tblBorders>
+        <w:tblCellMar>
+          <w:left w:w="0" w:type="dxa"/>
+          <w:right w:w="0" w:type="dxa"/>
+        </w:tblCellMar>
+        <w:tblLook w:val="04A0" w:firstRow="1" w:lastRow="0" w:firstColumn="1" w:lastColumn="0" w:noHBand="0" w:noVBand="1"/>
+      </w:tblPr>
+      <w:tblGrid>
+        <w:gridCol w:w="236"/>
+        <w:gridCol w:w="231"/>
+        <w:gridCol w:w="360"/>
+        <w:gridCol w:w="231"/>
+        <w:gridCol w:w="438"/>
+        <w:gridCol w:w="439"/>
+        <w:gridCol w:w="438"/>
+        <w:gridCol w:w="439"/>
+        <w:gridCol w:w="439"/>
+        <w:gridCol w:w="438"/>
+        <w:gridCol w:w="439"/>
+        <w:gridCol w:w="438"/>
+        <w:gridCol w:w="439"/>
+        <w:gridCol w:w="439"/>
+        <w:gridCol w:w="438"/>
+        <w:gridCol w:w="439"/>
+        <w:gridCol w:w="438"/>
+        <w:gridCol w:w="439"/>
+        <w:gridCol w:w="439"/>
+        <w:gridCol w:w="438"/>
+        <w:gridCol w:w="439"/>
+        <w:gridCol w:w="438"/>
+        <w:gridCol w:w="439"/>
+        <w:gridCol w:w="439"/>
+      </w:tblGrid>
+      <w:tr>
+        <w:tc>
+          <w:tcPr>
+            <w:tcW w:w="236" w:type="dxa"/>
+          </w:tcPr>
+          <w:p>
+            <w:pPr>
+              <w:bidi/>
+              <w:jc w:val="right"/>
+              <w:rPr>
+                <w:rFonts w:ascii="Traditional Arabic" w:hAnsi="Traditional Arabic" w:cs="Traditional Arabic"/>
+                <w:b/>
+                <w:bCs/>
+                <w:sz w:val="32"/>
+                <w:szCs w:val="32"/>
+                <w:rtl/>
+              </w:rPr>
+            </w:pPr>
+            <w:r>
+              <w:rPr>
+                <w:rFonts w:ascii="Traditional Arabic" w:hAnsi="Traditional Arabic" w:cs="Traditional Arabic" w:hint="cs"/>
+                <w:b/>
+                <w:bCs/>
+                <w:sz w:val="32"/>
+                <w:szCs w:val="32"/>
+                <w:rtl/>
+              </w:rPr>
+              <w:t>ح</w:t>
+            </w:r>
+          </w:p>
+        </w:tc>
+        <w:tc>
+          <w:tcPr>
+            <w:tcW w:w="231" w:type="dxa"/>
+          </w:tcPr>
+          <w:p>
+            <w:pPr>
+              <w:bidi/>
+              <w:rPr>
+                <w:rFonts w:ascii="Traditional Arabic" w:hAnsi="Traditional Arabic" w:cs="Traditional Arabic"/>
+                <w:b/>
+                <w:bCs/>
+                <w:sz w:val="32"/>
+                <w:szCs w:val="32"/>
+                <w:rtl/>
+              </w:rPr>
+            </w:pPr>
+            <w:r>
+              <w:rPr>
+                <w:rFonts w:ascii="Traditional Arabic" w:hAnsi="Traditional Arabic" w:cs="Traditional Arabic" w:hint="cs"/>
+                <w:b/>
+                <w:bCs/>
+                <w:sz w:val="32"/>
+                <w:szCs w:val="32"/>
+                <w:rtl/>
+              </w:rPr>
+              <w:t>.</w:t>
+            </w:r>
+          </w:p>
+        </w:tc>
+        <w:tc>
+          <w:tcPr>
+            <w:tcW w:w="9363" w:type="dxa"/>
+            <w:gridSpan w:val="22"/>
+          </w:tcPr>
+          <w:p>
+            <w:pPr>
+              <w:bidi/>
+              <w:ind w:left="8"/>
+              <w:rPr>
+                <w:rFonts w:ascii="Traditional Arabic" w:hAnsi="Traditional Arabic" w:cs="Traditional Arabic"/>
+                <w:b/>
+                <w:bCs/>
+                <w:sz w:val="32"/>
+                <w:szCs w:val="32"/>
+                <w:rtl/>
+              </w:rPr>
+            </w:pPr>
+            <w:r>
+              <w:rPr>
+                <w:rFonts w:ascii="Traditional Arabic" w:hAnsi="Traditional Arabic" w:cs="Traditional Arabic" w:hint="cs"/>
+                <w:b/>
+                <w:bCs/>
+                <w:sz w:val="32"/>
+                <w:szCs w:val="32"/>
+                <w:rtl/>
+              </w:rPr>
+              <w:t>الصحيح أو الخطأ</w:t>
+            </w:r>
+          </w:p>
+        </w:tc>
+      </w:tr>
+      <w:tr>
+        <w:tc>
+          <w:tcPr>
+            <w:tcW w:w="467" w:type="dxa"/>
+            <w:gridSpan w:val="2"/>
+            <w:vAlign w:val="center"/>
+          </w:tcPr>
+          <w:p>
+            <w:pPr>
+              <w:bidi/>
+              <w:rPr>
+                <w:rFonts w:ascii="Traditional Arabic" w:hAnsi="Traditional Arabic" w:cs="Traditional Arabic"/>
+                <w:b/>
+                <w:bCs/>
+                <w:sz w:val="32"/>
+                <w:szCs w:val="32"/>
+                <w:rtl/>
+              </w:rPr>
+            </w:pPr>
+          </w:p>
+        </w:tc>
+        <w:tc>
+          <w:tcPr>
+            <w:tcW w:w="9363" w:type="dxa"/>
+            <w:gridSpan w:val="22"/>
+          </w:tcPr>
+          <w:p>
+            <w:pPr>
+              <w:bidi/>
+              <w:ind w:left="8"/>
+              <w:rPr>
+                <w:rFonts w:ascii="Traditional Arabic" w:hAnsi="Traditional Arabic" w:cs="Traditional Arabic"/>
+                <w:sz w:val="32"/>
+                <w:szCs w:val="32"/>
+                <w:rtl/>
+              </w:rPr>
+            </w:pPr>
+            <w:r>
+              <w:rPr>
+                <w:rFonts w:ascii="Traditional Arabic" w:hAnsi="Traditional Arabic" w:cs="Traditional Arabic" w:hint="cs"/>
+                <w:sz w:val="32"/>
+                <w:szCs w:val="32"/>
+                <w:rtl/>
+              </w:rPr>
+              <w:t>معلومات</w:t>
+            </w:r>
+          </w:p>
+        </w:tc>
+      </w:tr>
+      <w:tr>
+        <w:tc>
+          <w:tcPr>
+            <w:tcW w:w="467" w:type="dxa"/>
+            <w:gridSpan w:val="2"/>
+          </w:tcPr>
+          <w:p>
+            <w:pPr>
+              <w:bidi/>
+              <w:rPr>
+                <w:rFonts w:ascii="Traditional Arabic" w:hAnsi="Traditional Arabic" w:cs="Traditional Arabic"/>
+                <w:sz w:val="32"/>
+                <w:szCs w:val="32"/>
+                <w:rtl/>
+              </w:rPr>
+            </w:pPr>
+          </w:p>
+        </w:tc>
+        <w:tc>
+          <w:tcPr>
+            <w:tcW w:w="360" w:type="dxa"/>
+          </w:tcPr>
+          <w:p>
+            <w:pPr>
+              <w:bidi/>
+              <w:jc w:val="right"/>
+              <w:rPr>
+                <w:rFonts w:ascii="Traditional Arabic" w:hAnsi="Traditional Arabic" w:cs="Traditional Arabic"/>
+                <w:sz w:val="32"/>
+                <w:szCs w:val="32"/>
+                <w:rtl/>
+              </w:rPr>
+            </w:pPr>
+            <w:r>
+              <w:rPr>
+                <w:rFonts w:ascii="Traditional Arabic" w:hAnsi="Traditional Arabic" w:cs="Traditional Arabic" w:hint="cs"/>
+                <w:sz w:val="32"/>
+                <w:szCs w:val="32"/>
+                <w:rtl/>
+              </w:rPr>
+              <w:t>1</w:t>
+            </w:r>
+          </w:p>
+        </w:tc>
+        <w:tc>
+          <w:tcPr>
+            <w:tcW w:w="231" w:type="dxa"/>
+          </w:tcPr>
+          <w:p>
+            <w:pPr>
+              <w:bidi/>
+              <w:rPr>
+                <w:rFonts w:ascii="Traditional Arabic" w:hAnsi="Traditional Arabic" w:cs="Traditional Arabic"/>
+                <w:sz w:val="32"/>
+                <w:szCs w:val="32"/>
+                <w:rtl/>
+              </w:rPr>
+            </w:pPr>
+            <w:r>
+              <w:rPr>
+                <w:rFonts w:ascii="Traditional Arabic" w:hAnsi="Traditional Arabic" w:cs="Traditional Arabic" w:hint="cs"/>
+                <w:sz w:val="32"/>
+                <w:szCs w:val="32"/>
+                <w:rtl/>
+              </w:rPr>
+              <w:t>.</w:t>
+            </w:r>
+          </w:p>
+        </w:tc>
+        <w:tc>
+          <w:tcPr>
+            <w:tcW w:w="8772" w:type="dxa"/>
+            <w:gridSpan w:val="20"/>
+          </w:tcPr>
+          <w:p>
+            <w:pPr>
+              <w:bidi/>
+              <w:rPr>
+                <w:rFonts w:ascii="Traditional Arabic" w:hAnsi="Traditional Arabic" w:cs="Traditional Arabic"/>
+                <w:sz w:val="32"/>
+                <w:szCs w:val="32"/>
+                <w:rtl/>
+              </w:rPr>
+            </w:pPr>
+            <w:r>
+              <w:rPr>
+                <w:rFonts w:ascii="Traditional Arabic" w:hAnsi="Traditional Arabic" w:cs="Traditional Arabic" w:hint="cs"/>
+                <w:sz w:val="32"/>
+                <w:szCs w:val="32"/>
+                <w:rtl/>
+              </w:rPr>
+              <w:t>السؤال الأول</w:t>
+            </w:r>
+          </w:p>
+        </w:tc>
+      </w:tr>
+      <w:tr>
+        <w:tc>
+          <w:tcPr>
+            <w:tcW w:w="1058" w:type="dxa"/>
+            <w:gridSpan w:val="4"/>
+          </w:tcPr>
+          <w:p>
+            <w:pPr>
+              <w:bidi/>
+              <w:rPr>
+                <w:rFonts w:ascii="Traditional Arabic" w:hAnsi="Traditional Arabic" w:cs="Traditional Arabic"/>
+                <w:sz w:val="32"/>
+                <w:szCs w:val="32"/>
+                <w:rtl/>
+              </w:rPr>
+            </w:pPr>
+          </w:p>
+        </w:tc>
+        <w:tc>
+          <w:tcPr>
+            <w:tcW w:w="8772" w:type="dxa"/>
+            <w:gridSpan w:val="20"/>
+          </w:tcPr>
+          <w:p>
+            <w:pPr>
+              <w:bidi/>
+              <w:rPr>
+                <w:rFonts w:ascii="Traditional Arabic" w:hAnsi="Traditional Arabic" w:cs="Traditional Arabic"/>
+                <w:sz w:val="32"/>
+                <w:szCs w:val="32"/>
+                <w:rtl/>
+              </w:rPr>
+            </w:pPr>
+            <w:r>
+              <w:rPr>
+                <w:rFonts w:ascii="Traditional Arabic" w:hAnsi="Traditional Arabic" w:cs="Traditional Arabic"/>
+                <w:sz w:val="32"/>
+                <w:szCs w:val="32"/>
+                <w:rtl/>
+              </w:rPr>
+              <w:t>الكلمات المطلوبة</w:t>
+            </w:r>
+          </w:p>
+        </w:tc>
+      </w:tr>
+      <w:tr>
+        <w:tc>
+          <w:tcPr>
+            <w:tcW w:w="9830" w:type="dxa"/>
+            <w:gridSpan w:val="24"/>
+          </w:tcPr>
+          <w:p>
+            <w:pPr>
+              <w:bidi/>
+              <w:rPr>
+                <w:rFonts w:ascii="Traditional Arabic" w:hAnsi="Traditional Arabic" w:cs="Traditional Arabic"/>
+                <w:sz w:val="10"/>
+                <w:szCs w:val="10"/>
+                <w:rtl/>
+              </w:rPr>
+            </w:pPr>
+          </w:p>
+        </w:tc>
+      </w:tr>
+      <w:tr>
+        <w:trPr>
+          <w:trHeight w:val="279"/>
+        </w:trPr>
+        <w:tc>
+          <w:tcPr>
+            <w:tcW w:w="1058" w:type="dxa"/>
+            <w:gridSpan w:val="4"/>
+            <w:tcBorders>
+              <w:right w:val="single" w:sz="4" w:space="0" w:color="auto"/>
+            </w:tcBorders>
+          </w:tcPr>
+          <w:p>
+            <w:pPr>
+              <w:bidi/>
+              <w:rPr>
+                <w:rFonts w:ascii="Traditional Arabic" w:hAnsi="Traditional Arabic" w:cs="Traditional Arabic"/>
+                <w:sz w:val="32"/>
+                <w:szCs w:val="32"/>
+                <w:rtl/>
+              </w:rPr>
+            </w:pPr>
+          </w:p>
+        </w:tc>
+        <w:tc>
+          <w:tcPr>
+            <w:tcW w:w="438" w:type="dxa"/>
+            <w:tcBorders>
+              <w:top w:val="single" w:sz="4" w:space="0" w:color="auto"/>
+              <w:left w:val="single" w:sz="4" w:space="0" w:color="auto"/>
+              <w:bottom w:val="single" w:sz="4" w:space="0" w:color="auto"/>
+              <w:right w:val="single" w:sz="4" w:space="0" w:color="auto"/>
+            </w:tcBorders>
+            <w:vAlign w:val="center"/>
+          </w:tcPr>
+          <w:p>
+            <w:pPr>
+              <w:bidi/>
+              <w:jc w:val="center"/>
+              <w:rPr>
+                <w:rFonts w:ascii="Traditional Arabic" w:hAnsi="Traditional Arabic" w:cs="Traditional Arabic"/>
+                <w:sz w:val="32"/>
+                <w:szCs w:val="32"/>
+                <w:rtl/>
+              </w:rPr>
+            </w:pPr>
+            <w:r>
+              <w:rPr>
+                <w:rFonts w:ascii="Traditional Arabic" w:hAnsi="Traditional Arabic" w:cs="Traditional Arabic" w:hint="cs"/>
+                <w:sz w:val="32"/>
+                <w:szCs w:val="32"/>
+                <w:rtl/>
+              </w:rPr>
+              <w:t>أ</w:t>
+            </w:r>
+          </w:p>
+        </w:tc>
+        <w:tc>
+          <w:tcPr>
+            <w:tcW w:w="439" w:type="dxa"/>
+            <w:tcBorders>
+              <w:top w:val="single" w:sz="4" w:space="0" w:color="auto"/>
+              <w:left w:val="single" w:sz="4" w:space="0" w:color="auto"/>
+              <w:bottom w:val="single" w:sz="4" w:space="0" w:color="auto"/>
+              <w:right w:val="single" w:sz="4" w:space="0" w:color="auto"/>
+            </w:tcBorders>
+            <w:vAlign w:val="center"/>
+          </w:tcPr>
+          <w:p>
+            <w:pPr>
+              <w:bidi/>
+              <w:jc w:val="center"/>
+              <w:rPr>
+                <w:rFonts w:ascii="Traditional Arabic" w:hAnsi="Traditional Arabic" w:cs="Traditional Arabic"/>
+                <w:sz w:val="32"/>
+                <w:szCs w:val="32"/>
+                <w:rtl/>
+              </w:rPr>
+            </w:pPr>
+            <w:r>
+              <w:rPr>
+                <w:rFonts w:ascii="Traditional Arabic" w:hAnsi="Traditional Arabic" w:cs="Traditional Arabic" w:hint="cs"/>
+                <w:sz w:val="32"/>
+                <w:szCs w:val="32"/>
+                <w:rtl/>
+              </w:rPr>
+              <w:t>ب</w:t>
+            </w:r>
+          </w:p>
+        </w:tc>
+        <w:tc>
+          <w:tcPr>
+            <w:tcW w:w="438" w:type="dxa"/>
+            <w:tcBorders>
+              <w:top w:val="single" w:sz="4" w:space="0" w:color="auto"/>
+              <w:left w:val="single" w:sz="4" w:space="0" w:color="auto"/>
+              <w:bottom w:val="single" w:sz="4" w:space="0" w:color="auto"/>
+              <w:right w:val="single" w:sz="4" w:space="0" w:color="auto"/>
+            </w:tcBorders>
+            <w:vAlign w:val="center"/>
+          </w:tcPr>
+          <w:p>
+            <w:pPr>
+              <w:bidi/>
+              <w:jc w:val="center"/>
+              <w:rPr>
+                <w:rFonts w:ascii="Traditional Arabic" w:hAnsi="Traditional Arabic" w:cs="Traditional Arabic"/>
+                <w:sz w:val="32"/>
+                <w:szCs w:val="32"/>
+                <w:rtl/>
+              </w:rPr>
+            </w:pPr>
+            <w:r>
+              <w:rPr>
+                <w:rFonts w:ascii="Traditional Arabic" w:hAnsi="Traditional Arabic" w:cs="Traditional Arabic" w:hint="cs"/>
+                <w:sz w:val="32"/>
+                <w:szCs w:val="32"/>
+                <w:rtl/>
+              </w:rPr>
+              <w:t>ت</w:t>
+            </w:r>
+          </w:p>
+        </w:tc>
+        <w:tc>
+          <w:tcPr>
+            <w:tcW w:w="439" w:type="dxa"/>
+            <w:tcBorders>
+              <w:top w:val="single" w:sz="4" w:space="0" w:color="auto"/>
+              <w:left w:val="single" w:sz="4" w:space="0" w:color="auto"/>
+              <w:bottom w:val="single" w:sz="4" w:space="0" w:color="auto"/>
+              <w:right w:val="single" w:sz="4" w:space="0" w:color="auto"/>
+            </w:tcBorders>
+            <w:vAlign w:val="center"/>
+          </w:tcPr>
+          <w:p>
+            <w:pPr>
+              <w:bidi/>
+              <w:jc w:val="center"/>
+              <w:rPr>
+                <w:rFonts w:ascii="Traditional Arabic" w:hAnsi="Traditional Arabic" w:cs="Traditional Arabic"/>
+                <w:sz w:val="32"/>
+                <w:szCs w:val="32"/>
+                <w:rtl/>
+              </w:rPr>
+            </w:pPr>
+          </w:p>
+        </w:tc>
+        <w:tc>
+          <w:tcPr>
+            <w:tcW w:w="439" w:type="dxa"/>
+            <w:tcBorders>
+              <w:top w:val="single" w:sz="4" w:space="0" w:color="auto"/>
+              <w:left w:val="single" w:sz="4" w:space="0" w:color="auto"/>
+              <w:bottom w:val="single" w:sz="4" w:space="0" w:color="auto"/>
+              <w:right w:val="single" w:sz="4" w:space="0" w:color="auto"/>
+            </w:tcBorders>
+            <w:vAlign w:val="center"/>
+          </w:tcPr>
+          <w:p>
+            <w:pPr>
+              <w:bidi/>
+              <w:jc w:val="center"/>
+              <w:rPr>
+                <w:rFonts w:ascii="Traditional Arabic" w:hAnsi="Traditional Arabic" w:cs="Traditional Arabic"/>
+                <w:sz w:val="32"/>
+                <w:szCs w:val="32"/>
+                <w:rtl/>
+              </w:rPr>
+            </w:pPr>
+          </w:p>
+        </w:tc>
+        <w:tc>
+          <w:tcPr>
+            <w:tcW w:w="438" w:type="dxa"/>
+            <w:tcBorders>
+              <w:top w:val="single" w:sz="4" w:space="0" w:color="auto"/>
+              <w:left w:val="single" w:sz="4" w:space="0" w:color="auto"/>
+              <w:bottom w:val="single" w:sz="4" w:space="0" w:color="auto"/>
+              <w:right w:val="single" w:sz="4" w:space="0" w:color="auto"/>
+            </w:tcBorders>
+            <w:vAlign w:val="center"/>
+          </w:tcPr>
+          <w:p>
+            <w:pPr>
+              <w:bidi/>
+              <w:jc w:val="center"/>
+              <w:rPr>
+                <w:rFonts w:ascii="Traditional Arabic" w:hAnsi="Traditional Arabic" w:cs="Traditional Arabic"/>
+                <w:sz w:val="32"/>
+                <w:szCs w:val="32"/>
+                <w:rtl/>
+              </w:rPr>
+            </w:pPr>
+          </w:p>
+        </w:tc>
+        <w:tc>
+          <w:tcPr>
+            <w:tcW w:w="439" w:type="dxa"/>
+            <w:tcBorders>
+              <w:top w:val="single" w:sz="4" w:space="0" w:color="auto"/>
+              <w:left w:val="single" w:sz="4" w:space="0" w:color="auto"/>
+              <w:bottom w:val="single" w:sz="4" w:space="0" w:color="auto"/>
+              <w:right w:val="single" w:sz="4" w:space="0" w:color="auto"/>
+            </w:tcBorders>
+            <w:vAlign w:val="center"/>
+          </w:tcPr>
+          <w:p>
+            <w:pPr>
+              <w:bidi/>
+              <w:jc w:val="center"/>
+              <w:rPr>
+                <w:rFonts w:ascii="Traditional Arabic" w:hAnsi="Traditional Arabic" w:cs="Traditional Arabic"/>
+                <w:sz w:val="32"/>
+                <w:szCs w:val="32"/>
+                <w:rtl/>
+              </w:rPr>
+            </w:pPr>
+          </w:p>
+        </w:tc>
+        <w:tc>
+          <w:tcPr>
+            <w:tcW w:w="438" w:type="dxa"/>
+            <w:tcBorders>
+              <w:top w:val="single" w:sz="4" w:space="0" w:color="auto"/>
+              <w:left w:val="single" w:sz="4" w:space="0" w:color="auto"/>
+              <w:bottom w:val="single" w:sz="4" w:space="0" w:color="auto"/>
+              <w:right w:val="single" w:sz="4" w:space="0" w:color="auto"/>
+            </w:tcBorders>
+            <w:vAlign w:val="center"/>
+          </w:tcPr>
+          <w:p>
+            <w:pPr>
+              <w:bidi/>
+              <w:jc w:val="center"/>
+              <w:rPr>
+                <w:rFonts w:ascii="Traditional Arabic" w:hAnsi="Traditional Arabic" w:cs="Traditional Arabic"/>
+                <w:sz w:val="32"/>
+                <w:szCs w:val="32"/>
+                <w:rtl/>
+              </w:rPr>
+            </w:pPr>
+          </w:p>
+        </w:tc>
+        <w:tc>
+          <w:tcPr>
+            <w:tcW w:w="439" w:type="dxa"/>
+            <w:tcBorders>
+              <w:top w:val="single" w:sz="4" w:space="0" w:color="auto"/>
+              <w:left w:val="single" w:sz="4" w:space="0" w:color="auto"/>
+              <w:bottom w:val="single" w:sz="4" w:space="0" w:color="auto"/>
+              <w:right w:val="single" w:sz="4" w:space="0" w:color="auto"/>
+            </w:tcBorders>
+            <w:vAlign w:val="center"/>
+          </w:tcPr>
+          <w:p>
+            <w:pPr>
+              <w:bidi/>
+              <w:jc w:val="center"/>
+              <w:rPr>
+                <w:rFonts w:ascii="Traditional Arabic" w:hAnsi="Traditional Arabic" w:cs="Traditional Arabic"/>
+                <w:sz w:val="32"/>
+                <w:szCs w:val="32"/>
+                <w:rtl/>
+              </w:rPr>
+            </w:pPr>
+          </w:p>
+        </w:tc>
+        <w:tc>
+          <w:tcPr>
+            <w:tcW w:w="439" w:type="dxa"/>
+            <w:tcBorders>
+              <w:top w:val="single" w:sz="4" w:space="0" w:color="auto"/>
+              <w:left w:val="single" w:sz="4" w:space="0" w:color="auto"/>
+              <w:bottom w:val="single" w:sz="4" w:space="0" w:color="auto"/>
+              <w:right w:val="single" w:sz="4" w:space="0" w:color="auto"/>
+            </w:tcBorders>
+            <w:vAlign w:val="center"/>
+          </w:tcPr>
+          <w:p>
+            <w:pPr>
+              <w:bidi/>
+              <w:jc w:val="center"/>
+              <w:rPr>
+                <w:rFonts w:ascii="Traditional Arabic" w:hAnsi="Traditional Arabic" w:cs="Traditional Arabic"/>
+                <w:sz w:val="32"/>
+                <w:szCs w:val="32"/>
+                <w:rtl/>
+              </w:rPr>
+            </w:pPr>
+          </w:p>
+        </w:tc>
+        <w:tc>
+          <w:tcPr>
+            <w:tcW w:w="438" w:type="dxa"/>
+            <w:tcBorders>
+              <w:top w:val="single" w:sz="4" w:space="0" w:color="auto"/>
+              <w:left w:val="single" w:sz="4" w:space="0" w:color="auto"/>
+              <w:bottom w:val="single" w:sz="4" w:space="0" w:color="auto"/>
+              <w:right w:val="single" w:sz="4" w:space="0" w:color="auto"/>
+            </w:tcBorders>
+            <w:vAlign w:val="center"/>
+          </w:tcPr>
+          <w:p>
+            <w:pPr>
+              <w:bidi/>
+              <w:jc w:val="center"/>
+              <w:rPr>
+                <w:rFonts w:ascii="Traditional Arabic" w:hAnsi="Traditional Arabic" w:cs="Traditional Arabic"/>
+                <w:sz w:val="32"/>
+                <w:szCs w:val="32"/>
+                <w:rtl/>
+              </w:rPr>
+            </w:pPr>
+          </w:p>
+        </w:tc>
+        <w:tc>
+          <w:tcPr>
+            <w:tcW w:w="439" w:type="dxa"/>
+            <w:tcBorders>
+              <w:top w:val="single" w:sz="4" w:space="0" w:color="auto"/>
+              <w:left w:val="single" w:sz="4" w:space="0" w:color="auto"/>
+              <w:bottom w:val="single" w:sz="4" w:space="0" w:color="auto"/>
+              <w:right w:val="single" w:sz="4" w:space="0" w:color="auto"/>
+            </w:tcBorders>
+            <w:vAlign w:val="center"/>
+          </w:tcPr>
+          <w:p>
+            <w:pPr>
+              <w:bidi/>
+              <w:jc w:val="center"/>
+              <w:rPr>
+                <w:rFonts w:ascii="Traditional Arabic" w:hAnsi="Traditional Arabic" w:cs="Traditional Arabic"/>
+                <w:sz w:val="32"/>
+                <w:szCs w:val="32"/>
+                <w:rtl/>
+              </w:rPr>
+            </w:pPr>
+          </w:p>
+        </w:tc>
+        <w:tc>
+          <w:tcPr>
+            <w:tcW w:w="438" w:type="dxa"/>
+            <w:tcBorders>
+              <w:top w:val="single" w:sz="4" w:space="0" w:color="auto"/>
+              <w:left w:val="single" w:sz="4" w:space="0" w:color="auto"/>
+              <w:bottom w:val="single" w:sz="4" w:space="0" w:color="auto"/>
+              <w:right w:val="single" w:sz="4" w:space="0" w:color="auto"/>
+            </w:tcBorders>
+            <w:vAlign w:val="center"/>
+          </w:tcPr>
+          <w:p>
+            <w:pPr>
+              <w:bidi/>
+              <w:jc w:val="center"/>
+              <w:rPr>
+                <w:rFonts w:ascii="Traditional Arabic" w:hAnsi="Traditional Arabic" w:cs="Traditional Arabic"/>
+                <w:sz w:val="32"/>
+                <w:szCs w:val="32"/>
+                <w:rtl/>
+              </w:rPr>
+            </w:pPr>
+          </w:p>
+        </w:tc>
+        <w:tc>
+          <w:tcPr>
+            <w:tcW w:w="439" w:type="dxa"/>
+            <w:tcBorders>
+              <w:top w:val="single" w:sz="4" w:space="0" w:color="auto"/>
+              <w:left w:val="single" w:sz="4" w:space="0" w:color="auto"/>
+              <w:bottom w:val="single" w:sz="4" w:space="0" w:color="auto"/>
+              <w:right w:val="single" w:sz="4" w:space="0" w:color="auto"/>
+            </w:tcBorders>
+            <w:vAlign w:val="center"/>
+          </w:tcPr>
+          <w:p>
+            <w:pPr>
+              <w:bidi/>
+              <w:jc w:val="center"/>
+              <w:rPr>
+                <w:rFonts w:ascii="Traditional Arabic" w:hAnsi="Traditional Arabic" w:cs="Traditional Arabic"/>
+                <w:sz w:val="32"/>
+                <w:szCs w:val="32"/>
+                <w:rtl/>
+              </w:rPr>
+            </w:pPr>
+          </w:p>
+        </w:tc>
+        <w:tc>
+          <w:tcPr>
+            <w:tcW w:w="439" w:type="dxa"/>
+            <w:tcBorders>
+              <w:top w:val="single" w:sz="4" w:space="0" w:color="auto"/>
+              <w:left w:val="single" w:sz="4" w:space="0" w:color="auto"/>
+              <w:bottom w:val="single" w:sz="4" w:space="0" w:color="auto"/>
+              <w:right w:val="single" w:sz="4" w:space="0" w:color="auto"/>
+            </w:tcBorders>
+            <w:vAlign w:val="center"/>
+          </w:tcPr>
+          <w:p>
+            <w:pPr>
+              <w:bidi/>
+              <w:jc w:val="center"/>
+              <w:rPr>
+                <w:rFonts w:ascii="Traditional Arabic" w:hAnsi="Traditional Arabic" w:cs="Traditional Arabic"/>
+                <w:sz w:val="32"/>
+                <w:szCs w:val="32"/>
+                <w:rtl/>
+              </w:rPr>
+            </w:pPr>
+          </w:p>
+        </w:tc>
+        <w:tc>
+          <w:tcPr>
+            <w:tcW w:w="438" w:type="dxa"/>
+            <w:tcBorders>
+              <w:top w:val="single" w:sz="4" w:space="0" w:color="auto"/>
+              <w:left w:val="single" w:sz="4" w:space="0" w:color="auto"/>
+              <w:bottom w:val="single" w:sz="4" w:space="0" w:color="auto"/>
+              <w:right w:val="single" w:sz="4" w:space="0" w:color="auto"/>
+            </w:tcBorders>
+            <w:vAlign w:val="center"/>
+          </w:tcPr>
+          <w:p>
+            <w:pPr>
+              <w:bidi/>
+              <w:jc w:val="center"/>
+              <w:rPr>
+                <w:rFonts w:ascii="Traditional Arabic" w:hAnsi="Traditional Arabic" w:cs="Traditional Arabic"/>
+                <w:sz w:val="32"/>
+                <w:szCs w:val="32"/>
+                <w:rtl/>
+              </w:rPr>
+            </w:pPr>
+          </w:p>
+        </w:tc>
+        <w:tc>
+          <w:tcPr>
+            <w:tcW w:w="439" w:type="dxa"/>
+            <w:tcBorders>
+              <w:top w:val="single" w:sz="4" w:space="0" w:color="auto"/>
+              <w:left w:val="single" w:sz="4" w:space="0" w:color="auto"/>
+              <w:bottom w:val="single" w:sz="4" w:space="0" w:color="auto"/>
+              <w:right w:val="single" w:sz="4" w:space="0" w:color="auto"/>
+            </w:tcBorders>
+            <w:vAlign w:val="center"/>
+          </w:tcPr>
+          <w:p>
+            <w:pPr>
+              <w:bidi/>
+              <w:jc w:val="center"/>
+              <w:rPr>
+                <w:rFonts w:ascii="Traditional Arabic" w:hAnsi="Traditional Arabic" w:cs="Traditional Arabic"/>
+                <w:sz w:val="32"/>
+                <w:szCs w:val="32"/>
+                <w:rtl/>
+              </w:rPr>
+            </w:pPr>
+          </w:p>
+        </w:tc>
+        <w:tc>
+          <w:tcPr>
+            <w:tcW w:w="438" w:type="dxa"/>
+            <w:tcBorders>
+              <w:top w:val="single" w:sz="4" w:space="0" w:color="auto"/>
+              <w:left w:val="single" w:sz="4" w:space="0" w:color="auto"/>
+              <w:bottom w:val="single" w:sz="4" w:space="0" w:color="auto"/>
+              <w:right w:val="single" w:sz="4" w:space="0" w:color="auto"/>
+            </w:tcBorders>
+            <w:vAlign w:val="center"/>
+          </w:tcPr>
+          <w:p>
+            <w:pPr>
+              <w:bidi/>
+              <w:jc w:val="center"/>
+              <w:rPr>
+                <w:rFonts w:ascii="Traditional Arabic" w:hAnsi="Traditional Arabic" w:cs="Traditional Arabic"/>
+                <w:sz w:val="32"/>
+                <w:szCs w:val="32"/>
+                <w:rtl/>
+              </w:rPr>
+            </w:pPr>
+          </w:p>
+        </w:tc>
+        <w:tc>
+          <w:tcPr>
+            <w:tcW w:w="439" w:type="dxa"/>
+            <w:tcBorders>
+              <w:top w:val="single" w:sz="4" w:space="0" w:color="auto"/>
+              <w:left w:val="single" w:sz="4" w:space="0" w:color="auto"/>
+              <w:bottom w:val="single" w:sz="4" w:space="0" w:color="auto"/>
+              <w:right w:val="single" w:sz="4" w:space="0" w:color="auto"/>
+            </w:tcBorders>
+            <w:vAlign w:val="center"/>
+          </w:tcPr>
+          <w:p>
+            <w:pPr>
+              <w:bidi/>
+              <w:jc w:val="center"/>
+              <w:rPr>
+                <w:rFonts w:ascii="Traditional Arabic" w:hAnsi="Traditional Arabic" w:cs="Traditional Arabic"/>
+                <w:sz w:val="32"/>
+                <w:szCs w:val="32"/>
+                <w:rtl/>
+              </w:rPr>
+            </w:pPr>
+          </w:p>
+        </w:tc>
+        <w:tc>
+          <w:tcPr>
+            <w:tcW w:w="439" w:type="dxa"/>
+            <w:tcBorders>
+              <w:top w:val="single" w:sz="4" w:space="0" w:color="auto"/>
+              <w:left w:val="single" w:sz="4" w:space="0" w:color="auto"/>
+              <w:bottom w:val="single" w:sz="4" w:space="0" w:color="auto"/>
+              <w:right w:val="single" w:sz="4" w:space="0" w:color="auto"/>
+            </w:tcBorders>
+            <w:vAlign w:val="center"/>
+          </w:tcPr>
+          <w:p>
+            <w:pPr>
+              <w:bidi/>
+              <w:jc w:val="center"/>
+              <w:rPr>
+                <w:rFonts w:ascii="Traditional Arabic" w:hAnsi="Traditional Arabic" w:cs="Traditional Arabic"/>
+                <w:sz w:val="32"/>
+                <w:szCs w:val="32"/>
+                <w:rtl/>
+              </w:rPr>
+            </w:pPr>
+          </w:p>
+        </w:tc>
+      </w:tr>
+    </w:tbl>
+    <w:p>
+      <w:pPr>
+        <w:bidi/>
+        <w:rPr>
+          <w:rFonts w:ascii="Traditional Arabic" w:hAnsi="Traditional Arabic" w:cs="Traditional Arabic"/>
+          <w:sz w:val="36"/>
+          <w:szCs w:val="36"/>
+          <w:rtl/>
+        </w:rPr>
+      </w:pPr>
+    </w:p>
+    <w:tbl>
+      <w:tblPr>
+        <w:tblStyle w:val="TableGrid"/>
+        <w:bidiVisual/>
+        <w:tblW w:w="9008" w:type="dxa"/>
+        <w:tblCellMar>
+          <w:left w:w="0" w:type="dxa"/>
+          <w:right w:w="0" w:type="dxa"/>
+        </w:tblCellMar>
+        <w:tblLook w:val="04A0" w:firstRow="1" w:lastRow="0" w:firstColumn="1" w:lastColumn="0" w:noHBand="0" w:noVBand="1"/>
+      </w:tblPr>
+      <w:tblGrid>
+        <w:gridCol w:w="236"/>
+        <w:gridCol w:w="231"/>
+        <w:gridCol w:w="8541"/>
+      </w:tblGrid>
+      <w:tr>
+        <w:tc>
+          <w:tcPr>
+            <w:tcW w:w="236" w:type="dxa"/>
+            <w:tcBorders>
+              <w:top w:val="nil"/>
+              <w:left w:val="nil"/>
+              <w:bottom w:val="nil"/>
+              <w:right w:val="nil"/>
+            </w:tcBorders>
+          </w:tcPr>
+          <w:p>
+            <w:pPr>
+              <w:bidi/>
+              <w:jc w:val="right"/>
+              <w:rPr>
+                <w:rFonts w:ascii="Traditional Arabic" w:hAnsi="Traditional Arabic" w:cs="Traditional Arabic"/>
+                <w:b/>
+                <w:bCs/>
+                <w:sz w:val="32"/>
+                <w:szCs w:val="32"/>
+                <w:rtl/>
+              </w:rPr>
+            </w:pPr>
+            <w:r>
+              <w:rPr>
+                <w:rFonts w:ascii="Traditional Arabic" w:hAnsi="Traditional Arabic" w:cs="Traditional Arabic" w:hint="cs"/>
+                <w:b/>
+                <w:bCs/>
+                <w:sz w:val="32"/>
+                <w:szCs w:val="32"/>
+                <w:rtl/>
+              </w:rPr>
+              <w:t>ح</w:t>
+            </w:r>
+          </w:p>
+        </w:tc>
+        <w:tc>
+          <w:tcPr>
+            <w:tcW w:w="231" w:type="dxa"/>
+            <w:tcBorders>
+              <w:top w:val="nil"/>
+              <w:left w:val="nil"/>
+              <w:bottom w:val="nil"/>
+              <w:right w:val="nil"/>
+            </w:tcBorders>
+          </w:tcPr>
+          <w:p>
+            <w:pPr>
+              <w:bidi/>
+              <w:rPr>
+                <w:rFonts w:ascii="Traditional Arabic" w:hAnsi="Traditional Arabic" w:cs="Traditional Arabic"/>
+                <w:b/>
+                <w:bCs/>
+                <w:sz w:val="32"/>
+                <w:szCs w:val="32"/>
+                <w:rtl/>
+              </w:rPr>
+            </w:pPr>
+            <w:r>
+              <w:rPr>
+                <w:rFonts w:ascii="Traditional Arabic" w:hAnsi="Traditional Arabic" w:cs="Traditional Arabic" w:hint="cs"/>
+                <w:b/>
+                <w:bCs/>
+                <w:sz w:val="32"/>
+                <w:szCs w:val="32"/>
+                <w:rtl/>
+              </w:rPr>
+              <w:t>.</w:t>
+            </w:r>
+          </w:p>
+        </w:tc>
+        <w:tc>
+          <w:tcPr>
+            <w:tcW w:w="8541" w:type="dxa"/>
+            <w:tcBorders>
+              <w:top w:val="nil"/>
+              <w:left w:val="nil"/>
+              <w:bottom w:val="nil"/>
+              <w:right w:val="nil"/>
+            </w:tcBorders>
+          </w:tcPr>
+          <w:p>
+            <w:pPr>
+              <w:bidi/>
+              <w:ind w:left="8"/>
+              <w:rPr>
+                <w:rFonts w:ascii="Traditional Arabic" w:hAnsi="Traditional Arabic" w:cs="Traditional Arabic"/>
+                <w:b/>
+                <w:bCs/>
+                <w:sz w:val="32"/>
+                <w:szCs w:val="32"/>
+                <w:rtl/>
+              </w:rPr>
+            </w:pPr>
+            <w:r>
+              <w:rPr>
+                <w:rFonts w:ascii="Traditional Arabic" w:hAnsi="Traditional Arabic" w:cs="Traditional Arabic" w:hint="cs"/>
+                <w:b/>
+                <w:bCs/>
+                <w:sz w:val="32"/>
+                <w:szCs w:val="32"/>
+                <w:rtl/>
+              </w:rPr>
+              <w:t>الصحيح أو الخطأ</w:t>
+            </w:r>
+          </w:p>
+        </w:tc>
+      </w:tr>
+      <w:tr>
+        <w:tc>
+          <w:tcPr>
+            <w:tcW w:w="467" w:type="dxa"/>
+            <w:gridSpan w:val="2"/>
+            <w:tcBorders>
+              <w:top w:val="nil"/>
+              <w:left w:val="nil"/>
+              <w:bottom w:val="nil"/>
+              <w:right w:val="nil"/>
+            </w:tcBorders>
+            <w:vAlign w:val="center"/>
+          </w:tcPr>
+          <w:p>
+            <w:pPr>
+              <w:bidi/>
+              <w:rPr>
+                <w:rFonts w:ascii="Traditional Arabic" w:hAnsi="Traditional Arabic" w:cs="Traditional Arabic"/>
+                <w:b/>
+                <w:bCs/>
+                <w:sz w:val="32"/>
+                <w:szCs w:val="32"/>
+                <w:rtl/>
+              </w:rPr>
+            </w:pPr>
+          </w:p>
+        </w:tc>
+        <w:tc>
+          <w:tcPr>
+            <w:tcW w:w="8541" w:type="dxa"/>
+            <w:tcBorders>
+              <w:top w:val="nil"/>
+              <w:left w:val="nil"/>
+              <w:bottom w:val="nil"/>
+              <w:right w:val="nil"/>
+            </w:tcBorders>
+          </w:tcPr>
+          <w:p>
+            <w:pPr>
+              <w:bidi/>
+              <w:ind w:left="8"/>
+              <w:rPr>
+                <w:rFonts w:ascii="Traditional Arabic" w:hAnsi="Traditional Arabic" w:cs="Traditional Arabic"/>
+                <w:sz w:val="32"/>
+                <w:szCs w:val="32"/>
+                <w:rtl/>
+              </w:rPr>
+            </w:pPr>
+            <w:r>
+              <w:rPr>
+                <w:rFonts w:ascii="Traditional Arabic" w:hAnsi="Traditional Arabic" w:cs="Traditional Arabic" w:hint="cs"/>
+                <w:sz w:val="32"/>
+                <w:szCs w:val="32"/>
+                <w:rtl/>
+              </w:rPr>
+              <w:t>معلومات</w:t>
+            </w:r>
+          </w:p>
+        </w:tc>
+      </w:tr>
+      <w:tr>
+        <w:tc>
+          <w:tcPr>
+            <w:tcW w:w="9008" w:type="dxa"/>
+            <w:gridSpan w:val="3"/>
+            <w:tcBorders>
+              <w:top w:val="nil"/>
+              <w:left w:val="nil"/>
+              <w:bottom w:val="nil"/>
+              <w:right w:val="nil"/>
+            </w:tcBorders>
+          </w:tcPr>
+          <w:p>
+            <w:pPr>
+              <w:bidi/>
+              <w:rPr>
+                <w:rFonts w:ascii="Traditional Arabic" w:hAnsi="Traditional Arabic" w:cs="Traditional Arabic"/>
+                <w:sz w:val="10"/>
+                <w:szCs w:val="10"/>
+                <w:rtl/>
+              </w:rPr>
+            </w:pPr>
+          </w:p>
+        </w:tc>
+      </w:tr>
+    </w:tbl>
+    <w:p>
+      <w:pPr>
+        <w:bidi/>
+        <w:rPr>
+          <w:rFonts w:ascii="Traditional Arabic" w:hAnsi="Traditional Arabic" w:cs="Traditional Arabic"/>
+          <w:sz w:val="12"/>
+          <w:szCs w:val="12"/>
+        </w:rPr>
+      </w:pPr>
+    </w:p>
+    <w:tbl>
+      <w:tblPr>
+        <w:tblStyle w:val="TableGrid"/>
+        <w:bidiVisual/>
+        <w:tblW w:w="0" w:type="auto"/>
+        <w:tblInd w:w="481" w:type="dxa"/>
+        <w:tblCellMar>
+          <w:left w:w="0" w:type="dxa"/>
+          <w:right w:w="0" w:type="dxa"/>
+        </w:tblCellMar>
+        <w:tblLook w:val="04A0" w:firstRow="1" w:lastRow="0" w:firstColumn="1" w:lastColumn="0" w:noHBand="0" w:noVBand="1"/>
+      </w:tblPr>
+      <w:tblGrid>
+        <w:gridCol w:w="340"/>
+        <w:gridCol w:w="340"/>
+        <w:gridCol w:w="340"/>
+        <w:gridCol w:w="340"/>
+        <w:gridCol w:w="340"/>
+        <w:gridCol w:w="340"/>
+        <w:gridCol w:w="340"/>
+        <w:gridCol w:w="340"/>
+        <w:gridCol w:w="340"/>
+        <w:gridCol w:w="340"/>
+        <w:gridCol w:w="340"/>
+        <w:gridCol w:w="340"/>
+        <w:gridCol w:w="340"/>
+        <w:gridCol w:w="340"/>
+        <w:gridCol w:w="340"/>
+        <w:gridCol w:w="340"/>
+        <w:gridCol w:w="340"/>
+        <w:gridCol w:w="340"/>
+        <w:gridCol w:w="340"/>
+        <w:gridCol w:w="340"/>
+        <w:gridCol w:w="340"/>
+        <w:gridCol w:w="340"/>
+      </w:tblGrid>
+      <w:tr>
+        <w:trPr>
+          <w:trHeight w:val="340"/>
+        </w:trPr>
+        <w:tc>
+          <w:tcPr>
+            <w:tcW w:w="340" w:type="dxa"/>
+          </w:tcPr>
+          <w:p>
+            <w:pPr>
+              <w:bidi/>
+              <w:rPr>
+                <w:rFonts w:ascii="Traditional Arabic" w:hAnsi="Traditional Arabic" w:cs="Traditional Arabic"/>
+                <w:sz w:val="24"/>
+                <w:szCs w:val="24"/>
+                <w:vertAlign w:val="superscript"/>
+              </w:rPr>
+            </w:pPr>
+          </w:p>
+        </w:tc>
+        <w:tc>
+          <w:tcPr>
+            <w:tcW w:w="340" w:type="dxa"/>
+          </w:tcPr>
+          <w:p>
+            <w:pPr>
+              <w:bidi/>
+              <w:rPr>
+                <w:rFonts w:ascii="Traditional Arabic" w:hAnsi="Traditional Arabic" w:cs="Traditional Arabic"/>
+                <w:sz w:val="24"/>
+                <w:szCs w:val="24"/>
+                <w:vertAlign w:val="superscript"/>
+                <w:rtl/>
+              </w:rPr>
+            </w:pPr>
+          </w:p>
+        </w:tc>
+        <w:tc>
+          <w:tcPr>
+            <w:tcW w:w="340" w:type="dxa"/>
+          </w:tcPr>
+          <w:p>
+            <w:pPr>
+              <w:bidi/>
+              <w:rPr>
+                <w:rFonts w:ascii="Traditional Arabic" w:hAnsi="Traditional Arabic" w:cs="Traditional Arabic"/>
+                <w:sz w:val="24"/>
+                <w:szCs w:val="24"/>
+                <w:vertAlign w:val="superscript"/>
+                <w:rtl/>
+              </w:rPr>
+            </w:pPr>
+          </w:p>
+        </w:tc>
+        <w:tc>
+          <w:tcPr>
+            <w:tcW w:w="340" w:type="dxa"/>
+          </w:tcPr>
+          <w:p>
+            <w:pPr>
+              <w:bidi/>
+              <w:rPr>
+                <w:rFonts w:ascii="Traditional Arabic" w:hAnsi="Traditional Arabic" w:cs="Traditional Arabic"/>
+                <w:sz w:val="24"/>
+                <w:szCs w:val="24"/>
+                <w:vertAlign w:val="superscript"/>
+                <w:rtl/>
+              </w:rPr>
+            </w:pPr>
+          </w:p>
+        </w:tc>
+        <w:tc>
+          <w:tcPr>
+            <w:tcW w:w="340" w:type="dxa"/>
+          </w:tcPr>
+          <w:p>
+            <w:pPr>
+              <w:bidi/>
+              <w:rPr>
+                <w:rFonts w:ascii="Traditional Arabic" w:hAnsi="Traditional Arabic" w:cs="Traditional Arabic"/>
+                <w:sz w:val="24"/>
+                <w:szCs w:val="24"/>
+                <w:vertAlign w:val="superscript"/>
+                <w:rtl/>
+              </w:rPr>
+            </w:pPr>
+          </w:p>
+        </w:tc>
+        <w:tc>
+          <w:tcPr>
+            <w:tcW w:w="340" w:type="dxa"/>
+          </w:tcPr>
+          <w:p>
+            <w:pPr>
+              <w:bidi/>
+              <w:rPr>
+                <w:rFonts w:ascii="Traditional Arabic" w:hAnsi="Traditional Arabic" w:cs="Traditional Arabic"/>
+                <w:sz w:val="24"/>
+                <w:szCs w:val="24"/>
+                <w:vertAlign w:val="superscript"/>
+                <w:rtl/>
+              </w:rPr>
+            </w:pPr>
+          </w:p>
+        </w:tc>
+        <w:tc>
+          <w:tcPr>
+            <w:tcW w:w="340" w:type="dxa"/>
+          </w:tcPr>
+          <w:p>
+            <w:pPr>
+              <w:bidi/>
+              <w:rPr>
+                <w:rFonts w:ascii="Traditional Arabic" w:hAnsi="Traditional Arabic" w:cs="Traditional Arabic"/>
+                <w:sz w:val="24"/>
+                <w:szCs w:val="24"/>
+                <w:vertAlign w:val="superscript"/>
+                <w:rtl/>
+              </w:rPr>
+            </w:pPr>
+          </w:p>
+        </w:tc>
+        <w:tc>
+          <w:tcPr>
+            <w:tcW w:w="340" w:type="dxa"/>
+          </w:tcPr>
+          <w:p>
+            <w:pPr>
+              <w:bidi/>
+              <w:rPr>
+                <w:rFonts w:ascii="Traditional Arabic" w:hAnsi="Traditional Arabic" w:cs="Traditional Arabic"/>
+                <w:sz w:val="24"/>
+                <w:szCs w:val="24"/>
+                <w:vertAlign w:val="superscript"/>
+                <w:rtl/>
+              </w:rPr>
+            </w:pPr>
+          </w:p>
+        </w:tc>
+        <w:tc>
+          <w:tcPr>
+            <w:tcW w:w="340" w:type="dxa"/>
+          </w:tcPr>
+          <w:p>
+            <w:pPr>
+              <w:bidi/>
+              <w:rPr>
+                <w:rFonts w:ascii="Traditional Arabic" w:hAnsi="Traditional Arabic" w:cs="Traditional Arabic"/>
+                <w:sz w:val="24"/>
+                <w:szCs w:val="24"/>
+                <w:vertAlign w:val="superscript"/>
+                <w:rtl/>
+              </w:rPr>
+            </w:pPr>
+          </w:p>
+        </w:tc>
+        <w:tc>
+          <w:tcPr>
+            <w:tcW w:w="340" w:type="dxa"/>
+          </w:tcPr>
+          <w:p>
+            <w:pPr>
+              <w:bidi/>
+              <w:rPr>
+                <w:rFonts w:ascii="Traditional Arabic" w:hAnsi="Traditional Arabic" w:cs="Traditional Arabic"/>
+                <w:sz w:val="24"/>
+                <w:szCs w:val="24"/>
+                <w:vertAlign w:val="superscript"/>
+                <w:rtl/>
+              </w:rPr>
+            </w:pPr>
+          </w:p>
+        </w:tc>
+        <w:tc>
+          <w:tcPr>
+            <w:tcW w:w="340" w:type="dxa"/>
+          </w:tcPr>
+          <w:p>
+            <w:pPr>
+              <w:bidi/>
+              <w:rPr>
+                <w:rFonts w:ascii="Traditional Arabic" w:hAnsi="Traditional Arabic" w:cs="Traditional Arabic"/>
+                <w:sz w:val="24"/>
+                <w:szCs w:val="24"/>
+                <w:vertAlign w:val="superscript"/>
+                <w:rtl/>
+              </w:rPr>
+            </w:pPr>
+          </w:p>
+        </w:tc>
+        <w:tc>
+          <w:tcPr>
+            <w:tcW w:w="340" w:type="dxa"/>
+          </w:tcPr>
+          <w:p>
+            <w:pPr>
+              <w:bidi/>
+              <w:rPr>
+                <w:rFonts w:ascii="Traditional Arabic" w:hAnsi="Traditional Arabic" w:cs="Traditional Arabic"/>
+                <w:sz w:val="24"/>
+                <w:szCs w:val="24"/>
+                <w:vertAlign w:val="superscript"/>
+                <w:rtl/>
+              </w:rPr>
+            </w:pPr>
+          </w:p>
+        </w:tc>
+        <w:tc>
+          <w:tcPr>
+            <w:tcW w:w="340" w:type="dxa"/>
+          </w:tcPr>
+          <w:p>
+            <w:pPr>
+              <w:bidi/>
+              <w:rPr>
+                <w:rFonts w:ascii="Traditional Arabic" w:hAnsi="Traditional Arabic" w:cs="Traditional Arabic"/>
+                <w:sz w:val="24"/>
+                <w:szCs w:val="24"/>
+                <w:vertAlign w:val="superscript"/>
+                <w:rtl/>
+              </w:rPr>
+            </w:pPr>
+          </w:p>
+        </w:tc>
+        <w:tc>
+          <w:tcPr>
+            <w:tcW w:w="340" w:type="dxa"/>
+          </w:tcPr>
+          <w:p>
+            <w:pPr>
+              <w:bidi/>
+              <w:rPr>
+                <w:rFonts w:ascii="Traditional Arabic" w:hAnsi="Traditional Arabic" w:cs="Traditional Arabic"/>
+                <w:sz w:val="24"/>
+                <w:szCs w:val="24"/>
+                <w:vertAlign w:val="superscript"/>
+                <w:rtl/>
+              </w:rPr>
+            </w:pPr>
+          </w:p>
+        </w:tc>
+        <w:tc>
+          <w:tcPr>
+            <w:tcW w:w="340" w:type="dxa"/>
+          </w:tcPr>
+          <w:p>
+            <w:pPr>
+              <w:bidi/>
+              <w:rPr>
+                <w:rFonts w:ascii="Traditional Arabic" w:hAnsi="Traditional Arabic" w:cs="Traditional Arabic"/>
+                <w:sz w:val="24"/>
+                <w:szCs w:val="24"/>
+                <w:vertAlign w:val="superscript"/>
+                <w:rtl/>
+              </w:rPr>
+            </w:pPr>
+          </w:p>
+        </w:tc>
+        <w:tc>
+          <w:tcPr>
+            <w:tcW w:w="340" w:type="dxa"/>
+          </w:tcPr>
+          <w:p>
+            <w:pPr>
+              <w:bidi/>
+              <w:rPr>
+                <w:rFonts w:ascii="Traditional Arabic" w:hAnsi="Traditional Arabic" w:cs="Traditional Arabic"/>
+                <w:sz w:val="24"/>
+                <w:szCs w:val="24"/>
+                <w:vertAlign w:val="superscript"/>
+                <w:rtl/>
+              </w:rPr>
+            </w:pPr>
+          </w:p>
+        </w:tc>
+        <w:tc>
+          <w:tcPr>
+            <w:tcW w:w="340" w:type="dxa"/>
+          </w:tcPr>
+          <w:p>
+            <w:pPr>
+              <w:bidi/>
+              <w:rPr>
+                <w:rFonts w:ascii="Traditional Arabic" w:hAnsi="Traditional Arabic" w:cs="Traditional Arabic"/>
+                <w:sz w:val="24"/>
+                <w:szCs w:val="24"/>
+                <w:vertAlign w:val="superscript"/>
+                <w:rtl/>
+              </w:rPr>
+            </w:pPr>
+          </w:p>
+        </w:tc>
+        <w:tc>
+          <w:tcPr>
+            <w:tcW w:w="340" w:type="dxa"/>
+          </w:tcPr>
+          <w:p>
+            <w:pPr>
+              <w:bidi/>
+              <w:rPr>
+                <w:rFonts w:ascii="Traditional Arabic" w:hAnsi="Traditional Arabic" w:cs="Traditional Arabic"/>
+                <w:sz w:val="24"/>
+                <w:szCs w:val="24"/>
+                <w:vertAlign w:val="superscript"/>
+                <w:rtl/>
+              </w:rPr>
+            </w:pPr>
+          </w:p>
+        </w:tc>
+        <w:tc>
+          <w:tcPr>
+            <w:tcW w:w="340" w:type="dxa"/>
+          </w:tcPr>
+          <w:p>
+            <w:pPr>
+              <w:bidi/>
+              <w:rPr>
+                <w:rFonts w:ascii="Traditional Arabic" w:hAnsi="Traditional Arabic" w:cs="Traditional Arabic"/>
+                <w:sz w:val="24"/>
+                <w:szCs w:val="24"/>
+                <w:vertAlign w:val="superscript"/>
+                <w:rtl/>
+              </w:rPr>
+            </w:pPr>
+          </w:p>
+        </w:tc>
+        <w:tc>
+          <w:tcPr>
+            <w:tcW w:w="340" w:type="dxa"/>
+          </w:tcPr>
+          <w:p>
+            <w:pPr>
+              <w:bidi/>
+              <w:rPr>
+                <w:rFonts w:ascii="Traditional Arabic" w:hAnsi="Traditional Arabic" w:cs="Traditional Arabic"/>
+                <w:sz w:val="24"/>
+                <w:szCs w:val="24"/>
+                <w:vertAlign w:val="superscript"/>
+                <w:rtl/>
+              </w:rPr>
+            </w:pPr>
+          </w:p>
+        </w:tc>
+        <w:tc>
+          <w:tcPr>
+            <w:tcW w:w="340" w:type="dxa"/>
+          </w:tcPr>
+          <w:p>
+            <w:pPr>
+              <w:bidi/>
+              <w:rPr>
+                <w:rFonts w:ascii="Traditional Arabic" w:hAnsi="Traditional Arabic" w:cs="Traditional Arabic"/>
+                <w:sz w:val="24"/>
+                <w:szCs w:val="24"/>
+                <w:vertAlign w:val="superscript"/>
+                <w:rtl/>
+              </w:rPr>
+            </w:pPr>
+          </w:p>
+        </w:tc>
+        <w:tc>
+          <w:tcPr>
+            <w:tcW w:w="340" w:type="dxa"/>
+          </w:tcPr>
+          <w:p>
+            <w:pPr>
+              <w:bidi/>
+              <w:rPr>
+                <w:rFonts w:ascii="Traditional Arabic" w:hAnsi="Traditional Arabic" w:cs="Traditional Arabic"/>
+                <w:sz w:val="24"/>
+                <w:szCs w:val="24"/>
+                <w:vertAlign w:val="superscript"/>
+                <w:rtl/>
+              </w:rPr>
+            </w:pPr>
           </w:p>
         </w:tc>
       </w:tr>
@@ -4413,7 +6400,7 @@
   <w:style w:type="paragraph" w:default="1" w:styleId="Normal">
     <w:name w:val="Normal"/>
     <w:qFormat/>
-    <w:rsid w:val="00CE4D1A"/>
+    <w:rsid w:val="00557329"/>
   </w:style>
   <w:style w:type="character" w:default="1" w:styleId="DefaultParagraphFont">
     <w:name w:val="Default Paragraph Font"/>

</xml_diff>